<commit_message>
docs: expand schedule creation manual flow
</commit_message>
<xml_diff>
--- a/work/docs/manual-usuario-escala-inteligente.docx
+++ b/work/docs/manual-usuario-escala-inteligente.docx
@@ -1290,7 +1290,7 @@
           <w:b/>
           <w:color w:val="2563EB"/>
         </w:rPr>
-        <w:t>5. Montar timeline e gerar escala detalhada</w:t>
+        <w:t>5. Fluxo completo do Iniciar Criacao</w:t>
       </w:r>
     </w:p>
     <w:p>
@@ -1298,7 +1298,336 @@
         <w:spacing w:after="120"/>
       </w:pPr>
       <w:r>
-        <w:t>Na pagina de criacao, selecione os turnos por secao que entram na escala. A timeline permite revisar a cobertura antes de distribuir folgas e gerar a escala detalhada.</w:t>
+        <w:t>Depois de clicar em Iniciar Criacao, o sistema abre a pagina de rascunho da escala. E aqui que voce escolhe as secoes, gera a timeline, distribui os funcionarios/folgas e confirma a escala detalhada antes de salvar no banco.</w:t>
+      </w:r>
+    </w:p>
+    <w:p>
+      <w:pPr>
+        <w:jc w:val="center"/>
+      </w:pPr>
+      <w:r>
+        <w:drawing>
+          <wp:inline xmlns:a="http://schemas.openxmlformats.org/drawingml/2006/main" xmlns:pic="http://schemas.openxmlformats.org/drawingml/2006/picture">
+            <wp:extent cx="8138160" cy="4882896"/>
+            <wp:docPr id="5" name="Picture 5"/>
+            <wp:cNvGraphicFramePr>
+              <a:graphicFrameLocks noChangeAspect="1"/>
+            </wp:cNvGraphicFramePr>
+            <a:graphic>
+              <a:graphicData uri="http://schemas.openxmlformats.org/drawingml/2006/picture">
+                <pic:pic>
+                  <pic:nvPicPr>
+                    <pic:cNvPr id="0" name="16-criacao-selecionar-secoes.png"/>
+                    <pic:cNvPicPr/>
+                  </pic:nvPicPr>
+                  <pic:blipFill>
+                    <a:blip r:embed="rId15"/>
+                    <a:stretch>
+                      <a:fillRect/>
+                    </a:stretch>
+                  </pic:blipFill>
+                  <pic:spPr>
+                    <a:xfrm>
+                      <a:off x="0" y="0"/>
+                      <a:ext cx="8138160" cy="4882896"/>
+                    </a:xfrm>
+                    <a:prstGeom prst="rect"/>
+                  </pic:spPr>
+                </pic:pic>
+              </a:graphicData>
+            </a:graphic>
+          </wp:inline>
+        </w:drawing>
+      </w:r>
+    </w:p>
+    <w:p>
+      <w:pPr>
+        <w:spacing w:after="200"/>
+        <w:jc w:val="center"/>
+      </w:pPr>
+      <w:r>
+        <w:rPr>
+          <w:i/>
+          <w:color w:val="64748B"/>
+          <w:sz w:val="18"/>
+        </w:rPr>
+        <w:t>Etapa 1 - Selecionar as secoes/turnos que farao parte da escala.</w:t>
+      </w:r>
+    </w:p>
+    <w:p>
+      <w:pPr>
+        <w:pStyle w:val="ListNumber"/>
+        <w:spacing w:after="60"/>
+        <w:ind w:left="432"/>
+      </w:pPr>
+      <w:r>
+        <w:t>Confira loja e periodo no status do rascunho.</w:t>
+      </w:r>
+    </w:p>
+    <w:p>
+      <w:pPr>
+        <w:pStyle w:val="ListNumber"/>
+        <w:spacing w:after="60"/>
+        <w:ind w:left="432"/>
+      </w:pPr>
+      <w:r>
+        <w:t>Marque as secoes/turnos que devem compor a escala.</w:t>
+      </w:r>
+    </w:p>
+    <w:p>
+      <w:pPr>
+        <w:pStyle w:val="ListNumber"/>
+        <w:spacing w:after="60"/>
+        <w:ind w:left="432"/>
+      </w:pPr>
+      <w:r>
+        <w:t>Deixe desmarcado qualquer turno que nao deve entrar naquele mes.</w:t>
+      </w:r>
+    </w:p>
+    <w:p>
+      <w:pPr>
+        <w:pStyle w:val="ListNumber"/>
+        <w:spacing w:after="60"/>
+        <w:ind w:left="432"/>
+      </w:pPr>
+      <w:r>
+        <w:t>Clique em Atualizar Timeline para montar a linha do tempo.</w:t>
+      </w:r>
+    </w:p>
+    <w:p>
+      <w:pPr>
+        <w:jc w:val="center"/>
+      </w:pPr>
+      <w:r>
+        <w:drawing>
+          <wp:inline xmlns:a="http://schemas.openxmlformats.org/drawingml/2006/main" xmlns:pic="http://schemas.openxmlformats.org/drawingml/2006/picture">
+            <wp:extent cx="8138160" cy="6144311"/>
+            <wp:docPr id="6" name="Picture 6"/>
+            <wp:cNvGraphicFramePr>
+              <a:graphicFrameLocks noChangeAspect="1"/>
+            </wp:cNvGraphicFramePr>
+            <a:graphic>
+              <a:graphicData uri="http://schemas.openxmlformats.org/drawingml/2006/picture">
+                <pic:pic>
+                  <pic:nvPicPr>
+                    <pic:cNvPr id="0" name="17-criacao-timeline-gerada.png"/>
+                    <pic:cNvPicPr/>
+                  </pic:nvPicPr>
+                  <pic:blipFill>
+                    <a:blip r:embed="rId16"/>
+                    <a:stretch>
+                      <a:fillRect/>
+                    </a:stretch>
+                  </pic:blipFill>
+                  <pic:spPr>
+                    <a:xfrm>
+                      <a:off x="0" y="0"/>
+                      <a:ext cx="8138160" cy="6144311"/>
+                    </a:xfrm>
+                    <a:prstGeom prst="rect"/>
+                  </pic:spPr>
+                </pic:pic>
+              </a:graphicData>
+            </a:graphic>
+          </wp:inline>
+        </w:drawing>
+      </w:r>
+    </w:p>
+    <w:p>
+      <w:pPr>
+        <w:spacing w:after="200"/>
+        <w:jc w:val="center"/>
+      </w:pPr>
+      <w:r>
+        <w:rPr>
+          <w:i/>
+          <w:color w:val="64748B"/>
+          <w:sz w:val="18"/>
+        </w:rPr>
+        <w:t>Etapa 2 - Timeline gerada com as secoes selecionadas.</w:t>
+      </w:r>
+    </w:p>
+    <w:p>
+      <w:pPr>
+        <w:spacing w:after="120"/>
+      </w:pPr>
+      <w:r>
+        <w:t>A timeline mostra os blocos de trabalho, intervalo e cobertura por secao. Antes de distribuir funcionarios, revise se os horarios e quantidades estao corretos.</w:t>
+      </w:r>
+    </w:p>
+    <w:p>
+      <w:pPr>
+        <w:jc w:val="center"/>
+      </w:pPr>
+      <w:r>
+        <w:drawing>
+          <wp:inline xmlns:a="http://schemas.openxmlformats.org/drawingml/2006/main" xmlns:pic="http://schemas.openxmlformats.org/drawingml/2006/picture">
+            <wp:extent cx="8138160" cy="10152355"/>
+            <wp:docPr id="7" name="Picture 7"/>
+            <wp:cNvGraphicFramePr>
+              <a:graphicFrameLocks noChangeAspect="1"/>
+            </wp:cNvGraphicFramePr>
+            <a:graphic>
+              <a:graphicData uri="http://schemas.openxmlformats.org/drawingml/2006/picture">
+                <pic:pic>
+                  <pic:nvPicPr>
+                    <pic:cNvPr id="0" name="18-criacao-distribuir-funcionarios.png"/>
+                    <pic:cNvPicPr/>
+                  </pic:nvPicPr>
+                  <pic:blipFill>
+                    <a:blip r:embed="rId17"/>
+                    <a:stretch>
+                      <a:fillRect/>
+                    </a:stretch>
+                  </pic:blipFill>
+                  <pic:spPr>
+                    <a:xfrm>
+                      <a:off x="0" y="0"/>
+                      <a:ext cx="8138160" cy="10152355"/>
+                    </a:xfrm>
+                    <a:prstGeom prst="rect"/>
+                  </pic:spPr>
+                </pic:pic>
+              </a:graphicData>
+            </a:graphic>
+          </wp:inline>
+        </w:drawing>
+      </w:r>
+    </w:p>
+    <w:p>
+      <w:pPr>
+        <w:spacing w:after="200"/>
+        <w:jc w:val="center"/>
+      </w:pPr>
+      <w:r>
+        <w:rPr>
+          <w:i/>
+          <w:color w:val="64748B"/>
+          <w:sz w:val="18"/>
+        </w:rPr>
+        <w:t>Etapa 3 - Tela de distribuicao dos funcionarios antes da regra 5x2.</w:t>
+      </w:r>
+    </w:p>
+    <w:p>
+      <w:pPr>
+        <w:spacing w:after="120"/>
+      </w:pPr>
+      <w:r>
+        <w:t>Ao clicar em Distribuir Funcionarios, o sistema abre a grade operacional da escala. Nessa tela voce confere colaboradores, dias do mes e a barra de botoes da escala.</w:t>
+      </w:r>
+    </w:p>
+    <w:p>
+      <w:pPr>
+        <w:jc w:val="center"/>
+      </w:pPr>
+      <w:r>
+        <w:drawing>
+          <wp:inline xmlns:a="http://schemas.openxmlformats.org/drawingml/2006/main" xmlns:pic="http://schemas.openxmlformats.org/drawingml/2006/picture">
+            <wp:extent cx="8138160" cy="10152355"/>
+            <wp:docPr id="8" name="Picture 8"/>
+            <wp:cNvGraphicFramePr>
+              <a:graphicFrameLocks noChangeAspect="1"/>
+            </wp:cNvGraphicFramePr>
+            <a:graphic>
+              <a:graphicData uri="http://schemas.openxmlformats.org/drawingml/2006/picture">
+                <pic:pic>
+                  <pic:nvPicPr>
+                    <pic:cNvPr id="0" name="19-criacao-folgas-distribuidas.png"/>
+                    <pic:cNvPicPr/>
+                  </pic:nvPicPr>
+                  <pic:blipFill>
+                    <a:blip r:embed="rId18"/>
+                    <a:stretch>
+                      <a:fillRect/>
+                    </a:stretch>
+                  </pic:blipFill>
+                  <pic:spPr>
+                    <a:xfrm>
+                      <a:off x="0" y="0"/>
+                      <a:ext cx="8138160" cy="10152355"/>
+                    </a:xfrm>
+                    <a:prstGeom prst="rect"/>
+                  </pic:spPr>
+                </pic:pic>
+              </a:graphicData>
+            </a:graphic>
+          </wp:inline>
+        </w:drawing>
+      </w:r>
+    </w:p>
+    <w:p>
+      <w:pPr>
+        <w:spacing w:after="200"/>
+        <w:jc w:val="center"/>
+      </w:pPr>
+      <w:r>
+        <w:rPr>
+          <w:i/>
+          <w:color w:val="64748B"/>
+          <w:sz w:val="18"/>
+        </w:rPr>
+        <w:t>Etapa 4 - Folgas distribuidas pela regra 5x2 e timeline bloqueada para edicao.</w:t>
+      </w:r>
+    </w:p>
+    <w:p>
+      <w:pPr>
+        <w:spacing w:after="120"/>
+      </w:pPr>
+      <w:r>
+        <w:t>Depois de clicar em Distribuir Folgas 5x2, a timeline fica bloqueada para impedir mudancas sem nova validacao. O botao Gerar Escala Detalhada passa a aparecer. Para mudar colaboradores ou folgas, clique em Editar e distribua novamente antes de gerar a detalhada.</w:t>
+      </w:r>
+    </w:p>
+    <w:p>
+      <w:pPr>
+        <w:jc w:val="center"/>
+      </w:pPr>
+      <w:r>
+        <w:drawing>
+          <wp:inline xmlns:a="http://schemas.openxmlformats.org/drawingml/2006/main" xmlns:pic="http://schemas.openxmlformats.org/drawingml/2006/picture">
+            <wp:extent cx="8138160" cy="10152355"/>
+            <wp:docPr id="9" name="Picture 9"/>
+            <wp:cNvGraphicFramePr>
+              <a:graphicFrameLocks noChangeAspect="1"/>
+            </wp:cNvGraphicFramePr>
+            <a:graphic>
+              <a:graphicData uri="http://schemas.openxmlformats.org/drawingml/2006/picture">
+                <pic:pic>
+                  <pic:nvPicPr>
+                    <pic:cNvPr id="0" name="20-criacao-escala-detalhada.png"/>
+                    <pic:cNvPicPr/>
+                  </pic:nvPicPr>
+                  <pic:blipFill>
+                    <a:blip r:embed="rId19"/>
+                    <a:stretch>
+                      <a:fillRect/>
+                    </a:stretch>
+                  </pic:blipFill>
+                  <pic:spPr>
+                    <a:xfrm>
+                      <a:off x="0" y="0"/>
+                      <a:ext cx="8138160" cy="10152355"/>
+                    </a:xfrm>
+                    <a:prstGeom prst="rect"/>
+                  </pic:spPr>
+                </pic:pic>
+              </a:graphicData>
+            </a:graphic>
+          </wp:inline>
+        </w:drawing>
+      </w:r>
+    </w:p>
+    <w:p>
+      <w:pPr>
+        <w:spacing w:after="200"/>
+        <w:jc w:val="center"/>
+      </w:pPr>
+      <w:r>
+        <w:rPr>
+          <w:i/>
+          <w:color w:val="64748B"/>
+          <w:sz w:val="18"/>
+        </w:rPr>
+        <w:t>Etapa 5 - Escala detalhada pronta para validar, salvar ou imprimir.</w:t>
       </w:r>
     </w:p>
     <w:tbl>
@@ -1441,7 +1770,7 @@
                 <w:rFonts w:ascii="Calibri" w:hAnsi="Calibri"/>
                 <w:sz w:val="18"/>
               </w:rPr>
-              <w:t>Card Secoes da escala</w:t>
+              <w:t>Pagina Nova Escala</w:t>
             </w:r>
           </w:p>
         </w:tc>
@@ -1465,7 +1794,7 @@
                 <w:rFonts w:ascii="Calibri" w:hAnsi="Calibri"/>
                 <w:sz w:val="18"/>
               </w:rPr>
-              <w:t>Regera a timeline com as secoes/turnos selecionados.</w:t>
+              <w:t>Monta ou remonta a timeline com as secoes/turnos marcados.</w:t>
             </w:r>
           </w:p>
         </w:tc>
@@ -1515,7 +1844,7 @@
                 <w:rFonts w:ascii="Calibri" w:hAnsi="Calibri"/>
                 <w:sz w:val="18"/>
               </w:rPr>
-              <w:t>Timeline</w:t>
+              <w:t>Linha da timeline</w:t>
             </w:r>
           </w:p>
         </w:tc>
@@ -1539,7 +1868,229 @@
                 <w:rFonts w:ascii="Calibri" w:hAnsi="Calibri"/>
                 <w:sz w:val="18"/>
               </w:rPr>
-              <w:t>Remove uma secao do rascunho antes de salvar.</w:t>
+              <w:t>Remove uma secao/turno do rascunho antes da distribuicao.</w:t>
+            </w:r>
+          </w:p>
+        </w:tc>
+      </w:tr>
+      <w:tr>
+        <w:tc>
+          <w:tcPr>
+            <w:tcW w:type="dxa" w:w="4704"/>
+            <w:vAlign w:val="center"/>
+            <w:tcBorders>
+              <w:top w:val="single" w:sz="4" w:space="0" w:color="CBD5E1"/>
+              <w:left w:val="single" w:sz="4" w:space="0" w:color="CBD5E1"/>
+              <w:bottom w:val="single" w:sz="4" w:space="0" w:color="CBD5E1"/>
+              <w:right w:val="single" w:sz="4" w:space="0" w:color="CBD5E1"/>
+            </w:tcBorders>
+          </w:tcPr>
+          <w:p>
+            <w:pPr>
+              <w:spacing w:after="40"/>
+            </w:pPr>
+            <w:r>
+              <w:rPr>
+                <w:rFonts w:ascii="Calibri" w:hAnsi="Calibri"/>
+                <w:sz w:val="18"/>
+              </w:rPr>
+              <w:t>Imprimir Timeline</w:t>
+            </w:r>
+          </w:p>
+        </w:tc>
+        <w:tc>
+          <w:tcPr>
+            <w:tcW w:type="dxa" w:w="4704"/>
+            <w:vAlign w:val="center"/>
+            <w:tcBorders>
+              <w:top w:val="single" w:sz="4" w:space="0" w:color="CBD5E1"/>
+              <w:left w:val="single" w:sz="4" w:space="0" w:color="CBD5E1"/>
+              <w:bottom w:val="single" w:sz="4" w:space="0" w:color="CBD5E1"/>
+              <w:right w:val="single" w:sz="4" w:space="0" w:color="CBD5E1"/>
+            </w:tcBorders>
+          </w:tcPr>
+          <w:p>
+            <w:pPr>
+              <w:spacing w:after="40"/>
+            </w:pPr>
+            <w:r>
+              <w:rPr>
+                <w:rFonts w:ascii="Calibri" w:hAnsi="Calibri"/>
+                <w:sz w:val="18"/>
+              </w:rPr>
+              <w:t>Cabecalho da timeline</w:t>
+            </w:r>
+          </w:p>
+        </w:tc>
+        <w:tc>
+          <w:tcPr>
+            <w:tcW w:type="dxa" w:w="4704"/>
+            <w:vAlign w:val="center"/>
+            <w:tcBorders>
+              <w:top w:val="single" w:sz="4" w:space="0" w:color="CBD5E1"/>
+              <w:left w:val="single" w:sz="4" w:space="0" w:color="CBD5E1"/>
+              <w:bottom w:val="single" w:sz="4" w:space="0" w:color="CBD5E1"/>
+              <w:right w:val="single" w:sz="4" w:space="0" w:color="CBD5E1"/>
+            </w:tcBorders>
+          </w:tcPr>
+          <w:p>
+            <w:pPr>
+              <w:spacing w:after="40"/>
+            </w:pPr>
+            <w:r>
+              <w:rPr>
+                <w:rFonts w:ascii="Calibri" w:hAnsi="Calibri"/>
+                <w:sz w:val="18"/>
+              </w:rPr>
+              <w:t>Imprime a visualizacao da timeline de turnos.</w:t>
+            </w:r>
+          </w:p>
+        </w:tc>
+      </w:tr>
+      <w:tr>
+        <w:tc>
+          <w:tcPr>
+            <w:tcW w:type="dxa" w:w="4704"/>
+            <w:vAlign w:val="center"/>
+            <w:tcBorders>
+              <w:top w:val="single" w:sz="4" w:space="0" w:color="CBD5E1"/>
+              <w:left w:val="single" w:sz="4" w:space="0" w:color="CBD5E1"/>
+              <w:bottom w:val="single" w:sz="4" w:space="0" w:color="CBD5E1"/>
+              <w:right w:val="single" w:sz="4" w:space="0" w:color="CBD5E1"/>
+            </w:tcBorders>
+          </w:tcPr>
+          <w:p>
+            <w:pPr>
+              <w:spacing w:after="40"/>
+            </w:pPr>
+            <w:r>
+              <w:rPr>
+                <w:rFonts w:ascii="Calibri" w:hAnsi="Calibri"/>
+                <w:sz w:val="18"/>
+              </w:rPr>
+              <w:t>Distribuir Funcionarios</w:t>
+            </w:r>
+          </w:p>
+        </w:tc>
+        <w:tc>
+          <w:tcPr>
+            <w:tcW w:type="dxa" w:w="4704"/>
+            <w:vAlign w:val="center"/>
+            <w:tcBorders>
+              <w:top w:val="single" w:sz="4" w:space="0" w:color="CBD5E1"/>
+              <w:left w:val="single" w:sz="4" w:space="0" w:color="CBD5E1"/>
+              <w:bottom w:val="single" w:sz="4" w:space="0" w:color="CBD5E1"/>
+              <w:right w:val="single" w:sz="4" w:space="0" w:color="CBD5E1"/>
+            </w:tcBorders>
+          </w:tcPr>
+          <w:p>
+            <w:pPr>
+              <w:spacing w:after="40"/>
+            </w:pPr>
+            <w:r>
+              <w:rPr>
+                <w:rFonts w:ascii="Calibri" w:hAnsi="Calibri"/>
+                <w:sz w:val="18"/>
+              </w:rPr>
+              <w:t>Cabecalho da timeline</w:t>
+            </w:r>
+          </w:p>
+        </w:tc>
+        <w:tc>
+          <w:tcPr>
+            <w:tcW w:type="dxa" w:w="4704"/>
+            <w:vAlign w:val="center"/>
+            <w:tcBorders>
+              <w:top w:val="single" w:sz="4" w:space="0" w:color="CBD5E1"/>
+              <w:left w:val="single" w:sz="4" w:space="0" w:color="CBD5E1"/>
+              <w:bottom w:val="single" w:sz="4" w:space="0" w:color="CBD5E1"/>
+              <w:right w:val="single" w:sz="4" w:space="0" w:color="CBD5E1"/>
+            </w:tcBorders>
+          </w:tcPr>
+          <w:p>
+            <w:pPr>
+              <w:spacing w:after="40"/>
+            </w:pPr>
+            <w:r>
+              <w:rPr>
+                <w:rFonts w:ascii="Calibri" w:hAnsi="Calibri"/>
+                <w:sz w:val="18"/>
+              </w:rPr>
+              <w:t>Abre a grade/esqueleto para distribuir funcionarios, folgas e gerar a escala.</w:t>
+            </w:r>
+          </w:p>
+        </w:tc>
+      </w:tr>
+      <w:tr>
+        <w:tc>
+          <w:tcPr>
+            <w:tcW w:type="dxa" w:w="4704"/>
+            <w:vAlign w:val="center"/>
+            <w:tcBorders>
+              <w:top w:val="single" w:sz="4" w:space="0" w:color="CBD5E1"/>
+              <w:left w:val="single" w:sz="4" w:space="0" w:color="CBD5E1"/>
+              <w:bottom w:val="single" w:sz="4" w:space="0" w:color="CBD5E1"/>
+              <w:right w:val="single" w:sz="4" w:space="0" w:color="CBD5E1"/>
+            </w:tcBorders>
+          </w:tcPr>
+          <w:p>
+            <w:pPr>
+              <w:spacing w:after="40"/>
+            </w:pPr>
+            <w:r>
+              <w:rPr>
+                <w:rFonts w:ascii="Calibri" w:hAnsi="Calibri"/>
+                <w:sz w:val="18"/>
+              </w:rPr>
+              <w:t>Carregar Funcionarios</w:t>
+            </w:r>
+          </w:p>
+        </w:tc>
+        <w:tc>
+          <w:tcPr>
+            <w:tcW w:type="dxa" w:w="4704"/>
+            <w:vAlign w:val="center"/>
+            <w:tcBorders>
+              <w:top w:val="single" w:sz="4" w:space="0" w:color="CBD5E1"/>
+              <w:left w:val="single" w:sz="4" w:space="0" w:color="CBD5E1"/>
+              <w:bottom w:val="single" w:sz="4" w:space="0" w:color="CBD5E1"/>
+              <w:right w:val="single" w:sz="4" w:space="0" w:color="CBD5E1"/>
+            </w:tcBorders>
+          </w:tcPr>
+          <w:p>
+            <w:pPr>
+              <w:spacing w:after="40"/>
+            </w:pPr>
+            <w:r>
+              <w:rPr>
+                <w:rFonts w:ascii="Calibri" w:hAnsi="Calibri"/>
+                <w:sz w:val="18"/>
+              </w:rPr>
+              <w:t>Modal Escala</w:t>
+            </w:r>
+          </w:p>
+        </w:tc>
+        <w:tc>
+          <w:tcPr>
+            <w:tcW w:type="dxa" w:w="4704"/>
+            <w:vAlign w:val="center"/>
+            <w:tcBorders>
+              <w:top w:val="single" w:sz="4" w:space="0" w:color="CBD5E1"/>
+              <w:left w:val="single" w:sz="4" w:space="0" w:color="CBD5E1"/>
+              <w:bottom w:val="single" w:sz="4" w:space="0" w:color="CBD5E1"/>
+              <w:right w:val="single" w:sz="4" w:space="0" w:color="CBD5E1"/>
+            </w:tcBorders>
+          </w:tcPr>
+          <w:p>
+            <w:pPr>
+              <w:spacing w:after="40"/>
+            </w:pPr>
+            <w:r>
+              <w:rPr>
+                <w:rFonts w:ascii="Calibri" w:hAnsi="Calibri"/>
+                <w:sz w:val="18"/>
+              </w:rPr>
+              <w:t>Carrega os funcionarios da loja quando a grade precisar ser atualizada.</w:t>
             </w:r>
           </w:p>
         </w:tc>
@@ -1589,7 +2140,7 @@
                 <w:rFonts w:ascii="Calibri" w:hAnsi="Calibri"/>
                 <w:sz w:val="18"/>
               </w:rPr>
-              <w:t>Barra de acoes da escala</w:t>
+              <w:t>Modal Escala</w:t>
             </w:r>
           </w:p>
         </w:tc>
@@ -1613,7 +2164,7 @@
                 <w:rFonts w:ascii="Calibri" w:hAnsi="Calibri"/>
                 <w:sz w:val="18"/>
               </w:rPr>
-              <w:t>Aplica a regra de folgas 5x2 aos colaboradores carregados.</w:t>
+              <w:t>Aplica automaticamente as folgas conforme a regra 5x2 e bloqueia a edicao da timeline.</w:t>
             </w:r>
           </w:p>
         </w:tc>
@@ -1663,7 +2214,7 @@
                 <w:rFonts w:ascii="Calibri" w:hAnsi="Calibri"/>
                 <w:sz w:val="18"/>
               </w:rPr>
-              <w:t>Ao lado da distribuicao</w:t>
+              <w:t>Modal Escala apos distribuicao</w:t>
             </w:r>
           </w:p>
         </w:tc>
@@ -1687,7 +2238,229 @@
                 <w:rFonts w:ascii="Calibri" w:hAnsi="Calibri"/>
                 <w:sz w:val="18"/>
               </w:rPr>
-              <w:t>Libera a timeline novamente para ajustes e oculta a geracao detalhada ate nova distribuicao.</w:t>
+              <w:t>Libera a edicao novamente, esconde Gerar Escala Detalhada e exige nova distribuicao.</w:t>
+            </w:r>
+          </w:p>
+        </w:tc>
+      </w:tr>
+      <w:tr>
+        <w:tc>
+          <w:tcPr>
+            <w:tcW w:type="dxa" w:w="4704"/>
+            <w:vAlign w:val="center"/>
+            <w:tcBorders>
+              <w:top w:val="single" w:sz="4" w:space="0" w:color="CBD5E1"/>
+              <w:left w:val="single" w:sz="4" w:space="0" w:color="CBD5E1"/>
+              <w:bottom w:val="single" w:sz="4" w:space="0" w:color="CBD5E1"/>
+              <w:right w:val="single" w:sz="4" w:space="0" w:color="CBD5E1"/>
+            </w:tcBorders>
+          </w:tcPr>
+          <w:p>
+            <w:pPr>
+              <w:spacing w:after="40"/>
+            </w:pPr>
+            <w:r>
+              <w:rPr>
+                <w:rFonts w:ascii="Calibri" w:hAnsi="Calibri"/>
+                <w:sz w:val="18"/>
+              </w:rPr>
+              <w:t>Visualizar Timeline</w:t>
+            </w:r>
+          </w:p>
+        </w:tc>
+        <w:tc>
+          <w:tcPr>
+            <w:tcW w:type="dxa" w:w="4704"/>
+            <w:vAlign w:val="center"/>
+            <w:tcBorders>
+              <w:top w:val="single" w:sz="4" w:space="0" w:color="CBD5E1"/>
+              <w:left w:val="single" w:sz="4" w:space="0" w:color="CBD5E1"/>
+              <w:bottom w:val="single" w:sz="4" w:space="0" w:color="CBD5E1"/>
+              <w:right w:val="single" w:sz="4" w:space="0" w:color="CBD5E1"/>
+            </w:tcBorders>
+          </w:tcPr>
+          <w:p>
+            <w:pPr>
+              <w:spacing w:after="40"/>
+            </w:pPr>
+            <w:r>
+              <w:rPr>
+                <w:rFonts w:ascii="Calibri" w:hAnsi="Calibri"/>
+                <w:sz w:val="18"/>
+              </w:rPr>
+              <w:t>Modal Escala</w:t>
+            </w:r>
+          </w:p>
+        </w:tc>
+        <w:tc>
+          <w:tcPr>
+            <w:tcW w:type="dxa" w:w="4704"/>
+            <w:vAlign w:val="center"/>
+            <w:tcBorders>
+              <w:top w:val="single" w:sz="4" w:space="0" w:color="CBD5E1"/>
+              <w:left w:val="single" w:sz="4" w:space="0" w:color="CBD5E1"/>
+              <w:bottom w:val="single" w:sz="4" w:space="0" w:color="CBD5E1"/>
+              <w:right w:val="single" w:sz="4" w:space="0" w:color="CBD5E1"/>
+            </w:tcBorders>
+          </w:tcPr>
+          <w:p>
+            <w:pPr>
+              <w:spacing w:after="40"/>
+            </w:pPr>
+            <w:r>
+              <w:rPr>
+                <w:rFonts w:ascii="Calibri" w:hAnsi="Calibri"/>
+                <w:sz w:val="18"/>
+              </w:rPr>
+              <w:t>Abre uma visualizacao ampliada da timeline usada na escala.</w:t>
+            </w:r>
+          </w:p>
+        </w:tc>
+      </w:tr>
+      <w:tr>
+        <w:tc>
+          <w:tcPr>
+            <w:tcW w:type="dxa" w:w="4704"/>
+            <w:vAlign w:val="center"/>
+            <w:tcBorders>
+              <w:top w:val="single" w:sz="4" w:space="0" w:color="CBD5E1"/>
+              <w:left w:val="single" w:sz="4" w:space="0" w:color="CBD5E1"/>
+              <w:bottom w:val="single" w:sz="4" w:space="0" w:color="CBD5E1"/>
+              <w:right w:val="single" w:sz="4" w:space="0" w:color="CBD5E1"/>
+            </w:tcBorders>
+          </w:tcPr>
+          <w:p>
+            <w:pPr>
+              <w:spacing w:after="40"/>
+            </w:pPr>
+            <w:r>
+              <w:rPr>
+                <w:rFonts w:ascii="Calibri" w:hAnsi="Calibri"/>
+                <w:sz w:val="18"/>
+              </w:rPr>
+              <w:t>Gerar Escala Detalhada</w:t>
+            </w:r>
+          </w:p>
+        </w:tc>
+        <w:tc>
+          <w:tcPr>
+            <w:tcW w:type="dxa" w:w="4704"/>
+            <w:vAlign w:val="center"/>
+            <w:tcBorders>
+              <w:top w:val="single" w:sz="4" w:space="0" w:color="CBD5E1"/>
+              <w:left w:val="single" w:sz="4" w:space="0" w:color="CBD5E1"/>
+              <w:bottom w:val="single" w:sz="4" w:space="0" w:color="CBD5E1"/>
+              <w:right w:val="single" w:sz="4" w:space="0" w:color="CBD5E1"/>
+            </w:tcBorders>
+          </w:tcPr>
+          <w:p>
+            <w:pPr>
+              <w:spacing w:after="40"/>
+            </w:pPr>
+            <w:r>
+              <w:rPr>
+                <w:rFonts w:ascii="Calibri" w:hAnsi="Calibri"/>
+                <w:sz w:val="18"/>
+              </w:rPr>
+              <w:t>Modal Escala apos distribuicao</w:t>
+            </w:r>
+          </w:p>
+        </w:tc>
+        <w:tc>
+          <w:tcPr>
+            <w:tcW w:type="dxa" w:w="4704"/>
+            <w:vAlign w:val="center"/>
+            <w:tcBorders>
+              <w:top w:val="single" w:sz="4" w:space="0" w:color="CBD5E1"/>
+              <w:left w:val="single" w:sz="4" w:space="0" w:color="CBD5E1"/>
+              <w:bottom w:val="single" w:sz="4" w:space="0" w:color="CBD5E1"/>
+              <w:right w:val="single" w:sz="4" w:space="0" w:color="CBD5E1"/>
+            </w:tcBorders>
+          </w:tcPr>
+          <w:p>
+            <w:pPr>
+              <w:spacing w:after="40"/>
+            </w:pPr>
+            <w:r>
+              <w:rPr>
+                <w:rFonts w:ascii="Calibri" w:hAnsi="Calibri"/>
+                <w:sz w:val="18"/>
+              </w:rPr>
+              <w:t>Converte a grade distribuida em escala diaria por funcionario.</w:t>
+            </w:r>
+          </w:p>
+        </w:tc>
+      </w:tr>
+      <w:tr>
+        <w:tc>
+          <w:tcPr>
+            <w:tcW w:type="dxa" w:w="4704"/>
+            <w:vAlign w:val="center"/>
+            <w:tcBorders>
+              <w:top w:val="single" w:sz="4" w:space="0" w:color="CBD5E1"/>
+              <w:left w:val="single" w:sz="4" w:space="0" w:color="CBD5E1"/>
+              <w:bottom w:val="single" w:sz="4" w:space="0" w:color="CBD5E1"/>
+              <w:right w:val="single" w:sz="4" w:space="0" w:color="CBD5E1"/>
+            </w:tcBorders>
+          </w:tcPr>
+          <w:p>
+            <w:pPr>
+              <w:spacing w:after="40"/>
+            </w:pPr>
+            <w:r>
+              <w:rPr>
+                <w:rFonts w:ascii="Calibri" w:hAnsi="Calibri"/>
+                <w:sz w:val="18"/>
+              </w:rPr>
+              <w:t>Imprimir Esqueleto</w:t>
+            </w:r>
+          </w:p>
+        </w:tc>
+        <w:tc>
+          <w:tcPr>
+            <w:tcW w:type="dxa" w:w="4704"/>
+            <w:vAlign w:val="center"/>
+            <w:tcBorders>
+              <w:top w:val="single" w:sz="4" w:space="0" w:color="CBD5E1"/>
+              <w:left w:val="single" w:sz="4" w:space="0" w:color="CBD5E1"/>
+              <w:bottom w:val="single" w:sz="4" w:space="0" w:color="CBD5E1"/>
+              <w:right w:val="single" w:sz="4" w:space="0" w:color="CBD5E1"/>
+            </w:tcBorders>
+          </w:tcPr>
+          <w:p>
+            <w:pPr>
+              <w:spacing w:after="40"/>
+            </w:pPr>
+            <w:r>
+              <w:rPr>
+                <w:rFonts w:ascii="Calibri" w:hAnsi="Calibri"/>
+                <w:sz w:val="18"/>
+              </w:rPr>
+              <w:t>Modal Escala</w:t>
+            </w:r>
+          </w:p>
+        </w:tc>
+        <w:tc>
+          <w:tcPr>
+            <w:tcW w:type="dxa" w:w="4704"/>
+            <w:vAlign w:val="center"/>
+            <w:tcBorders>
+              <w:top w:val="single" w:sz="4" w:space="0" w:color="CBD5E1"/>
+              <w:left w:val="single" w:sz="4" w:space="0" w:color="CBD5E1"/>
+              <w:bottom w:val="single" w:sz="4" w:space="0" w:color="CBD5E1"/>
+              <w:right w:val="single" w:sz="4" w:space="0" w:color="CBD5E1"/>
+            </w:tcBorders>
+          </w:tcPr>
+          <w:p>
+            <w:pPr>
+              <w:spacing w:after="40"/>
+            </w:pPr>
+            <w:r>
+              <w:rPr>
+                <w:rFonts w:ascii="Calibri" w:hAnsi="Calibri"/>
+                <w:sz w:val="18"/>
+              </w:rPr>
+              <w:t>Imprime a grade/esqueleto de distribuicao.</w:t>
             </w:r>
           </w:p>
         </w:tc>
@@ -1737,7 +2510,7 @@
                 <w:rFonts w:ascii="Calibri" w:hAnsi="Calibri"/>
                 <w:sz w:val="18"/>
               </w:rPr>
-              <w:t>Barra de acoes da escala</w:t>
+              <w:t>Modal Escala Detalhada</w:t>
             </w:r>
           </w:p>
         </w:tc>
@@ -1761,7 +2534,7 @@
                 <w:rFonts w:ascii="Calibri" w:hAnsi="Calibri"/>
                 <w:sz w:val="18"/>
               </w:rPr>
-              <w:t>Executa as validacoes de regras antes do salvamento.</w:t>
+              <w:t>Executa as regras de validacao antes do salvamento.</w:t>
             </w:r>
           </w:p>
         </w:tc>
@@ -1787,7 +2560,7 @@
                 <w:rFonts w:ascii="Calibri" w:hAnsi="Calibri"/>
                 <w:sz w:val="18"/>
               </w:rPr>
-              <w:t>Gerar Escala Detalhada</w:t>
+              <w:t>Salvar Escala</w:t>
             </w:r>
           </w:p>
         </w:tc>
@@ -1811,7 +2584,7 @@
                 <w:rFonts w:ascii="Calibri" w:hAnsi="Calibri"/>
                 <w:sz w:val="18"/>
               </w:rPr>
-              <w:t>Apos distribuicao</w:t>
+              <w:t>Modal Escala Detalhada</w:t>
             </w:r>
           </w:p>
         </w:tc>
@@ -1835,7 +2608,7 @@
                 <w:rFonts w:ascii="Calibri" w:hAnsi="Calibri"/>
                 <w:sz w:val="18"/>
               </w:rPr>
-              <w:t>Monta a grade dia a dia dos funcionarios.</w:t>
+              <w:t>Grava a escala no banco e retorna para Escalas Geradas.</w:t>
             </w:r>
           </w:p>
         </w:tc>
@@ -1861,7 +2634,7 @@
                 <w:rFonts w:ascii="Calibri" w:hAnsi="Calibri"/>
                 <w:sz w:val="18"/>
               </w:rPr>
-              <w:t>Imprimir</w:t>
+              <w:t>Imprimir Escala Detalhada</w:t>
             </w:r>
           </w:p>
         </w:tc>
@@ -1885,7 +2658,7 @@
                 <w:rFonts w:ascii="Calibri" w:hAnsi="Calibri"/>
                 <w:sz w:val="18"/>
               </w:rPr>
-              <w:t>Barra de acoes</w:t>
+              <w:t>Modal Escala Detalhada</w:t>
             </w:r>
           </w:p>
         </w:tc>
@@ -1909,7 +2682,7 @@
                 <w:rFonts w:ascii="Calibri" w:hAnsi="Calibri"/>
                 <w:sz w:val="18"/>
               </w:rPr>
-              <w:t>Gera a impressao da timeline ou escala detalhada.</w:t>
+              <w:t>Imprime a escala mensal detalhada.</w:t>
             </w:r>
           </w:p>
         </w:tc>
@@ -1935,7 +2708,7 @@
                 <w:rFonts w:ascii="Calibri" w:hAnsi="Calibri"/>
                 <w:sz w:val="18"/>
               </w:rPr>
-              <w:t>Salvar</w:t>
+              <w:t>Fechar</w:t>
             </w:r>
           </w:p>
         </w:tc>
@@ -1959,7 +2732,7 @@
                 <w:rFonts w:ascii="Calibri" w:hAnsi="Calibri"/>
                 <w:sz w:val="18"/>
               </w:rPr>
-              <w:t>Barra de acoes</w:t>
+              <w:t>Modais de escala</w:t>
             </w:r>
           </w:p>
         </w:tc>
@@ -1983,7 +2756,7 @@
                 <w:rFonts w:ascii="Calibri" w:hAnsi="Calibri"/>
                 <w:sz w:val="18"/>
               </w:rPr>
-              <w:t>Grava a escala no banco nas tabelas de programacao e dias.</w:t>
+              <w:t>Fecha a janela atual. Se houver rascunho nao salvo, o progresso pode ser perdido ao sair da tela.</w:t>
             </w:r>
           </w:p>
         </w:tc>
@@ -2011,7 +2784,7 @@
         <w:drawing>
           <wp:inline xmlns:a="http://schemas.openxmlformats.org/drawingml/2006/main" xmlns:pic="http://schemas.openxmlformats.org/drawingml/2006/picture">
             <wp:extent cx="8138160" cy="4882896"/>
-            <wp:docPr id="5" name="Picture 5"/>
+            <wp:docPr id="10" name="Picture 10"/>
             <wp:cNvGraphicFramePr>
               <a:graphicFrameLocks noChangeAspect="1"/>
             </wp:cNvGraphicFramePr>
@@ -2019,11 +2792,11 @@
               <a:graphicData uri="http://schemas.openxmlformats.org/drawingml/2006/picture">
                 <pic:pic>
                   <pic:nvPicPr>
-                    <pic:cNvPr id="0" name="14-modal-criar-escala.png"/>
+                    <pic:cNvPr id="0" name="15-abrir-escala.png"/>
                     <pic:cNvPicPr/>
                   </pic:nvPicPr>
                   <pic:blipFill>
-                    <a:blip r:embed="rId14"/>
+                    <a:blip r:embed="rId20"/>
                     <a:stretch>
                       <a:fillRect/>
                     </a:stretch>
@@ -2125,7 +2898,7 @@
         <w:drawing>
           <wp:inline xmlns:a="http://schemas.openxmlformats.org/drawingml/2006/main" xmlns:pic="http://schemas.openxmlformats.org/drawingml/2006/picture">
             <wp:extent cx="8138160" cy="4882896"/>
-            <wp:docPr id="6" name="Picture 6"/>
+            <wp:docPr id="11" name="Picture 11"/>
             <wp:cNvGraphicFramePr>
               <a:graphicFrameLocks noChangeAspect="1"/>
             </wp:cNvGraphicFramePr>
@@ -2137,7 +2910,7 @@
                     <pic:cNvPicPr/>
                   </pic:nvPicPr>
                   <pic:blipFill>
-                    <a:blip r:embed="rId15"/>
+                    <a:blip r:embed="rId21"/>
                     <a:stretch>
                       <a:fillRect/>
                     </a:stretch>
@@ -2674,7 +3447,7 @@
         <w:drawing>
           <wp:inline xmlns:a="http://schemas.openxmlformats.org/drawingml/2006/main" xmlns:pic="http://schemas.openxmlformats.org/drawingml/2006/picture">
             <wp:extent cx="8138160" cy="4882896"/>
-            <wp:docPr id="7" name="Picture 7"/>
+            <wp:docPr id="12" name="Picture 12"/>
             <wp:cNvGraphicFramePr>
               <a:graphicFrameLocks noChangeAspect="1"/>
             </wp:cNvGraphicFramePr>
@@ -2686,7 +3459,7 @@
                     <pic:cNvPicPr/>
                   </pic:nvPicPr>
                   <pic:blipFill>
-                    <a:blip r:embed="rId16"/>
+                    <a:blip r:embed="rId22"/>
                     <a:stretch>
                       <a:fillRect/>
                     </a:stretch>
@@ -2780,7 +3553,7 @@
         <w:drawing>
           <wp:inline xmlns:a="http://schemas.openxmlformats.org/drawingml/2006/main" xmlns:pic="http://schemas.openxmlformats.org/drawingml/2006/picture">
             <wp:extent cx="8138160" cy="4882896"/>
-            <wp:docPr id="8" name="Picture 8"/>
+            <wp:docPr id="13" name="Picture 13"/>
             <wp:cNvGraphicFramePr>
               <a:graphicFrameLocks noChangeAspect="1"/>
             </wp:cNvGraphicFramePr>
@@ -2792,7 +3565,7 @@
                     <pic:cNvPicPr/>
                   </pic:nvPicPr>
                   <pic:blipFill>
-                    <a:blip r:embed="rId17"/>
+                    <a:blip r:embed="rId23"/>
                     <a:stretch>
                       <a:fillRect/>
                     </a:stretch>
@@ -2833,7 +3606,7 @@
         <w:drawing>
           <wp:inline xmlns:a="http://schemas.openxmlformats.org/drawingml/2006/main" xmlns:pic="http://schemas.openxmlformats.org/drawingml/2006/picture">
             <wp:extent cx="8138160" cy="4882896"/>
-            <wp:docPr id="9" name="Picture 9"/>
+            <wp:docPr id="14" name="Picture 14"/>
             <wp:cNvGraphicFramePr>
               <a:graphicFrameLocks noChangeAspect="1"/>
             </wp:cNvGraphicFramePr>
@@ -2845,7 +3618,7 @@
                     <pic:cNvPicPr/>
                   </pic:nvPicPr>
                   <pic:blipFill>
-                    <a:blip r:embed="rId18"/>
+                    <a:blip r:embed="rId24"/>
                     <a:stretch>
                       <a:fillRect/>
                     </a:stretch>
@@ -2949,7 +3722,7 @@
         <w:drawing>
           <wp:inline xmlns:a="http://schemas.openxmlformats.org/drawingml/2006/main" xmlns:pic="http://schemas.openxmlformats.org/drawingml/2006/picture">
             <wp:extent cx="8138160" cy="4882896"/>
-            <wp:docPr id="10" name="Picture 10"/>
+            <wp:docPr id="15" name="Picture 15"/>
             <wp:cNvGraphicFramePr>
               <a:graphicFrameLocks noChangeAspect="1"/>
             </wp:cNvGraphicFramePr>
@@ -2961,7 +3734,7 @@
                     <pic:cNvPicPr/>
                   </pic:nvPicPr>
                   <pic:blipFill>
-                    <a:blip r:embed="rId19"/>
+                    <a:blip r:embed="rId25"/>
                     <a:stretch>
                       <a:fillRect/>
                     </a:stretch>
@@ -3002,7 +3775,7 @@
         <w:drawing>
           <wp:inline xmlns:a="http://schemas.openxmlformats.org/drawingml/2006/main" xmlns:pic="http://schemas.openxmlformats.org/drawingml/2006/picture">
             <wp:extent cx="8138160" cy="4882896"/>
-            <wp:docPr id="11" name="Picture 11"/>
+            <wp:docPr id="16" name="Picture 16"/>
             <wp:cNvGraphicFramePr>
               <a:graphicFrameLocks noChangeAspect="1"/>
             </wp:cNvGraphicFramePr>
@@ -3014,7 +3787,7 @@
                     <pic:cNvPicPr/>
                   </pic:nvPicPr>
                   <pic:blipFill>
-                    <a:blip r:embed="rId20"/>
+                    <a:blip r:embed="rId26"/>
                     <a:stretch>
                       <a:fillRect/>
                     </a:stretch>
@@ -3469,7 +4242,7 @@
         <w:drawing>
           <wp:inline xmlns:a="http://schemas.openxmlformats.org/drawingml/2006/main" xmlns:pic="http://schemas.openxmlformats.org/drawingml/2006/picture">
             <wp:extent cx="8138160" cy="4882896"/>
-            <wp:docPr id="12" name="Picture 12"/>
+            <wp:docPr id="17" name="Picture 17"/>
             <wp:cNvGraphicFramePr>
               <a:graphicFrameLocks noChangeAspect="1"/>
             </wp:cNvGraphicFramePr>
@@ -3543,7 +4316,7 @@
         <w:drawing>
           <wp:inline xmlns:a="http://schemas.openxmlformats.org/drawingml/2006/main" xmlns:pic="http://schemas.openxmlformats.org/drawingml/2006/picture">
             <wp:extent cx="8138160" cy="4882896"/>
-            <wp:docPr id="13" name="Picture 13"/>
+            <wp:docPr id="18" name="Picture 18"/>
             <wp:cNvGraphicFramePr>
               <a:graphicFrameLocks noChangeAspect="1"/>
             </wp:cNvGraphicFramePr>
@@ -3617,7 +4390,7 @@
         <w:drawing>
           <wp:inline xmlns:a="http://schemas.openxmlformats.org/drawingml/2006/main" xmlns:pic="http://schemas.openxmlformats.org/drawingml/2006/picture">
             <wp:extent cx="8138160" cy="4882896"/>
-            <wp:docPr id="14" name="Picture 14"/>
+            <wp:docPr id="19" name="Picture 19"/>
             <wp:cNvGraphicFramePr>
               <a:graphicFrameLocks noChangeAspect="1"/>
             </wp:cNvGraphicFramePr>
@@ -3629,7 +4402,7 @@
                     <pic:cNvPicPr/>
                   </pic:nvPicPr>
                   <pic:blipFill>
-                    <a:blip r:embed="rId21"/>
+                    <a:blip r:embed="rId27"/>
                     <a:stretch>
                       <a:fillRect/>
                     </a:stretch>
@@ -3721,7 +4494,7 @@
         <w:drawing>
           <wp:inline xmlns:a="http://schemas.openxmlformats.org/drawingml/2006/main" xmlns:pic="http://schemas.openxmlformats.org/drawingml/2006/picture">
             <wp:extent cx="8138160" cy="4882896"/>
-            <wp:docPr id="15" name="Picture 15"/>
+            <wp:docPr id="20" name="Picture 20"/>
             <wp:cNvGraphicFramePr>
               <a:graphicFrameLocks noChangeAspect="1"/>
             </wp:cNvGraphicFramePr>
@@ -3733,7 +4506,7 @@
                     <pic:cNvPicPr/>
                   </pic:nvPicPr>
                   <pic:blipFill>
-                    <a:blip r:embed="rId22"/>
+                    <a:blip r:embed="rId28"/>
                     <a:stretch>
                       <a:fillRect/>
                     </a:stretch>
@@ -3795,7 +4568,7 @@
         <w:drawing>
           <wp:inline xmlns:a="http://schemas.openxmlformats.org/drawingml/2006/main" xmlns:pic="http://schemas.openxmlformats.org/drawingml/2006/picture">
             <wp:extent cx="8138160" cy="4882896"/>
-            <wp:docPr id="16" name="Picture 16"/>
+            <wp:docPr id="21" name="Picture 21"/>
             <wp:cNvGraphicFramePr>
               <a:graphicFrameLocks noChangeAspect="1"/>
             </wp:cNvGraphicFramePr>
@@ -3807,7 +4580,7 @@
                     <pic:cNvPicPr/>
                   </pic:nvPicPr>
                   <pic:blipFill>
-                    <a:blip r:embed="rId23"/>
+                    <a:blip r:embed="rId29"/>
                     <a:stretch>
                       <a:fillRect/>
                     </a:stretch>

</xml_diff>

<commit_message>
docs: label creation flow screenshots in manual
</commit_message>
<xml_diff>
--- a/work/docs/manual-usuario-escala-inteligente.docx
+++ b/work/docs/manual-usuario-escala-inteligente.docx
@@ -1190,7 +1190,7 @@
           <w:color w:val="64748B"/>
           <w:sz w:val="18"/>
         </w:rPr>
-        <w:t>Modal inicial para escolher loja, mes e ano da escala.</w:t>
+        <w:t>Print 14 - Modal inicial para escolher loja, mes e ano da escala.</w:t>
       </w:r>
     </w:p>
     <w:p>
@@ -1351,7 +1351,7 @@
           <w:color w:val="64748B"/>
           <w:sz w:val="18"/>
         </w:rPr>
-        <w:t>Etapa 1 - Selecionar as secoes/turnos que farao parte da escala.</w:t>
+        <w:t>Print 16 - Etapa 1: selecionar as secoes/turnos que farao parte da escala.</w:t>
       </w:r>
     </w:p>
     <w:p>
@@ -1444,7 +1444,7 @@
           <w:color w:val="64748B"/>
           <w:sz w:val="18"/>
         </w:rPr>
-        <w:t>Etapa 2 - Timeline gerada com as secoes selecionadas.</w:t>
+        <w:t>Print 17 - Etapa 2: timeline gerada com as secoes selecionadas.</w:t>
       </w:r>
     </w:p>
     <w:p>
@@ -1505,7 +1505,7 @@
           <w:color w:val="64748B"/>
           <w:sz w:val="18"/>
         </w:rPr>
-        <w:t>Etapa 3 - Tela de distribuicao dos funcionarios antes da regra 5x2.</w:t>
+        <w:t>Print 18 - Etapa 3: tela de distribuicao dos funcionarios antes da regra 5x2.</w:t>
       </w:r>
     </w:p>
     <w:p>
@@ -1566,7 +1566,7 @@
           <w:color w:val="64748B"/>
           <w:sz w:val="18"/>
         </w:rPr>
-        <w:t>Etapa 4 - Folgas distribuidas pela regra 5x2 e timeline bloqueada para edicao.</w:t>
+        <w:t>Print 19 - Etapa 4: folgas distribuidas pela regra 5x2 e timeline bloqueada para edicao.</w:t>
       </w:r>
     </w:p>
     <w:p>
@@ -1627,7 +1627,7 @@
           <w:color w:val="64748B"/>
           <w:sz w:val="18"/>
         </w:rPr>
-        <w:t>Etapa 5 - Escala detalhada pronta para validar, salvar ou imprimir.</w:t>
+        <w:t>Print 20 - Etapa 5: escala detalhada pronta para validar, salvar ou imprimir.</w:t>
       </w:r>
     </w:p>
     <w:tbl>
@@ -2773,7 +2773,15 @@
           <w:b/>
           <w:color w:val="2563EB"/>
         </w:rPr>
-        <w:t>6. Abrir e editar uma escala pronta</w:t>
+        <w:t>5.1 Sequencia visual dos prints 15 a 20</w:t>
+      </w:r>
+    </w:p>
+    <w:p>
+      <w:pPr>
+        <w:spacing w:after="120"/>
+      </w:pPr>
+      <w:r>
+        <w:t>Esta sequencia reune os prints especificos do fluxo de criacao e abertura da escala para consulta rapida.</w:t>
       </w:r>
     </w:p>
     <w:p>
@@ -2826,7 +2834,338 @@
           <w:color w:val="64748B"/>
           <w:sz w:val="18"/>
         </w:rPr>
-        <w:t>Visualizacao ao abrir uma escala existente.</w:t>
+        <w:t>Print 15 - Abrir uma escala existente para visualizacao/edicao.</w:t>
+      </w:r>
+    </w:p>
+    <w:p>
+      <w:pPr>
+        <w:jc w:val="center"/>
+      </w:pPr>
+      <w:r>
+        <w:drawing>
+          <wp:inline xmlns:a="http://schemas.openxmlformats.org/drawingml/2006/main" xmlns:pic="http://schemas.openxmlformats.org/drawingml/2006/picture">
+            <wp:extent cx="8138160" cy="4882896"/>
+            <wp:docPr id="11" name="Picture 11"/>
+            <wp:cNvGraphicFramePr>
+              <a:graphicFrameLocks noChangeAspect="1"/>
+            </wp:cNvGraphicFramePr>
+            <a:graphic>
+              <a:graphicData uri="http://schemas.openxmlformats.org/drawingml/2006/picture">
+                <pic:pic>
+                  <pic:nvPicPr>
+                    <pic:cNvPr id="0" name="16-criacao-selecionar-secoes.png"/>
+                    <pic:cNvPicPr/>
+                  </pic:nvPicPr>
+                  <pic:blipFill>
+                    <a:blip r:embed="rId15"/>
+                    <a:stretch>
+                      <a:fillRect/>
+                    </a:stretch>
+                  </pic:blipFill>
+                  <pic:spPr>
+                    <a:xfrm>
+                      <a:off x="0" y="0"/>
+                      <a:ext cx="8138160" cy="4882896"/>
+                    </a:xfrm>
+                    <a:prstGeom prst="rect"/>
+                  </pic:spPr>
+                </pic:pic>
+              </a:graphicData>
+            </a:graphic>
+          </wp:inline>
+        </w:drawing>
+      </w:r>
+    </w:p>
+    <w:p>
+      <w:pPr>
+        <w:spacing w:after="200"/>
+        <w:jc w:val="center"/>
+      </w:pPr>
+      <w:r>
+        <w:rPr>
+          <w:i/>
+          <w:color w:val="64748B"/>
+          <w:sz w:val="18"/>
+        </w:rPr>
+        <w:t>Print 16 - Selecionar secoes/turnos no rascunho da nova escala.</w:t>
+      </w:r>
+    </w:p>
+    <w:p>
+      <w:pPr>
+        <w:jc w:val="center"/>
+      </w:pPr>
+      <w:r>
+        <w:drawing>
+          <wp:inline xmlns:a="http://schemas.openxmlformats.org/drawingml/2006/main" xmlns:pic="http://schemas.openxmlformats.org/drawingml/2006/picture">
+            <wp:extent cx="8138160" cy="6144311"/>
+            <wp:docPr id="12" name="Picture 12"/>
+            <wp:cNvGraphicFramePr>
+              <a:graphicFrameLocks noChangeAspect="1"/>
+            </wp:cNvGraphicFramePr>
+            <a:graphic>
+              <a:graphicData uri="http://schemas.openxmlformats.org/drawingml/2006/picture">
+                <pic:pic>
+                  <pic:nvPicPr>
+                    <pic:cNvPr id="0" name="17-criacao-timeline-gerada.png"/>
+                    <pic:cNvPicPr/>
+                  </pic:nvPicPr>
+                  <pic:blipFill>
+                    <a:blip r:embed="rId16"/>
+                    <a:stretch>
+                      <a:fillRect/>
+                    </a:stretch>
+                  </pic:blipFill>
+                  <pic:spPr>
+                    <a:xfrm>
+                      <a:off x="0" y="0"/>
+                      <a:ext cx="8138160" cy="6144311"/>
+                    </a:xfrm>
+                    <a:prstGeom prst="rect"/>
+                  </pic:spPr>
+                </pic:pic>
+              </a:graphicData>
+            </a:graphic>
+          </wp:inline>
+        </w:drawing>
+      </w:r>
+    </w:p>
+    <w:p>
+      <w:pPr>
+        <w:spacing w:after="200"/>
+        <w:jc w:val="center"/>
+      </w:pPr>
+      <w:r>
+        <w:rPr>
+          <w:i/>
+          <w:color w:val="64748B"/>
+          <w:sz w:val="18"/>
+        </w:rPr>
+        <w:t>Print 17 - Gerar e revisar a timeline da escala.</w:t>
+      </w:r>
+    </w:p>
+    <w:p>
+      <w:pPr>
+        <w:jc w:val="center"/>
+      </w:pPr>
+      <w:r>
+        <w:drawing>
+          <wp:inline xmlns:a="http://schemas.openxmlformats.org/drawingml/2006/main" xmlns:pic="http://schemas.openxmlformats.org/drawingml/2006/picture">
+            <wp:extent cx="8138160" cy="10152355"/>
+            <wp:docPr id="13" name="Picture 13"/>
+            <wp:cNvGraphicFramePr>
+              <a:graphicFrameLocks noChangeAspect="1"/>
+            </wp:cNvGraphicFramePr>
+            <a:graphic>
+              <a:graphicData uri="http://schemas.openxmlformats.org/drawingml/2006/picture">
+                <pic:pic>
+                  <pic:nvPicPr>
+                    <pic:cNvPr id="0" name="18-criacao-distribuir-funcionarios.png"/>
+                    <pic:cNvPicPr/>
+                  </pic:nvPicPr>
+                  <pic:blipFill>
+                    <a:blip r:embed="rId17"/>
+                    <a:stretch>
+                      <a:fillRect/>
+                    </a:stretch>
+                  </pic:blipFill>
+                  <pic:spPr>
+                    <a:xfrm>
+                      <a:off x="0" y="0"/>
+                      <a:ext cx="8138160" cy="10152355"/>
+                    </a:xfrm>
+                    <a:prstGeom prst="rect"/>
+                  </pic:spPr>
+                </pic:pic>
+              </a:graphicData>
+            </a:graphic>
+          </wp:inline>
+        </w:drawing>
+      </w:r>
+    </w:p>
+    <w:p>
+      <w:pPr>
+        <w:spacing w:after="200"/>
+        <w:jc w:val="center"/>
+      </w:pPr>
+      <w:r>
+        <w:rPr>
+          <w:i/>
+          <w:color w:val="64748B"/>
+          <w:sz w:val="18"/>
+        </w:rPr>
+        <w:t>Print 18 - Distribuir funcionarios na grade/esqueleto.</w:t>
+      </w:r>
+    </w:p>
+    <w:p>
+      <w:pPr>
+        <w:jc w:val="center"/>
+      </w:pPr>
+      <w:r>
+        <w:drawing>
+          <wp:inline xmlns:a="http://schemas.openxmlformats.org/drawingml/2006/main" xmlns:pic="http://schemas.openxmlformats.org/drawingml/2006/picture">
+            <wp:extent cx="8138160" cy="10152355"/>
+            <wp:docPr id="14" name="Picture 14"/>
+            <wp:cNvGraphicFramePr>
+              <a:graphicFrameLocks noChangeAspect="1"/>
+            </wp:cNvGraphicFramePr>
+            <a:graphic>
+              <a:graphicData uri="http://schemas.openxmlformats.org/drawingml/2006/picture">
+                <pic:pic>
+                  <pic:nvPicPr>
+                    <pic:cNvPr id="0" name="19-criacao-folgas-distribuidas.png"/>
+                    <pic:cNvPicPr/>
+                  </pic:nvPicPr>
+                  <pic:blipFill>
+                    <a:blip r:embed="rId18"/>
+                    <a:stretch>
+                      <a:fillRect/>
+                    </a:stretch>
+                  </pic:blipFill>
+                  <pic:spPr>
+                    <a:xfrm>
+                      <a:off x="0" y="0"/>
+                      <a:ext cx="8138160" cy="10152355"/>
+                    </a:xfrm>
+                    <a:prstGeom prst="rect"/>
+                  </pic:spPr>
+                </pic:pic>
+              </a:graphicData>
+            </a:graphic>
+          </wp:inline>
+        </w:drawing>
+      </w:r>
+    </w:p>
+    <w:p>
+      <w:pPr>
+        <w:spacing w:after="200"/>
+        <w:jc w:val="center"/>
+      </w:pPr>
+      <w:r>
+        <w:rPr>
+          <w:i/>
+          <w:color w:val="64748B"/>
+          <w:sz w:val="18"/>
+        </w:rPr>
+        <w:t>Print 19 - Aplicar Distribuir Folgas 5x2 e bloquear edicao.</w:t>
+      </w:r>
+    </w:p>
+    <w:p>
+      <w:pPr>
+        <w:jc w:val="center"/>
+      </w:pPr>
+      <w:r>
+        <w:drawing>
+          <wp:inline xmlns:a="http://schemas.openxmlformats.org/drawingml/2006/main" xmlns:pic="http://schemas.openxmlformats.org/drawingml/2006/picture">
+            <wp:extent cx="8138160" cy="10152355"/>
+            <wp:docPr id="15" name="Picture 15"/>
+            <wp:cNvGraphicFramePr>
+              <a:graphicFrameLocks noChangeAspect="1"/>
+            </wp:cNvGraphicFramePr>
+            <a:graphic>
+              <a:graphicData uri="http://schemas.openxmlformats.org/drawingml/2006/picture">
+                <pic:pic>
+                  <pic:nvPicPr>
+                    <pic:cNvPr id="0" name="20-criacao-escala-detalhada.png"/>
+                    <pic:cNvPicPr/>
+                  </pic:nvPicPr>
+                  <pic:blipFill>
+                    <a:blip r:embed="rId19"/>
+                    <a:stretch>
+                      <a:fillRect/>
+                    </a:stretch>
+                  </pic:blipFill>
+                  <pic:spPr>
+                    <a:xfrm>
+                      <a:off x="0" y="0"/>
+                      <a:ext cx="8138160" cy="10152355"/>
+                    </a:xfrm>
+                    <a:prstGeom prst="rect"/>
+                  </pic:spPr>
+                </pic:pic>
+              </a:graphicData>
+            </a:graphic>
+          </wp:inline>
+        </w:drawing>
+      </w:r>
+    </w:p>
+    <w:p>
+      <w:pPr>
+        <w:spacing w:after="200"/>
+        <w:jc w:val="center"/>
+      </w:pPr>
+      <w:r>
+        <w:rPr>
+          <w:i/>
+          <w:color w:val="64748B"/>
+          <w:sz w:val="18"/>
+        </w:rPr>
+        <w:t>Print 20 - Gerar a escala detalhada para validar, salvar e imprimir.</w:t>
+      </w:r>
+    </w:p>
+    <w:p>
+      <w:pPr>
+        <w:pStyle w:val="Heading1"/>
+      </w:pPr>
+      <w:r>
+        <w:rPr>
+          <w:rFonts w:ascii="Calibri" w:hAnsi="Calibri"/>
+          <w:b/>
+          <w:color w:val="2563EB"/>
+        </w:rPr>
+        <w:t>6. Abrir e editar uma escala pronta</w:t>
+      </w:r>
+    </w:p>
+    <w:p>
+      <w:pPr>
+        <w:jc w:val="center"/>
+      </w:pPr>
+      <w:r>
+        <w:drawing>
+          <wp:inline xmlns:a="http://schemas.openxmlformats.org/drawingml/2006/main" xmlns:pic="http://schemas.openxmlformats.org/drawingml/2006/picture">
+            <wp:extent cx="8138160" cy="4882896"/>
+            <wp:docPr id="16" name="Picture 16"/>
+            <wp:cNvGraphicFramePr>
+              <a:graphicFrameLocks noChangeAspect="1"/>
+            </wp:cNvGraphicFramePr>
+            <a:graphic>
+              <a:graphicData uri="http://schemas.openxmlformats.org/drawingml/2006/picture">
+                <pic:pic>
+                  <pic:nvPicPr>
+                    <pic:cNvPr id="0" name="15-abrir-escala.png"/>
+                    <pic:cNvPicPr/>
+                  </pic:nvPicPr>
+                  <pic:blipFill>
+                    <a:blip r:embed="rId20"/>
+                    <a:stretch>
+                      <a:fillRect/>
+                    </a:stretch>
+                  </pic:blipFill>
+                  <pic:spPr>
+                    <a:xfrm>
+                      <a:off x="0" y="0"/>
+                      <a:ext cx="8138160" cy="4882896"/>
+                    </a:xfrm>
+                    <a:prstGeom prst="rect"/>
+                  </pic:spPr>
+                </pic:pic>
+              </a:graphicData>
+            </a:graphic>
+          </wp:inline>
+        </w:drawing>
+      </w:r>
+    </w:p>
+    <w:p>
+      <w:pPr>
+        <w:spacing w:after="200"/>
+        <w:jc w:val="center"/>
+      </w:pPr>
+      <w:r>
+        <w:rPr>
+          <w:i/>
+          <w:color w:val="64748B"/>
+          <w:sz w:val="18"/>
+        </w:rPr>
+        <w:t>Print 15 - Visualizacao ao abrir uma escala existente.</w:t>
       </w:r>
     </w:p>
     <w:p>
@@ -2898,7 +3237,7 @@
         <w:drawing>
           <wp:inline xmlns:a="http://schemas.openxmlformats.org/drawingml/2006/main" xmlns:pic="http://schemas.openxmlformats.org/drawingml/2006/picture">
             <wp:extent cx="8138160" cy="4882896"/>
-            <wp:docPr id="11" name="Picture 11"/>
+            <wp:docPr id="17" name="Picture 17"/>
             <wp:cNvGraphicFramePr>
               <a:graphicFrameLocks noChangeAspect="1"/>
             </wp:cNvGraphicFramePr>
@@ -3447,7 +3786,7 @@
         <w:drawing>
           <wp:inline xmlns:a="http://schemas.openxmlformats.org/drawingml/2006/main" xmlns:pic="http://schemas.openxmlformats.org/drawingml/2006/picture">
             <wp:extent cx="8138160" cy="4882896"/>
-            <wp:docPr id="12" name="Picture 12"/>
+            <wp:docPr id="18" name="Picture 18"/>
             <wp:cNvGraphicFramePr>
               <a:graphicFrameLocks noChangeAspect="1"/>
             </wp:cNvGraphicFramePr>
@@ -3553,7 +3892,7 @@
         <w:drawing>
           <wp:inline xmlns:a="http://schemas.openxmlformats.org/drawingml/2006/main" xmlns:pic="http://schemas.openxmlformats.org/drawingml/2006/picture">
             <wp:extent cx="8138160" cy="4882896"/>
-            <wp:docPr id="13" name="Picture 13"/>
+            <wp:docPr id="19" name="Picture 19"/>
             <wp:cNvGraphicFramePr>
               <a:graphicFrameLocks noChangeAspect="1"/>
             </wp:cNvGraphicFramePr>
@@ -3606,7 +3945,7 @@
         <w:drawing>
           <wp:inline xmlns:a="http://schemas.openxmlformats.org/drawingml/2006/main" xmlns:pic="http://schemas.openxmlformats.org/drawingml/2006/picture">
             <wp:extent cx="8138160" cy="4882896"/>
-            <wp:docPr id="14" name="Picture 14"/>
+            <wp:docPr id="20" name="Picture 20"/>
             <wp:cNvGraphicFramePr>
               <a:graphicFrameLocks noChangeAspect="1"/>
             </wp:cNvGraphicFramePr>
@@ -3722,7 +4061,7 @@
         <w:drawing>
           <wp:inline xmlns:a="http://schemas.openxmlformats.org/drawingml/2006/main" xmlns:pic="http://schemas.openxmlformats.org/drawingml/2006/picture">
             <wp:extent cx="8138160" cy="4882896"/>
-            <wp:docPr id="15" name="Picture 15"/>
+            <wp:docPr id="21" name="Picture 21"/>
             <wp:cNvGraphicFramePr>
               <a:graphicFrameLocks noChangeAspect="1"/>
             </wp:cNvGraphicFramePr>
@@ -3775,7 +4114,7 @@
         <w:drawing>
           <wp:inline xmlns:a="http://schemas.openxmlformats.org/drawingml/2006/main" xmlns:pic="http://schemas.openxmlformats.org/drawingml/2006/picture">
             <wp:extent cx="8138160" cy="4882896"/>
-            <wp:docPr id="16" name="Picture 16"/>
+            <wp:docPr id="22" name="Picture 22"/>
             <wp:cNvGraphicFramePr>
               <a:graphicFrameLocks noChangeAspect="1"/>
             </wp:cNvGraphicFramePr>
@@ -4242,7 +4581,7 @@
         <w:drawing>
           <wp:inline xmlns:a="http://schemas.openxmlformats.org/drawingml/2006/main" xmlns:pic="http://schemas.openxmlformats.org/drawingml/2006/picture">
             <wp:extent cx="8138160" cy="4882896"/>
-            <wp:docPr id="17" name="Picture 17"/>
+            <wp:docPr id="23" name="Picture 23"/>
             <wp:cNvGraphicFramePr>
               <a:graphicFrameLocks noChangeAspect="1"/>
             </wp:cNvGraphicFramePr>
@@ -4316,7 +4655,7 @@
         <w:drawing>
           <wp:inline xmlns:a="http://schemas.openxmlformats.org/drawingml/2006/main" xmlns:pic="http://schemas.openxmlformats.org/drawingml/2006/picture">
             <wp:extent cx="8138160" cy="4882896"/>
-            <wp:docPr id="18" name="Picture 18"/>
+            <wp:docPr id="24" name="Picture 24"/>
             <wp:cNvGraphicFramePr>
               <a:graphicFrameLocks noChangeAspect="1"/>
             </wp:cNvGraphicFramePr>
@@ -4390,7 +4729,7 @@
         <w:drawing>
           <wp:inline xmlns:a="http://schemas.openxmlformats.org/drawingml/2006/main" xmlns:pic="http://schemas.openxmlformats.org/drawingml/2006/picture">
             <wp:extent cx="8138160" cy="4882896"/>
-            <wp:docPr id="19" name="Picture 19"/>
+            <wp:docPr id="25" name="Picture 25"/>
             <wp:cNvGraphicFramePr>
               <a:graphicFrameLocks noChangeAspect="1"/>
             </wp:cNvGraphicFramePr>
@@ -4494,7 +4833,7 @@
         <w:drawing>
           <wp:inline xmlns:a="http://schemas.openxmlformats.org/drawingml/2006/main" xmlns:pic="http://schemas.openxmlformats.org/drawingml/2006/picture">
             <wp:extent cx="8138160" cy="4882896"/>
-            <wp:docPr id="20" name="Picture 20"/>
+            <wp:docPr id="26" name="Picture 26"/>
             <wp:cNvGraphicFramePr>
               <a:graphicFrameLocks noChangeAspect="1"/>
             </wp:cNvGraphicFramePr>
@@ -4568,7 +4907,7 @@
         <w:drawing>
           <wp:inline xmlns:a="http://schemas.openxmlformats.org/drawingml/2006/main" xmlns:pic="http://schemas.openxmlformats.org/drawingml/2006/picture">
             <wp:extent cx="8138160" cy="4882896"/>
-            <wp:docPr id="21" name="Picture 21"/>
+            <wp:docPr id="27" name="Picture 27"/>
             <wp:cNvGraphicFramePr>
               <a:graphicFrameLocks noChangeAspect="1"/>
             </wp:cNvGraphicFramePr>

</xml_diff>

<commit_message>
docs: set user manual to A4 format
</commit_message>
<xml_diff>
--- a/work/docs/manual-usuario-escala-inteligente.docx
+++ b/work/docs/manual-usuario-escala-inteligente.docx
@@ -73,12 +73,12 @@
         <w:tblLook w:firstColumn="1" w:firstRow="1" w:lastColumn="0" w:lastRow="0" w:noHBand="0" w:noVBand="1" w:val="04A0"/>
       </w:tblPr>
       <w:tblGrid>
-        <w:gridCol w:w="14112"/>
+        <w:gridCol w:w="15106"/>
       </w:tblGrid>
       <w:tr>
         <w:tc>
           <w:tcPr>
-            <w:tcW w:type="dxa" w:w="14112"/>
+            <w:tcW w:type="dxa" w:w="15106"/>
             <w:shd w:fill="F8FAFC"/>
             <w:tcBorders>
               <w:top w:val="single" w:sz="4" w:space="0" w:color="BFDBFE"/>
@@ -372,14 +372,14 @@
         <w:tblLook w:firstColumn="1" w:firstRow="1" w:lastColumn="0" w:lastRow="0" w:noHBand="0" w:noVBand="1" w:val="04A0"/>
       </w:tblPr>
       <w:tblGrid>
-        <w:gridCol w:w="4704"/>
-        <w:gridCol w:w="4704"/>
-        <w:gridCol w:w="4704"/>
+        <w:gridCol w:w="5035"/>
+        <w:gridCol w:w="5035"/>
+        <w:gridCol w:w="5035"/>
       </w:tblGrid>
       <w:tr>
         <w:tc>
           <w:tcPr>
-            <w:tcW w:type="dxa" w:w="4704"/>
+            <w:tcW w:type="dxa" w:w="5035"/>
             <w:vAlign w:val="center"/>
             <w:tcBorders>
               <w:top w:val="single" w:sz="4" w:space="0" w:color="CBD5E1"/>
@@ -406,7 +406,7 @@
         </w:tc>
         <w:tc>
           <w:tcPr>
-            <w:tcW w:type="dxa" w:w="4704"/>
+            <w:tcW w:type="dxa" w:w="5035"/>
             <w:vAlign w:val="center"/>
             <w:tcBorders>
               <w:top w:val="single" w:sz="4" w:space="0" w:color="CBD5E1"/>
@@ -433,7 +433,7 @@
         </w:tc>
         <w:tc>
           <w:tcPr>
-            <w:tcW w:type="dxa" w:w="4704"/>
+            <w:tcW w:type="dxa" w:w="5035"/>
             <w:vAlign w:val="center"/>
             <w:tcBorders>
               <w:top w:val="single" w:sz="4" w:space="0" w:color="CBD5E1"/>
@@ -462,7 +462,7 @@
       <w:tr>
         <w:tc>
           <w:tcPr>
-            <w:tcW w:type="dxa" w:w="4704"/>
+            <w:tcW w:type="dxa" w:w="5035"/>
             <w:vAlign w:val="center"/>
             <w:tcBorders>
               <w:top w:val="single" w:sz="4" w:space="0" w:color="CBD5E1"/>
@@ -486,7 +486,7 @@
         </w:tc>
         <w:tc>
           <w:tcPr>
-            <w:tcW w:type="dxa" w:w="4704"/>
+            <w:tcW w:type="dxa" w:w="5035"/>
             <w:vAlign w:val="center"/>
             <w:tcBorders>
               <w:top w:val="single" w:sz="4" w:space="0" w:color="CBD5E1"/>
@@ -510,7 +510,7 @@
         </w:tc>
         <w:tc>
           <w:tcPr>
-            <w:tcW w:type="dxa" w:w="4704"/>
+            <w:tcW w:type="dxa" w:w="5035"/>
             <w:vAlign w:val="center"/>
             <w:tcBorders>
               <w:top w:val="single" w:sz="4" w:space="0" w:color="CBD5E1"/>
@@ -536,7 +536,7 @@
       <w:tr>
         <w:tc>
           <w:tcPr>
-            <w:tcW w:type="dxa" w:w="4704"/>
+            <w:tcW w:type="dxa" w:w="5035"/>
             <w:vAlign w:val="center"/>
             <w:tcBorders>
               <w:top w:val="single" w:sz="4" w:space="0" w:color="CBD5E1"/>
@@ -560,7 +560,7 @@
         </w:tc>
         <w:tc>
           <w:tcPr>
-            <w:tcW w:type="dxa" w:w="4704"/>
+            <w:tcW w:type="dxa" w:w="5035"/>
             <w:vAlign w:val="center"/>
             <w:tcBorders>
               <w:top w:val="single" w:sz="4" w:space="0" w:color="CBD5E1"/>
@@ -584,7 +584,7 @@
         </w:tc>
         <w:tc>
           <w:tcPr>
-            <w:tcW w:type="dxa" w:w="4704"/>
+            <w:tcW w:type="dxa" w:w="5035"/>
             <w:vAlign w:val="center"/>
             <w:tcBorders>
               <w:top w:val="single" w:sz="4" w:space="0" w:color="CBD5E1"/>
@@ -610,7 +610,7 @@
       <w:tr>
         <w:tc>
           <w:tcPr>
-            <w:tcW w:type="dxa" w:w="4704"/>
+            <w:tcW w:type="dxa" w:w="5035"/>
             <w:vAlign w:val="center"/>
             <w:tcBorders>
               <w:top w:val="single" w:sz="4" w:space="0" w:color="CBD5E1"/>
@@ -634,7 +634,7 @@
         </w:tc>
         <w:tc>
           <w:tcPr>
-            <w:tcW w:type="dxa" w:w="4704"/>
+            <w:tcW w:type="dxa" w:w="5035"/>
             <w:vAlign w:val="center"/>
             <w:tcBorders>
               <w:top w:val="single" w:sz="4" w:space="0" w:color="CBD5E1"/>
@@ -658,7 +658,7 @@
         </w:tc>
         <w:tc>
           <w:tcPr>
-            <w:tcW w:type="dxa" w:w="4704"/>
+            <w:tcW w:type="dxa" w:w="5035"/>
             <w:vAlign w:val="center"/>
             <w:tcBorders>
               <w:top w:val="single" w:sz="4" w:space="0" w:color="CBD5E1"/>
@@ -684,7 +684,7 @@
       <w:tr>
         <w:tc>
           <w:tcPr>
-            <w:tcW w:type="dxa" w:w="4704"/>
+            <w:tcW w:type="dxa" w:w="5035"/>
             <w:vAlign w:val="center"/>
             <w:tcBorders>
               <w:top w:val="single" w:sz="4" w:space="0" w:color="CBD5E1"/>
@@ -708,7 +708,7 @@
         </w:tc>
         <w:tc>
           <w:tcPr>
-            <w:tcW w:type="dxa" w:w="4704"/>
+            <w:tcW w:type="dxa" w:w="5035"/>
             <w:vAlign w:val="center"/>
             <w:tcBorders>
               <w:top w:val="single" w:sz="4" w:space="0" w:color="CBD5E1"/>
@@ -732,7 +732,7 @@
         </w:tc>
         <w:tc>
           <w:tcPr>
-            <w:tcW w:type="dxa" w:w="4704"/>
+            <w:tcW w:type="dxa" w:w="5035"/>
             <w:vAlign w:val="center"/>
             <w:tcBorders>
               <w:top w:val="single" w:sz="4" w:space="0" w:color="CBD5E1"/>
@@ -758,7 +758,7 @@
       <w:tr>
         <w:tc>
           <w:tcPr>
-            <w:tcW w:type="dxa" w:w="4704"/>
+            <w:tcW w:type="dxa" w:w="5035"/>
             <w:vAlign w:val="center"/>
             <w:tcBorders>
               <w:top w:val="single" w:sz="4" w:space="0" w:color="CBD5E1"/>
@@ -782,7 +782,7 @@
         </w:tc>
         <w:tc>
           <w:tcPr>
-            <w:tcW w:type="dxa" w:w="4704"/>
+            <w:tcW w:type="dxa" w:w="5035"/>
             <w:vAlign w:val="center"/>
             <w:tcBorders>
               <w:top w:val="single" w:sz="4" w:space="0" w:color="CBD5E1"/>
@@ -806,7 +806,7 @@
         </w:tc>
         <w:tc>
           <w:tcPr>
-            <w:tcW w:type="dxa" w:w="4704"/>
+            <w:tcW w:type="dxa" w:w="5035"/>
             <w:vAlign w:val="center"/>
             <w:tcBorders>
               <w:top w:val="single" w:sz="4" w:space="0" w:color="CBD5E1"/>
@@ -832,7 +832,7 @@
       <w:tr>
         <w:tc>
           <w:tcPr>
-            <w:tcW w:type="dxa" w:w="4704"/>
+            <w:tcW w:type="dxa" w:w="5035"/>
             <w:vAlign w:val="center"/>
             <w:tcBorders>
               <w:top w:val="single" w:sz="4" w:space="0" w:color="CBD5E1"/>
@@ -856,7 +856,7 @@
         </w:tc>
         <w:tc>
           <w:tcPr>
-            <w:tcW w:type="dxa" w:w="4704"/>
+            <w:tcW w:type="dxa" w:w="5035"/>
             <w:vAlign w:val="center"/>
             <w:tcBorders>
               <w:top w:val="single" w:sz="4" w:space="0" w:color="CBD5E1"/>
@@ -880,7 +880,7 @@
         </w:tc>
         <w:tc>
           <w:tcPr>
-            <w:tcW w:type="dxa" w:w="4704"/>
+            <w:tcW w:type="dxa" w:w="5035"/>
             <w:vAlign w:val="center"/>
             <w:tcBorders>
               <w:top w:val="single" w:sz="4" w:space="0" w:color="CBD5E1"/>
@@ -906,7 +906,7 @@
       <w:tr>
         <w:tc>
           <w:tcPr>
-            <w:tcW w:type="dxa" w:w="4704"/>
+            <w:tcW w:type="dxa" w:w="5035"/>
             <w:vAlign w:val="center"/>
             <w:tcBorders>
               <w:top w:val="single" w:sz="4" w:space="0" w:color="CBD5E1"/>
@@ -930,7 +930,7 @@
         </w:tc>
         <w:tc>
           <w:tcPr>
-            <w:tcW w:type="dxa" w:w="4704"/>
+            <w:tcW w:type="dxa" w:w="5035"/>
             <w:vAlign w:val="center"/>
             <w:tcBorders>
               <w:top w:val="single" w:sz="4" w:space="0" w:color="CBD5E1"/>
@@ -954,7 +954,7 @@
         </w:tc>
         <w:tc>
           <w:tcPr>
-            <w:tcW w:type="dxa" w:w="4704"/>
+            <w:tcW w:type="dxa" w:w="5035"/>
             <w:vAlign w:val="center"/>
             <w:tcBorders>
               <w:top w:val="single" w:sz="4" w:space="0" w:color="CBD5E1"/>
@@ -980,7 +980,7 @@
       <w:tr>
         <w:tc>
           <w:tcPr>
-            <w:tcW w:type="dxa" w:w="4704"/>
+            <w:tcW w:type="dxa" w:w="5035"/>
             <w:vAlign w:val="center"/>
             <w:tcBorders>
               <w:top w:val="single" w:sz="4" w:space="0" w:color="CBD5E1"/>
@@ -1004,7 +1004,7 @@
         </w:tc>
         <w:tc>
           <w:tcPr>
-            <w:tcW w:type="dxa" w:w="4704"/>
+            <w:tcW w:type="dxa" w:w="5035"/>
             <w:vAlign w:val="center"/>
             <w:tcBorders>
               <w:top w:val="single" w:sz="4" w:space="0" w:color="CBD5E1"/>
@@ -1028,7 +1028,7 @@
         </w:tc>
         <w:tc>
           <w:tcPr>
-            <w:tcW w:type="dxa" w:w="4704"/>
+            <w:tcW w:type="dxa" w:w="5035"/>
             <w:vAlign w:val="center"/>
             <w:tcBorders>
               <w:top w:val="single" w:sz="4" w:space="0" w:color="CBD5E1"/>
@@ -1054,7 +1054,7 @@
       <w:tr>
         <w:tc>
           <w:tcPr>
-            <w:tcW w:type="dxa" w:w="4704"/>
+            <w:tcW w:type="dxa" w:w="5035"/>
             <w:vAlign w:val="center"/>
             <w:tcBorders>
               <w:top w:val="single" w:sz="4" w:space="0" w:color="CBD5E1"/>
@@ -1078,7 +1078,7 @@
         </w:tc>
         <w:tc>
           <w:tcPr>
-            <w:tcW w:type="dxa" w:w="4704"/>
+            <w:tcW w:type="dxa" w:w="5035"/>
             <w:vAlign w:val="center"/>
             <w:tcBorders>
               <w:top w:val="single" w:sz="4" w:space="0" w:color="CBD5E1"/>
@@ -1102,7 +1102,7 @@
         </w:tc>
         <w:tc>
           <w:tcPr>
-            <w:tcW w:type="dxa" w:w="4704"/>
+            <w:tcW w:type="dxa" w:w="5035"/>
             <w:vAlign w:val="center"/>
             <w:tcBorders>
               <w:top w:val="single" w:sz="4" w:space="0" w:color="CBD5E1"/>
@@ -1250,12 +1250,12 @@
         <w:tblLook w:firstColumn="1" w:firstRow="1" w:lastColumn="0" w:lastRow="0" w:noHBand="0" w:noVBand="1" w:val="04A0"/>
       </w:tblPr>
       <w:tblGrid>
-        <w:gridCol w:w="14112"/>
+        <w:gridCol w:w="15106"/>
       </w:tblGrid>
       <w:tr>
         <w:tc>
           <w:tcPr>
-            <w:tcW w:type="dxa" w:w="14112"/>
+            <w:tcW w:type="dxa" w:w="15106"/>
             <w:shd w:fill="F8FAFC"/>
             <w:tcBorders>
               <w:top w:val="single" w:sz="4" w:space="0" w:color="BFDBFE"/>
@@ -1638,14 +1638,14 @@
         <w:tblLook w:firstColumn="1" w:firstRow="1" w:lastColumn="0" w:lastRow="0" w:noHBand="0" w:noVBand="1" w:val="04A0"/>
       </w:tblPr>
       <w:tblGrid>
-        <w:gridCol w:w="4704"/>
-        <w:gridCol w:w="4704"/>
-        <w:gridCol w:w="4704"/>
+        <w:gridCol w:w="5035"/>
+        <w:gridCol w:w="5035"/>
+        <w:gridCol w:w="5035"/>
       </w:tblGrid>
       <w:tr>
         <w:tc>
           <w:tcPr>
-            <w:tcW w:type="dxa" w:w="4704"/>
+            <w:tcW w:type="dxa" w:w="5035"/>
             <w:vAlign w:val="center"/>
             <w:tcBorders>
               <w:top w:val="single" w:sz="4" w:space="0" w:color="CBD5E1"/>
@@ -1672,7 +1672,7 @@
         </w:tc>
         <w:tc>
           <w:tcPr>
-            <w:tcW w:type="dxa" w:w="4704"/>
+            <w:tcW w:type="dxa" w:w="5035"/>
             <w:vAlign w:val="center"/>
             <w:tcBorders>
               <w:top w:val="single" w:sz="4" w:space="0" w:color="CBD5E1"/>
@@ -1699,7 +1699,7 @@
         </w:tc>
         <w:tc>
           <w:tcPr>
-            <w:tcW w:type="dxa" w:w="4704"/>
+            <w:tcW w:type="dxa" w:w="5035"/>
             <w:vAlign w:val="center"/>
             <w:tcBorders>
               <w:top w:val="single" w:sz="4" w:space="0" w:color="CBD5E1"/>
@@ -1728,7 +1728,7 @@
       <w:tr>
         <w:tc>
           <w:tcPr>
-            <w:tcW w:type="dxa" w:w="4704"/>
+            <w:tcW w:type="dxa" w:w="5035"/>
             <w:vAlign w:val="center"/>
             <w:tcBorders>
               <w:top w:val="single" w:sz="4" w:space="0" w:color="CBD5E1"/>
@@ -1752,7 +1752,7 @@
         </w:tc>
         <w:tc>
           <w:tcPr>
-            <w:tcW w:type="dxa" w:w="4704"/>
+            <w:tcW w:type="dxa" w:w="5035"/>
             <w:vAlign w:val="center"/>
             <w:tcBorders>
               <w:top w:val="single" w:sz="4" w:space="0" w:color="CBD5E1"/>
@@ -1776,7 +1776,7 @@
         </w:tc>
         <w:tc>
           <w:tcPr>
-            <w:tcW w:type="dxa" w:w="4704"/>
+            <w:tcW w:type="dxa" w:w="5035"/>
             <w:vAlign w:val="center"/>
             <w:tcBorders>
               <w:top w:val="single" w:sz="4" w:space="0" w:color="CBD5E1"/>
@@ -1802,7 +1802,7 @@
       <w:tr>
         <w:tc>
           <w:tcPr>
-            <w:tcW w:type="dxa" w:w="4704"/>
+            <w:tcW w:type="dxa" w:w="5035"/>
             <w:vAlign w:val="center"/>
             <w:tcBorders>
               <w:top w:val="single" w:sz="4" w:space="0" w:color="CBD5E1"/>
@@ -1826,7 +1826,7 @@
         </w:tc>
         <w:tc>
           <w:tcPr>
-            <w:tcW w:type="dxa" w:w="4704"/>
+            <w:tcW w:type="dxa" w:w="5035"/>
             <w:vAlign w:val="center"/>
             <w:tcBorders>
               <w:top w:val="single" w:sz="4" w:space="0" w:color="CBD5E1"/>
@@ -1850,7 +1850,7 @@
         </w:tc>
         <w:tc>
           <w:tcPr>
-            <w:tcW w:type="dxa" w:w="4704"/>
+            <w:tcW w:type="dxa" w:w="5035"/>
             <w:vAlign w:val="center"/>
             <w:tcBorders>
               <w:top w:val="single" w:sz="4" w:space="0" w:color="CBD5E1"/>
@@ -1876,7 +1876,7 @@
       <w:tr>
         <w:tc>
           <w:tcPr>
-            <w:tcW w:type="dxa" w:w="4704"/>
+            <w:tcW w:type="dxa" w:w="5035"/>
             <w:vAlign w:val="center"/>
             <w:tcBorders>
               <w:top w:val="single" w:sz="4" w:space="0" w:color="CBD5E1"/>
@@ -1900,7 +1900,7 @@
         </w:tc>
         <w:tc>
           <w:tcPr>
-            <w:tcW w:type="dxa" w:w="4704"/>
+            <w:tcW w:type="dxa" w:w="5035"/>
             <w:vAlign w:val="center"/>
             <w:tcBorders>
               <w:top w:val="single" w:sz="4" w:space="0" w:color="CBD5E1"/>
@@ -1924,7 +1924,7 @@
         </w:tc>
         <w:tc>
           <w:tcPr>
-            <w:tcW w:type="dxa" w:w="4704"/>
+            <w:tcW w:type="dxa" w:w="5035"/>
             <w:vAlign w:val="center"/>
             <w:tcBorders>
               <w:top w:val="single" w:sz="4" w:space="0" w:color="CBD5E1"/>
@@ -1950,7 +1950,7 @@
       <w:tr>
         <w:tc>
           <w:tcPr>
-            <w:tcW w:type="dxa" w:w="4704"/>
+            <w:tcW w:type="dxa" w:w="5035"/>
             <w:vAlign w:val="center"/>
             <w:tcBorders>
               <w:top w:val="single" w:sz="4" w:space="0" w:color="CBD5E1"/>
@@ -1974,7 +1974,7 @@
         </w:tc>
         <w:tc>
           <w:tcPr>
-            <w:tcW w:type="dxa" w:w="4704"/>
+            <w:tcW w:type="dxa" w:w="5035"/>
             <w:vAlign w:val="center"/>
             <w:tcBorders>
               <w:top w:val="single" w:sz="4" w:space="0" w:color="CBD5E1"/>
@@ -1998,7 +1998,7 @@
         </w:tc>
         <w:tc>
           <w:tcPr>
-            <w:tcW w:type="dxa" w:w="4704"/>
+            <w:tcW w:type="dxa" w:w="5035"/>
             <w:vAlign w:val="center"/>
             <w:tcBorders>
               <w:top w:val="single" w:sz="4" w:space="0" w:color="CBD5E1"/>
@@ -2024,7 +2024,7 @@
       <w:tr>
         <w:tc>
           <w:tcPr>
-            <w:tcW w:type="dxa" w:w="4704"/>
+            <w:tcW w:type="dxa" w:w="5035"/>
             <w:vAlign w:val="center"/>
             <w:tcBorders>
               <w:top w:val="single" w:sz="4" w:space="0" w:color="CBD5E1"/>
@@ -2048,7 +2048,7 @@
         </w:tc>
         <w:tc>
           <w:tcPr>
-            <w:tcW w:type="dxa" w:w="4704"/>
+            <w:tcW w:type="dxa" w:w="5035"/>
             <w:vAlign w:val="center"/>
             <w:tcBorders>
               <w:top w:val="single" w:sz="4" w:space="0" w:color="CBD5E1"/>
@@ -2072,7 +2072,7 @@
         </w:tc>
         <w:tc>
           <w:tcPr>
-            <w:tcW w:type="dxa" w:w="4704"/>
+            <w:tcW w:type="dxa" w:w="5035"/>
             <w:vAlign w:val="center"/>
             <w:tcBorders>
               <w:top w:val="single" w:sz="4" w:space="0" w:color="CBD5E1"/>
@@ -2098,7 +2098,7 @@
       <w:tr>
         <w:tc>
           <w:tcPr>
-            <w:tcW w:type="dxa" w:w="4704"/>
+            <w:tcW w:type="dxa" w:w="5035"/>
             <w:vAlign w:val="center"/>
             <w:tcBorders>
               <w:top w:val="single" w:sz="4" w:space="0" w:color="CBD5E1"/>
@@ -2122,7 +2122,7 @@
         </w:tc>
         <w:tc>
           <w:tcPr>
-            <w:tcW w:type="dxa" w:w="4704"/>
+            <w:tcW w:type="dxa" w:w="5035"/>
             <w:vAlign w:val="center"/>
             <w:tcBorders>
               <w:top w:val="single" w:sz="4" w:space="0" w:color="CBD5E1"/>
@@ -2146,7 +2146,7 @@
         </w:tc>
         <w:tc>
           <w:tcPr>
-            <w:tcW w:type="dxa" w:w="4704"/>
+            <w:tcW w:type="dxa" w:w="5035"/>
             <w:vAlign w:val="center"/>
             <w:tcBorders>
               <w:top w:val="single" w:sz="4" w:space="0" w:color="CBD5E1"/>
@@ -2172,7 +2172,7 @@
       <w:tr>
         <w:tc>
           <w:tcPr>
-            <w:tcW w:type="dxa" w:w="4704"/>
+            <w:tcW w:type="dxa" w:w="5035"/>
             <w:vAlign w:val="center"/>
             <w:tcBorders>
               <w:top w:val="single" w:sz="4" w:space="0" w:color="CBD5E1"/>
@@ -2196,7 +2196,7 @@
         </w:tc>
         <w:tc>
           <w:tcPr>
-            <w:tcW w:type="dxa" w:w="4704"/>
+            <w:tcW w:type="dxa" w:w="5035"/>
             <w:vAlign w:val="center"/>
             <w:tcBorders>
               <w:top w:val="single" w:sz="4" w:space="0" w:color="CBD5E1"/>
@@ -2220,7 +2220,7 @@
         </w:tc>
         <w:tc>
           <w:tcPr>
-            <w:tcW w:type="dxa" w:w="4704"/>
+            <w:tcW w:type="dxa" w:w="5035"/>
             <w:vAlign w:val="center"/>
             <w:tcBorders>
               <w:top w:val="single" w:sz="4" w:space="0" w:color="CBD5E1"/>
@@ -2246,7 +2246,7 @@
       <w:tr>
         <w:tc>
           <w:tcPr>
-            <w:tcW w:type="dxa" w:w="4704"/>
+            <w:tcW w:type="dxa" w:w="5035"/>
             <w:vAlign w:val="center"/>
             <w:tcBorders>
               <w:top w:val="single" w:sz="4" w:space="0" w:color="CBD5E1"/>
@@ -2270,7 +2270,7 @@
         </w:tc>
         <w:tc>
           <w:tcPr>
-            <w:tcW w:type="dxa" w:w="4704"/>
+            <w:tcW w:type="dxa" w:w="5035"/>
             <w:vAlign w:val="center"/>
             <w:tcBorders>
               <w:top w:val="single" w:sz="4" w:space="0" w:color="CBD5E1"/>
@@ -2294,7 +2294,7 @@
         </w:tc>
         <w:tc>
           <w:tcPr>
-            <w:tcW w:type="dxa" w:w="4704"/>
+            <w:tcW w:type="dxa" w:w="5035"/>
             <w:vAlign w:val="center"/>
             <w:tcBorders>
               <w:top w:val="single" w:sz="4" w:space="0" w:color="CBD5E1"/>
@@ -2320,7 +2320,7 @@
       <w:tr>
         <w:tc>
           <w:tcPr>
-            <w:tcW w:type="dxa" w:w="4704"/>
+            <w:tcW w:type="dxa" w:w="5035"/>
             <w:vAlign w:val="center"/>
             <w:tcBorders>
               <w:top w:val="single" w:sz="4" w:space="0" w:color="CBD5E1"/>
@@ -2344,7 +2344,7 @@
         </w:tc>
         <w:tc>
           <w:tcPr>
-            <w:tcW w:type="dxa" w:w="4704"/>
+            <w:tcW w:type="dxa" w:w="5035"/>
             <w:vAlign w:val="center"/>
             <w:tcBorders>
               <w:top w:val="single" w:sz="4" w:space="0" w:color="CBD5E1"/>
@@ -2368,7 +2368,7 @@
         </w:tc>
         <w:tc>
           <w:tcPr>
-            <w:tcW w:type="dxa" w:w="4704"/>
+            <w:tcW w:type="dxa" w:w="5035"/>
             <w:vAlign w:val="center"/>
             <w:tcBorders>
               <w:top w:val="single" w:sz="4" w:space="0" w:color="CBD5E1"/>
@@ -2394,7 +2394,7 @@
       <w:tr>
         <w:tc>
           <w:tcPr>
-            <w:tcW w:type="dxa" w:w="4704"/>
+            <w:tcW w:type="dxa" w:w="5035"/>
             <w:vAlign w:val="center"/>
             <w:tcBorders>
               <w:top w:val="single" w:sz="4" w:space="0" w:color="CBD5E1"/>
@@ -2418,7 +2418,7 @@
         </w:tc>
         <w:tc>
           <w:tcPr>
-            <w:tcW w:type="dxa" w:w="4704"/>
+            <w:tcW w:type="dxa" w:w="5035"/>
             <w:vAlign w:val="center"/>
             <w:tcBorders>
               <w:top w:val="single" w:sz="4" w:space="0" w:color="CBD5E1"/>
@@ -2442,7 +2442,7 @@
         </w:tc>
         <w:tc>
           <w:tcPr>
-            <w:tcW w:type="dxa" w:w="4704"/>
+            <w:tcW w:type="dxa" w:w="5035"/>
             <w:vAlign w:val="center"/>
             <w:tcBorders>
               <w:top w:val="single" w:sz="4" w:space="0" w:color="CBD5E1"/>
@@ -2468,7 +2468,7 @@
       <w:tr>
         <w:tc>
           <w:tcPr>
-            <w:tcW w:type="dxa" w:w="4704"/>
+            <w:tcW w:type="dxa" w:w="5035"/>
             <w:vAlign w:val="center"/>
             <w:tcBorders>
               <w:top w:val="single" w:sz="4" w:space="0" w:color="CBD5E1"/>
@@ -2492,7 +2492,7 @@
         </w:tc>
         <w:tc>
           <w:tcPr>
-            <w:tcW w:type="dxa" w:w="4704"/>
+            <w:tcW w:type="dxa" w:w="5035"/>
             <w:vAlign w:val="center"/>
             <w:tcBorders>
               <w:top w:val="single" w:sz="4" w:space="0" w:color="CBD5E1"/>
@@ -2516,7 +2516,7 @@
         </w:tc>
         <w:tc>
           <w:tcPr>
-            <w:tcW w:type="dxa" w:w="4704"/>
+            <w:tcW w:type="dxa" w:w="5035"/>
             <w:vAlign w:val="center"/>
             <w:tcBorders>
               <w:top w:val="single" w:sz="4" w:space="0" w:color="CBD5E1"/>
@@ -2542,7 +2542,7 @@
       <w:tr>
         <w:tc>
           <w:tcPr>
-            <w:tcW w:type="dxa" w:w="4704"/>
+            <w:tcW w:type="dxa" w:w="5035"/>
             <w:vAlign w:val="center"/>
             <w:tcBorders>
               <w:top w:val="single" w:sz="4" w:space="0" w:color="CBD5E1"/>
@@ -2566,7 +2566,7 @@
         </w:tc>
         <w:tc>
           <w:tcPr>
-            <w:tcW w:type="dxa" w:w="4704"/>
+            <w:tcW w:type="dxa" w:w="5035"/>
             <w:vAlign w:val="center"/>
             <w:tcBorders>
               <w:top w:val="single" w:sz="4" w:space="0" w:color="CBD5E1"/>
@@ -2590,7 +2590,7 @@
         </w:tc>
         <w:tc>
           <w:tcPr>
-            <w:tcW w:type="dxa" w:w="4704"/>
+            <w:tcW w:type="dxa" w:w="5035"/>
             <w:vAlign w:val="center"/>
             <w:tcBorders>
               <w:top w:val="single" w:sz="4" w:space="0" w:color="CBD5E1"/>
@@ -2616,7 +2616,7 @@
       <w:tr>
         <w:tc>
           <w:tcPr>
-            <w:tcW w:type="dxa" w:w="4704"/>
+            <w:tcW w:type="dxa" w:w="5035"/>
             <w:vAlign w:val="center"/>
             <w:tcBorders>
               <w:top w:val="single" w:sz="4" w:space="0" w:color="CBD5E1"/>
@@ -2640,7 +2640,7 @@
         </w:tc>
         <w:tc>
           <w:tcPr>
-            <w:tcW w:type="dxa" w:w="4704"/>
+            <w:tcW w:type="dxa" w:w="5035"/>
             <w:vAlign w:val="center"/>
             <w:tcBorders>
               <w:top w:val="single" w:sz="4" w:space="0" w:color="CBD5E1"/>
@@ -2664,7 +2664,7 @@
         </w:tc>
         <w:tc>
           <w:tcPr>
-            <w:tcW w:type="dxa" w:w="4704"/>
+            <w:tcW w:type="dxa" w:w="5035"/>
             <w:vAlign w:val="center"/>
             <w:tcBorders>
               <w:top w:val="single" w:sz="4" w:space="0" w:color="CBD5E1"/>
@@ -2690,7 +2690,7 @@
       <w:tr>
         <w:tc>
           <w:tcPr>
-            <w:tcW w:type="dxa" w:w="4704"/>
+            <w:tcW w:type="dxa" w:w="5035"/>
             <w:vAlign w:val="center"/>
             <w:tcBorders>
               <w:top w:val="single" w:sz="4" w:space="0" w:color="CBD5E1"/>
@@ -2714,7 +2714,7 @@
         </w:tc>
         <w:tc>
           <w:tcPr>
-            <w:tcW w:type="dxa" w:w="4704"/>
+            <w:tcW w:type="dxa" w:w="5035"/>
             <w:vAlign w:val="center"/>
             <w:tcBorders>
               <w:top w:val="single" w:sz="4" w:space="0" w:color="CBD5E1"/>
@@ -2738,7 +2738,7 @@
         </w:tc>
         <w:tc>
           <w:tcPr>
-            <w:tcW w:type="dxa" w:w="4704"/>
+            <w:tcW w:type="dxa" w:w="5035"/>
             <w:vAlign w:val="center"/>
             <w:tcBorders>
               <w:top w:val="single" w:sz="4" w:space="0" w:color="CBD5E1"/>
@@ -3298,14 +3298,14 @@
         <w:tblLook w:firstColumn="1" w:firstRow="1" w:lastColumn="0" w:lastRow="0" w:noHBand="0" w:noVBand="1" w:val="04A0"/>
       </w:tblPr>
       <w:tblGrid>
-        <w:gridCol w:w="4704"/>
-        <w:gridCol w:w="4704"/>
-        <w:gridCol w:w="4704"/>
+        <w:gridCol w:w="5035"/>
+        <w:gridCol w:w="5035"/>
+        <w:gridCol w:w="5035"/>
       </w:tblGrid>
       <w:tr>
         <w:tc>
           <w:tcPr>
-            <w:tcW w:type="dxa" w:w="4704"/>
+            <w:tcW w:type="dxa" w:w="5035"/>
             <w:vAlign w:val="center"/>
             <w:tcBorders>
               <w:top w:val="single" w:sz="4" w:space="0" w:color="CBD5E1"/>
@@ -3332,7 +3332,7 @@
         </w:tc>
         <w:tc>
           <w:tcPr>
-            <w:tcW w:type="dxa" w:w="4704"/>
+            <w:tcW w:type="dxa" w:w="5035"/>
             <w:vAlign w:val="center"/>
             <w:tcBorders>
               <w:top w:val="single" w:sz="4" w:space="0" w:color="CBD5E1"/>
@@ -3359,7 +3359,7 @@
         </w:tc>
         <w:tc>
           <w:tcPr>
-            <w:tcW w:type="dxa" w:w="4704"/>
+            <w:tcW w:type="dxa" w:w="5035"/>
             <w:vAlign w:val="center"/>
             <w:tcBorders>
               <w:top w:val="single" w:sz="4" w:space="0" w:color="CBD5E1"/>
@@ -3388,7 +3388,7 @@
       <w:tr>
         <w:tc>
           <w:tcPr>
-            <w:tcW w:type="dxa" w:w="4704"/>
+            <w:tcW w:type="dxa" w:w="5035"/>
             <w:vAlign w:val="center"/>
             <w:tcBorders>
               <w:top w:val="single" w:sz="4" w:space="0" w:color="CBD5E1"/>
@@ -3412,7 +3412,7 @@
         </w:tc>
         <w:tc>
           <w:tcPr>
-            <w:tcW w:type="dxa" w:w="4704"/>
+            <w:tcW w:type="dxa" w:w="5035"/>
             <w:vAlign w:val="center"/>
             <w:tcBorders>
               <w:top w:val="single" w:sz="4" w:space="0" w:color="CBD5E1"/>
@@ -3436,7 +3436,7 @@
         </w:tc>
         <w:tc>
           <w:tcPr>
-            <w:tcW w:type="dxa" w:w="4704"/>
+            <w:tcW w:type="dxa" w:w="5035"/>
             <w:vAlign w:val="center"/>
             <w:tcBorders>
               <w:top w:val="single" w:sz="4" w:space="0" w:color="CBD5E1"/>
@@ -3462,7 +3462,7 @@
       <w:tr>
         <w:tc>
           <w:tcPr>
-            <w:tcW w:type="dxa" w:w="4704"/>
+            <w:tcW w:type="dxa" w:w="5035"/>
             <w:vAlign w:val="center"/>
             <w:tcBorders>
               <w:top w:val="single" w:sz="4" w:space="0" w:color="CBD5E1"/>
@@ -3486,7 +3486,7 @@
         </w:tc>
         <w:tc>
           <w:tcPr>
-            <w:tcW w:type="dxa" w:w="4704"/>
+            <w:tcW w:type="dxa" w:w="5035"/>
             <w:vAlign w:val="center"/>
             <w:tcBorders>
               <w:top w:val="single" w:sz="4" w:space="0" w:color="CBD5E1"/>
@@ -3510,7 +3510,7 @@
         </w:tc>
         <w:tc>
           <w:tcPr>
-            <w:tcW w:type="dxa" w:w="4704"/>
+            <w:tcW w:type="dxa" w:w="5035"/>
             <w:vAlign w:val="center"/>
             <w:tcBorders>
               <w:top w:val="single" w:sz="4" w:space="0" w:color="CBD5E1"/>
@@ -3536,7 +3536,7 @@
       <w:tr>
         <w:tc>
           <w:tcPr>
-            <w:tcW w:type="dxa" w:w="4704"/>
+            <w:tcW w:type="dxa" w:w="5035"/>
             <w:vAlign w:val="center"/>
             <w:tcBorders>
               <w:top w:val="single" w:sz="4" w:space="0" w:color="CBD5E1"/>
@@ -3560,7 +3560,7 @@
         </w:tc>
         <w:tc>
           <w:tcPr>
-            <w:tcW w:type="dxa" w:w="4704"/>
+            <w:tcW w:type="dxa" w:w="5035"/>
             <w:vAlign w:val="center"/>
             <w:tcBorders>
               <w:top w:val="single" w:sz="4" w:space="0" w:color="CBD5E1"/>
@@ -3584,7 +3584,7 @@
         </w:tc>
         <w:tc>
           <w:tcPr>
-            <w:tcW w:type="dxa" w:w="4704"/>
+            <w:tcW w:type="dxa" w:w="5035"/>
             <w:vAlign w:val="center"/>
             <w:tcBorders>
               <w:top w:val="single" w:sz="4" w:space="0" w:color="CBD5E1"/>
@@ -3610,7 +3610,7 @@
       <w:tr>
         <w:tc>
           <w:tcPr>
-            <w:tcW w:type="dxa" w:w="4704"/>
+            <w:tcW w:type="dxa" w:w="5035"/>
             <w:vAlign w:val="center"/>
             <w:tcBorders>
               <w:top w:val="single" w:sz="4" w:space="0" w:color="CBD5E1"/>
@@ -3634,7 +3634,7 @@
         </w:tc>
         <w:tc>
           <w:tcPr>
-            <w:tcW w:type="dxa" w:w="4704"/>
+            <w:tcW w:type="dxa" w:w="5035"/>
             <w:vAlign w:val="center"/>
             <w:tcBorders>
               <w:top w:val="single" w:sz="4" w:space="0" w:color="CBD5E1"/>
@@ -3658,7 +3658,7 @@
         </w:tc>
         <w:tc>
           <w:tcPr>
-            <w:tcW w:type="dxa" w:w="4704"/>
+            <w:tcW w:type="dxa" w:w="5035"/>
             <w:vAlign w:val="center"/>
             <w:tcBorders>
               <w:top w:val="single" w:sz="4" w:space="0" w:color="CBD5E1"/>
@@ -3684,7 +3684,7 @@
       <w:tr>
         <w:tc>
           <w:tcPr>
-            <w:tcW w:type="dxa" w:w="4704"/>
+            <w:tcW w:type="dxa" w:w="5035"/>
             <w:vAlign w:val="center"/>
             <w:tcBorders>
               <w:top w:val="single" w:sz="4" w:space="0" w:color="CBD5E1"/>
@@ -3708,7 +3708,7 @@
         </w:tc>
         <w:tc>
           <w:tcPr>
-            <w:tcW w:type="dxa" w:w="4704"/>
+            <w:tcW w:type="dxa" w:w="5035"/>
             <w:vAlign w:val="center"/>
             <w:tcBorders>
               <w:top w:val="single" w:sz="4" w:space="0" w:color="CBD5E1"/>
@@ -3732,7 +3732,7 @@
         </w:tc>
         <w:tc>
           <w:tcPr>
-            <w:tcW w:type="dxa" w:w="4704"/>
+            <w:tcW w:type="dxa" w:w="5035"/>
             <w:vAlign w:val="center"/>
             <w:tcBorders>
               <w:top w:val="single" w:sz="4" w:space="0" w:color="CBD5E1"/>
@@ -4175,14 +4175,14 @@
         <w:tblLook w:firstColumn="1" w:firstRow="1" w:lastColumn="0" w:lastRow="0" w:noHBand="0" w:noVBand="1" w:val="04A0"/>
       </w:tblPr>
       <w:tblGrid>
-        <w:gridCol w:w="4704"/>
-        <w:gridCol w:w="4704"/>
-        <w:gridCol w:w="4704"/>
+        <w:gridCol w:w="5035"/>
+        <w:gridCol w:w="5035"/>
+        <w:gridCol w:w="5035"/>
       </w:tblGrid>
       <w:tr>
         <w:tc>
           <w:tcPr>
-            <w:tcW w:type="dxa" w:w="4704"/>
+            <w:tcW w:type="dxa" w:w="5035"/>
             <w:vAlign w:val="center"/>
             <w:tcBorders>
               <w:top w:val="single" w:sz="4" w:space="0" w:color="CBD5E1"/>
@@ -4209,7 +4209,7 @@
         </w:tc>
         <w:tc>
           <w:tcPr>
-            <w:tcW w:type="dxa" w:w="4704"/>
+            <w:tcW w:type="dxa" w:w="5035"/>
             <w:vAlign w:val="center"/>
             <w:tcBorders>
               <w:top w:val="single" w:sz="4" w:space="0" w:color="CBD5E1"/>
@@ -4236,7 +4236,7 @@
         </w:tc>
         <w:tc>
           <w:tcPr>
-            <w:tcW w:type="dxa" w:w="4704"/>
+            <w:tcW w:type="dxa" w:w="5035"/>
             <w:vAlign w:val="center"/>
             <w:tcBorders>
               <w:top w:val="single" w:sz="4" w:space="0" w:color="CBD5E1"/>
@@ -4265,7 +4265,7 @@
       <w:tr>
         <w:tc>
           <w:tcPr>
-            <w:tcW w:type="dxa" w:w="4704"/>
+            <w:tcW w:type="dxa" w:w="5035"/>
             <w:vAlign w:val="center"/>
             <w:tcBorders>
               <w:top w:val="single" w:sz="4" w:space="0" w:color="CBD5E1"/>
@@ -4289,7 +4289,7 @@
         </w:tc>
         <w:tc>
           <w:tcPr>
-            <w:tcW w:type="dxa" w:w="4704"/>
+            <w:tcW w:type="dxa" w:w="5035"/>
             <w:vAlign w:val="center"/>
             <w:tcBorders>
               <w:top w:val="single" w:sz="4" w:space="0" w:color="CBD5E1"/>
@@ -4313,7 +4313,7 @@
         </w:tc>
         <w:tc>
           <w:tcPr>
-            <w:tcW w:type="dxa" w:w="4704"/>
+            <w:tcW w:type="dxa" w:w="5035"/>
             <w:vAlign w:val="center"/>
             <w:tcBorders>
               <w:top w:val="single" w:sz="4" w:space="0" w:color="CBD5E1"/>
@@ -4339,7 +4339,7 @@
       <w:tr>
         <w:tc>
           <w:tcPr>
-            <w:tcW w:type="dxa" w:w="4704"/>
+            <w:tcW w:type="dxa" w:w="5035"/>
             <w:vAlign w:val="center"/>
             <w:tcBorders>
               <w:top w:val="single" w:sz="4" w:space="0" w:color="CBD5E1"/>
@@ -4363,7 +4363,7 @@
         </w:tc>
         <w:tc>
           <w:tcPr>
-            <w:tcW w:type="dxa" w:w="4704"/>
+            <w:tcW w:type="dxa" w:w="5035"/>
             <w:vAlign w:val="center"/>
             <w:tcBorders>
               <w:top w:val="single" w:sz="4" w:space="0" w:color="CBD5E1"/>
@@ -4387,7 +4387,7 @@
         </w:tc>
         <w:tc>
           <w:tcPr>
-            <w:tcW w:type="dxa" w:w="4704"/>
+            <w:tcW w:type="dxa" w:w="5035"/>
             <w:vAlign w:val="center"/>
             <w:tcBorders>
               <w:top w:val="single" w:sz="4" w:space="0" w:color="CBD5E1"/>
@@ -4413,7 +4413,7 @@
       <w:tr>
         <w:tc>
           <w:tcPr>
-            <w:tcW w:type="dxa" w:w="4704"/>
+            <w:tcW w:type="dxa" w:w="5035"/>
             <w:vAlign w:val="center"/>
             <w:tcBorders>
               <w:top w:val="single" w:sz="4" w:space="0" w:color="CBD5E1"/>
@@ -4437,7 +4437,7 @@
         </w:tc>
         <w:tc>
           <w:tcPr>
-            <w:tcW w:type="dxa" w:w="4704"/>
+            <w:tcW w:type="dxa" w:w="5035"/>
             <w:vAlign w:val="center"/>
             <w:tcBorders>
               <w:top w:val="single" w:sz="4" w:space="0" w:color="CBD5E1"/>
@@ -4461,7 +4461,7 @@
         </w:tc>
         <w:tc>
           <w:tcPr>
-            <w:tcW w:type="dxa" w:w="4704"/>
+            <w:tcW w:type="dxa" w:w="5035"/>
             <w:vAlign w:val="center"/>
             <w:tcBorders>
               <w:top w:val="single" w:sz="4" w:space="0" w:color="CBD5E1"/>
@@ -4487,7 +4487,7 @@
       <w:tr>
         <w:tc>
           <w:tcPr>
-            <w:tcW w:type="dxa" w:w="4704"/>
+            <w:tcW w:type="dxa" w:w="5035"/>
             <w:vAlign w:val="center"/>
             <w:tcBorders>
               <w:top w:val="single" w:sz="4" w:space="0" w:color="CBD5E1"/>
@@ -4511,7 +4511,7 @@
         </w:tc>
         <w:tc>
           <w:tcPr>
-            <w:tcW w:type="dxa" w:w="4704"/>
+            <w:tcW w:type="dxa" w:w="5035"/>
             <w:vAlign w:val="center"/>
             <w:tcBorders>
               <w:top w:val="single" w:sz="4" w:space="0" w:color="CBD5E1"/>
@@ -4535,7 +4535,7 @@
         </w:tc>
         <w:tc>
           <w:tcPr>
-            <w:tcW w:type="dxa" w:w="4704"/>
+            <w:tcW w:type="dxa" w:w="5035"/>
             <w:vAlign w:val="center"/>
             <w:tcBorders>
               <w:top w:val="single" w:sz="4" w:space="0" w:color="CBD5E1"/>
@@ -5053,13 +5053,13 @@
         <w:tblLook w:firstColumn="1" w:firstRow="1" w:lastColumn="0" w:lastRow="0" w:noHBand="0" w:noVBand="1" w:val="04A0"/>
       </w:tblPr>
       <w:tblGrid>
-        <w:gridCol w:w="7056"/>
-        <w:gridCol w:w="7056"/>
+        <w:gridCol w:w="7553"/>
+        <w:gridCol w:w="7553"/>
       </w:tblGrid>
       <w:tr>
         <w:tc>
           <w:tcPr>
-            <w:tcW w:type="dxa" w:w="7056"/>
+            <w:tcW w:type="dxa" w:w="7553"/>
             <w:vAlign w:val="center"/>
             <w:tcBorders>
               <w:top w:val="single" w:sz="4" w:space="0" w:color="CBD5E1"/>
@@ -5086,7 +5086,7 @@
         </w:tc>
         <w:tc>
           <w:tcPr>
-            <w:tcW w:type="dxa" w:w="7056"/>
+            <w:tcW w:type="dxa" w:w="7553"/>
             <w:vAlign w:val="center"/>
             <w:tcBorders>
               <w:top w:val="single" w:sz="4" w:space="0" w:color="CBD5E1"/>
@@ -5115,7 +5115,7 @@
       <w:tr>
         <w:tc>
           <w:tcPr>
-            <w:tcW w:type="dxa" w:w="7056"/>
+            <w:tcW w:type="dxa" w:w="7553"/>
             <w:vAlign w:val="center"/>
             <w:tcBorders>
               <w:top w:val="single" w:sz="4" w:space="0" w:color="CBD5E1"/>
@@ -5139,7 +5139,7 @@
         </w:tc>
         <w:tc>
           <w:tcPr>
-            <w:tcW w:type="dxa" w:w="7056"/>
+            <w:tcW w:type="dxa" w:w="7553"/>
             <w:vAlign w:val="center"/>
             <w:tcBorders>
               <w:top w:val="single" w:sz="4" w:space="0" w:color="CBD5E1"/>
@@ -5165,7 +5165,7 @@
       <w:tr>
         <w:tc>
           <w:tcPr>
-            <w:tcW w:type="dxa" w:w="7056"/>
+            <w:tcW w:type="dxa" w:w="7553"/>
             <w:vAlign w:val="center"/>
             <w:tcBorders>
               <w:top w:val="single" w:sz="4" w:space="0" w:color="CBD5E1"/>
@@ -5189,7 +5189,7 @@
         </w:tc>
         <w:tc>
           <w:tcPr>
-            <w:tcW w:type="dxa" w:w="7056"/>
+            <w:tcW w:type="dxa" w:w="7553"/>
             <w:vAlign w:val="center"/>
             <w:tcBorders>
               <w:top w:val="single" w:sz="4" w:space="0" w:color="CBD5E1"/>
@@ -5215,7 +5215,7 @@
       <w:tr>
         <w:tc>
           <w:tcPr>
-            <w:tcW w:type="dxa" w:w="7056"/>
+            <w:tcW w:type="dxa" w:w="7553"/>
             <w:vAlign w:val="center"/>
             <w:tcBorders>
               <w:top w:val="single" w:sz="4" w:space="0" w:color="CBD5E1"/>
@@ -5239,7 +5239,7 @@
         </w:tc>
         <w:tc>
           <w:tcPr>
-            <w:tcW w:type="dxa" w:w="7056"/>
+            <w:tcW w:type="dxa" w:w="7553"/>
             <w:vAlign w:val="center"/>
             <w:tcBorders>
               <w:top w:val="single" w:sz="4" w:space="0" w:color="CBD5E1"/>
@@ -5265,7 +5265,7 @@
       <w:tr>
         <w:tc>
           <w:tcPr>
-            <w:tcW w:type="dxa" w:w="7056"/>
+            <w:tcW w:type="dxa" w:w="7553"/>
             <w:vAlign w:val="center"/>
             <w:tcBorders>
               <w:top w:val="single" w:sz="4" w:space="0" w:color="CBD5E1"/>
@@ -5289,7 +5289,7 @@
         </w:tc>
         <w:tc>
           <w:tcPr>
-            <w:tcW w:type="dxa" w:w="7056"/>
+            <w:tcW w:type="dxa" w:w="7553"/>
             <w:vAlign w:val="center"/>
             <w:tcBorders>
               <w:top w:val="single" w:sz="4" w:space="0" w:color="CBD5E1"/>
@@ -5315,7 +5315,7 @@
       <w:tr>
         <w:tc>
           <w:tcPr>
-            <w:tcW w:type="dxa" w:w="7056"/>
+            <w:tcW w:type="dxa" w:w="7553"/>
             <w:vAlign w:val="center"/>
             <w:tcBorders>
               <w:top w:val="single" w:sz="4" w:space="0" w:color="CBD5E1"/>
@@ -5339,7 +5339,7 @@
         </w:tc>
         <w:tc>
           <w:tcPr>
-            <w:tcW w:type="dxa" w:w="7056"/>
+            <w:tcW w:type="dxa" w:w="7553"/>
             <w:vAlign w:val="center"/>
             <w:tcBorders>
               <w:top w:val="single" w:sz="4" w:space="0" w:color="CBD5E1"/>
@@ -5365,7 +5365,7 @@
       <w:tr>
         <w:tc>
           <w:tcPr>
-            <w:tcW w:type="dxa" w:w="7056"/>
+            <w:tcW w:type="dxa" w:w="7553"/>
             <w:vAlign w:val="center"/>
             <w:tcBorders>
               <w:top w:val="single" w:sz="4" w:space="0" w:color="CBD5E1"/>
@@ -5389,7 +5389,7 @@
         </w:tc>
         <w:tc>
           <w:tcPr>
-            <w:tcW w:type="dxa" w:w="7056"/>
+            <w:tcW w:type="dxa" w:w="7553"/>
             <w:vAlign w:val="center"/>
             <w:tcBorders>
               <w:top w:val="single" w:sz="4" w:space="0" w:color="CBD5E1"/>
@@ -5415,7 +5415,7 @@
       <w:tr>
         <w:tc>
           <w:tcPr>
-            <w:tcW w:type="dxa" w:w="7056"/>
+            <w:tcW w:type="dxa" w:w="7553"/>
             <w:vAlign w:val="center"/>
             <w:tcBorders>
               <w:top w:val="single" w:sz="4" w:space="0" w:color="CBD5E1"/>
@@ -5439,7 +5439,7 @@
         </w:tc>
         <w:tc>
           <w:tcPr>
-            <w:tcW w:type="dxa" w:w="7056"/>
+            <w:tcW w:type="dxa" w:w="7553"/>
             <w:vAlign w:val="center"/>
             <w:tcBorders>
               <w:top w:val="single" w:sz="4" w:space="0" w:color="CBD5E1"/>
@@ -5465,7 +5465,7 @@
       <w:tr>
         <w:tc>
           <w:tcPr>
-            <w:tcW w:type="dxa" w:w="7056"/>
+            <w:tcW w:type="dxa" w:w="7553"/>
             <w:vAlign w:val="center"/>
             <w:tcBorders>
               <w:top w:val="single" w:sz="4" w:space="0" w:color="CBD5E1"/>
@@ -5489,7 +5489,7 @@
         </w:tc>
         <w:tc>
           <w:tcPr>
-            <w:tcW w:type="dxa" w:w="7056"/>
+            <w:tcW w:type="dxa" w:w="7553"/>
             <w:vAlign w:val="center"/>
             <w:tcBorders>
               <w:top w:val="single" w:sz="4" w:space="0" w:color="CBD5E1"/>
@@ -5516,7 +5516,7 @@
     <w:sectPr>
       <w:headerReference w:type="default" r:id="rId9"/>
       <w:footerReference w:type="default" r:id="rId10"/>
-      <w:pgSz w:w="15840" w:h="12240" w:orient="landscape"/>
+      <w:pgSz w:w="16834" w:h="11909" w:orient="landscape"/>
       <w:pgMar w:top="792" w:right="864" w:bottom="792" w:left="864" w:header="432" w:footer="432" w:gutter="0"/>
       <w:cols w:space="720"/>
       <w:docGrid w:linePitch="360"/>

</xml_diff>

<commit_message>
docs: set user manual to A4 portrait
</commit_message>
<xml_diff>
--- a/work/docs/manual-usuario-escala-inteligente.docx
+++ b/work/docs/manual-usuario-escala-inteligente.docx
@@ -73,12 +73,12 @@
         <w:tblLook w:firstColumn="1" w:firstRow="1" w:lastColumn="0" w:lastRow="0" w:noHBand="0" w:noVBand="1" w:val="04A0"/>
       </w:tblPr>
       <w:tblGrid>
-        <w:gridCol w:w="15106"/>
+        <w:gridCol w:w="10181"/>
       </w:tblGrid>
       <w:tr>
         <w:tc>
           <w:tcPr>
-            <w:tcW w:type="dxa" w:w="15106"/>
+            <w:tcW w:type="dxa" w:w="10181"/>
             <w:shd w:fill="F8FAFC"/>
             <w:tcBorders>
               <w:top w:val="single" w:sz="4" w:space="0" w:color="BFDBFE"/>
@@ -123,7 +123,7 @@
       <w:r>
         <w:drawing>
           <wp:inline xmlns:a="http://schemas.openxmlformats.org/drawingml/2006/main" xmlns:pic="http://schemas.openxmlformats.org/drawingml/2006/picture">
-            <wp:extent cx="8138160" cy="4882896"/>
+            <wp:extent cx="6400800" cy="3840480"/>
             <wp:docPr id="2" name="Picture 2"/>
             <wp:cNvGraphicFramePr>
               <a:graphicFrameLocks noChangeAspect="1"/>
@@ -144,7 +144,7 @@
                   <pic:spPr>
                     <a:xfrm>
                       <a:off x="0" y="0"/>
-                      <a:ext cx="8138160" cy="4882896"/>
+                      <a:ext cx="6400800" cy="3840480"/>
                     </a:xfrm>
                     <a:prstGeom prst="rect"/>
                   </pic:spPr>
@@ -310,7 +310,7 @@
       <w:r>
         <w:drawing>
           <wp:inline xmlns:a="http://schemas.openxmlformats.org/drawingml/2006/main" xmlns:pic="http://schemas.openxmlformats.org/drawingml/2006/picture">
-            <wp:extent cx="8138160" cy="4882896"/>
+            <wp:extent cx="6400800" cy="3840480"/>
             <wp:docPr id="3" name="Picture 3"/>
             <wp:cNvGraphicFramePr>
               <a:graphicFrameLocks noChangeAspect="1"/>
@@ -331,7 +331,7 @@
                   <pic:spPr>
                     <a:xfrm>
                       <a:off x="0" y="0"/>
-                      <a:ext cx="8138160" cy="4882896"/>
+                      <a:ext cx="6400800" cy="3840480"/>
                     </a:xfrm>
                     <a:prstGeom prst="rect"/>
                   </pic:spPr>
@@ -372,14 +372,14 @@
         <w:tblLook w:firstColumn="1" w:firstRow="1" w:lastColumn="0" w:lastRow="0" w:noHBand="0" w:noVBand="1" w:val="04A0"/>
       </w:tblPr>
       <w:tblGrid>
-        <w:gridCol w:w="5035"/>
-        <w:gridCol w:w="5035"/>
-        <w:gridCol w:w="5035"/>
+        <w:gridCol w:w="3394"/>
+        <w:gridCol w:w="3394"/>
+        <w:gridCol w:w="3394"/>
       </w:tblGrid>
       <w:tr>
         <w:tc>
           <w:tcPr>
-            <w:tcW w:type="dxa" w:w="5035"/>
+            <w:tcW w:type="dxa" w:w="3394"/>
             <w:vAlign w:val="center"/>
             <w:tcBorders>
               <w:top w:val="single" w:sz="4" w:space="0" w:color="CBD5E1"/>
@@ -406,7 +406,7 @@
         </w:tc>
         <w:tc>
           <w:tcPr>
-            <w:tcW w:type="dxa" w:w="5035"/>
+            <w:tcW w:type="dxa" w:w="3394"/>
             <w:vAlign w:val="center"/>
             <w:tcBorders>
               <w:top w:val="single" w:sz="4" w:space="0" w:color="CBD5E1"/>
@@ -433,7 +433,7 @@
         </w:tc>
         <w:tc>
           <w:tcPr>
-            <w:tcW w:type="dxa" w:w="5035"/>
+            <w:tcW w:type="dxa" w:w="3394"/>
             <w:vAlign w:val="center"/>
             <w:tcBorders>
               <w:top w:val="single" w:sz="4" w:space="0" w:color="CBD5E1"/>
@@ -462,7 +462,7 @@
       <w:tr>
         <w:tc>
           <w:tcPr>
-            <w:tcW w:type="dxa" w:w="5035"/>
+            <w:tcW w:type="dxa" w:w="3394"/>
             <w:vAlign w:val="center"/>
             <w:tcBorders>
               <w:top w:val="single" w:sz="4" w:space="0" w:color="CBD5E1"/>
@@ -486,7 +486,7 @@
         </w:tc>
         <w:tc>
           <w:tcPr>
-            <w:tcW w:type="dxa" w:w="5035"/>
+            <w:tcW w:type="dxa" w:w="3394"/>
             <w:vAlign w:val="center"/>
             <w:tcBorders>
               <w:top w:val="single" w:sz="4" w:space="0" w:color="CBD5E1"/>
@@ -510,7 +510,7 @@
         </w:tc>
         <w:tc>
           <w:tcPr>
-            <w:tcW w:type="dxa" w:w="5035"/>
+            <w:tcW w:type="dxa" w:w="3394"/>
             <w:vAlign w:val="center"/>
             <w:tcBorders>
               <w:top w:val="single" w:sz="4" w:space="0" w:color="CBD5E1"/>
@@ -536,7 +536,7 @@
       <w:tr>
         <w:tc>
           <w:tcPr>
-            <w:tcW w:type="dxa" w:w="5035"/>
+            <w:tcW w:type="dxa" w:w="3394"/>
             <w:vAlign w:val="center"/>
             <w:tcBorders>
               <w:top w:val="single" w:sz="4" w:space="0" w:color="CBD5E1"/>
@@ -560,7 +560,7 @@
         </w:tc>
         <w:tc>
           <w:tcPr>
-            <w:tcW w:type="dxa" w:w="5035"/>
+            <w:tcW w:type="dxa" w:w="3394"/>
             <w:vAlign w:val="center"/>
             <w:tcBorders>
               <w:top w:val="single" w:sz="4" w:space="0" w:color="CBD5E1"/>
@@ -584,7 +584,7 @@
         </w:tc>
         <w:tc>
           <w:tcPr>
-            <w:tcW w:type="dxa" w:w="5035"/>
+            <w:tcW w:type="dxa" w:w="3394"/>
             <w:vAlign w:val="center"/>
             <w:tcBorders>
               <w:top w:val="single" w:sz="4" w:space="0" w:color="CBD5E1"/>
@@ -610,7 +610,7 @@
       <w:tr>
         <w:tc>
           <w:tcPr>
-            <w:tcW w:type="dxa" w:w="5035"/>
+            <w:tcW w:type="dxa" w:w="3394"/>
             <w:vAlign w:val="center"/>
             <w:tcBorders>
               <w:top w:val="single" w:sz="4" w:space="0" w:color="CBD5E1"/>
@@ -634,7 +634,7 @@
         </w:tc>
         <w:tc>
           <w:tcPr>
-            <w:tcW w:type="dxa" w:w="5035"/>
+            <w:tcW w:type="dxa" w:w="3394"/>
             <w:vAlign w:val="center"/>
             <w:tcBorders>
               <w:top w:val="single" w:sz="4" w:space="0" w:color="CBD5E1"/>
@@ -658,7 +658,7 @@
         </w:tc>
         <w:tc>
           <w:tcPr>
-            <w:tcW w:type="dxa" w:w="5035"/>
+            <w:tcW w:type="dxa" w:w="3394"/>
             <w:vAlign w:val="center"/>
             <w:tcBorders>
               <w:top w:val="single" w:sz="4" w:space="0" w:color="CBD5E1"/>
@@ -684,7 +684,7 @@
       <w:tr>
         <w:tc>
           <w:tcPr>
-            <w:tcW w:type="dxa" w:w="5035"/>
+            <w:tcW w:type="dxa" w:w="3394"/>
             <w:vAlign w:val="center"/>
             <w:tcBorders>
               <w:top w:val="single" w:sz="4" w:space="0" w:color="CBD5E1"/>
@@ -708,7 +708,7 @@
         </w:tc>
         <w:tc>
           <w:tcPr>
-            <w:tcW w:type="dxa" w:w="5035"/>
+            <w:tcW w:type="dxa" w:w="3394"/>
             <w:vAlign w:val="center"/>
             <w:tcBorders>
               <w:top w:val="single" w:sz="4" w:space="0" w:color="CBD5E1"/>
@@ -732,7 +732,7 @@
         </w:tc>
         <w:tc>
           <w:tcPr>
-            <w:tcW w:type="dxa" w:w="5035"/>
+            <w:tcW w:type="dxa" w:w="3394"/>
             <w:vAlign w:val="center"/>
             <w:tcBorders>
               <w:top w:val="single" w:sz="4" w:space="0" w:color="CBD5E1"/>
@@ -758,7 +758,7 @@
       <w:tr>
         <w:tc>
           <w:tcPr>
-            <w:tcW w:type="dxa" w:w="5035"/>
+            <w:tcW w:type="dxa" w:w="3394"/>
             <w:vAlign w:val="center"/>
             <w:tcBorders>
               <w:top w:val="single" w:sz="4" w:space="0" w:color="CBD5E1"/>
@@ -782,7 +782,7 @@
         </w:tc>
         <w:tc>
           <w:tcPr>
-            <w:tcW w:type="dxa" w:w="5035"/>
+            <w:tcW w:type="dxa" w:w="3394"/>
             <w:vAlign w:val="center"/>
             <w:tcBorders>
               <w:top w:val="single" w:sz="4" w:space="0" w:color="CBD5E1"/>
@@ -806,7 +806,7 @@
         </w:tc>
         <w:tc>
           <w:tcPr>
-            <w:tcW w:type="dxa" w:w="5035"/>
+            <w:tcW w:type="dxa" w:w="3394"/>
             <w:vAlign w:val="center"/>
             <w:tcBorders>
               <w:top w:val="single" w:sz="4" w:space="0" w:color="CBD5E1"/>
@@ -832,7 +832,7 @@
       <w:tr>
         <w:tc>
           <w:tcPr>
-            <w:tcW w:type="dxa" w:w="5035"/>
+            <w:tcW w:type="dxa" w:w="3394"/>
             <w:vAlign w:val="center"/>
             <w:tcBorders>
               <w:top w:val="single" w:sz="4" w:space="0" w:color="CBD5E1"/>
@@ -856,7 +856,7 @@
         </w:tc>
         <w:tc>
           <w:tcPr>
-            <w:tcW w:type="dxa" w:w="5035"/>
+            <w:tcW w:type="dxa" w:w="3394"/>
             <w:vAlign w:val="center"/>
             <w:tcBorders>
               <w:top w:val="single" w:sz="4" w:space="0" w:color="CBD5E1"/>
@@ -880,7 +880,7 @@
         </w:tc>
         <w:tc>
           <w:tcPr>
-            <w:tcW w:type="dxa" w:w="5035"/>
+            <w:tcW w:type="dxa" w:w="3394"/>
             <w:vAlign w:val="center"/>
             <w:tcBorders>
               <w:top w:val="single" w:sz="4" w:space="0" w:color="CBD5E1"/>
@@ -906,7 +906,7 @@
       <w:tr>
         <w:tc>
           <w:tcPr>
-            <w:tcW w:type="dxa" w:w="5035"/>
+            <w:tcW w:type="dxa" w:w="3394"/>
             <w:vAlign w:val="center"/>
             <w:tcBorders>
               <w:top w:val="single" w:sz="4" w:space="0" w:color="CBD5E1"/>
@@ -930,7 +930,7 @@
         </w:tc>
         <w:tc>
           <w:tcPr>
-            <w:tcW w:type="dxa" w:w="5035"/>
+            <w:tcW w:type="dxa" w:w="3394"/>
             <w:vAlign w:val="center"/>
             <w:tcBorders>
               <w:top w:val="single" w:sz="4" w:space="0" w:color="CBD5E1"/>
@@ -954,7 +954,7 @@
         </w:tc>
         <w:tc>
           <w:tcPr>
-            <w:tcW w:type="dxa" w:w="5035"/>
+            <w:tcW w:type="dxa" w:w="3394"/>
             <w:vAlign w:val="center"/>
             <w:tcBorders>
               <w:top w:val="single" w:sz="4" w:space="0" w:color="CBD5E1"/>
@@ -980,7 +980,7 @@
       <w:tr>
         <w:tc>
           <w:tcPr>
-            <w:tcW w:type="dxa" w:w="5035"/>
+            <w:tcW w:type="dxa" w:w="3394"/>
             <w:vAlign w:val="center"/>
             <w:tcBorders>
               <w:top w:val="single" w:sz="4" w:space="0" w:color="CBD5E1"/>
@@ -1004,7 +1004,7 @@
         </w:tc>
         <w:tc>
           <w:tcPr>
-            <w:tcW w:type="dxa" w:w="5035"/>
+            <w:tcW w:type="dxa" w:w="3394"/>
             <w:vAlign w:val="center"/>
             <w:tcBorders>
               <w:top w:val="single" w:sz="4" w:space="0" w:color="CBD5E1"/>
@@ -1028,7 +1028,7 @@
         </w:tc>
         <w:tc>
           <w:tcPr>
-            <w:tcW w:type="dxa" w:w="5035"/>
+            <w:tcW w:type="dxa" w:w="3394"/>
             <w:vAlign w:val="center"/>
             <w:tcBorders>
               <w:top w:val="single" w:sz="4" w:space="0" w:color="CBD5E1"/>
@@ -1054,7 +1054,7 @@
       <w:tr>
         <w:tc>
           <w:tcPr>
-            <w:tcW w:type="dxa" w:w="5035"/>
+            <w:tcW w:type="dxa" w:w="3394"/>
             <w:vAlign w:val="center"/>
             <w:tcBorders>
               <w:top w:val="single" w:sz="4" w:space="0" w:color="CBD5E1"/>
@@ -1078,7 +1078,7 @@
         </w:tc>
         <w:tc>
           <w:tcPr>
-            <w:tcW w:type="dxa" w:w="5035"/>
+            <w:tcW w:type="dxa" w:w="3394"/>
             <w:vAlign w:val="center"/>
             <w:tcBorders>
               <w:top w:val="single" w:sz="4" w:space="0" w:color="CBD5E1"/>
@@ -1102,7 +1102,7 @@
         </w:tc>
         <w:tc>
           <w:tcPr>
-            <w:tcW w:type="dxa" w:w="5035"/>
+            <w:tcW w:type="dxa" w:w="3394"/>
             <w:vAlign w:val="center"/>
             <w:tcBorders>
               <w:top w:val="single" w:sz="4" w:space="0" w:color="CBD5E1"/>
@@ -1147,7 +1147,7 @@
       <w:r>
         <w:drawing>
           <wp:inline xmlns:a="http://schemas.openxmlformats.org/drawingml/2006/main" xmlns:pic="http://schemas.openxmlformats.org/drawingml/2006/picture">
-            <wp:extent cx="8138160" cy="4882896"/>
+            <wp:extent cx="6400800" cy="3840480"/>
             <wp:docPr id="4" name="Picture 4"/>
             <wp:cNvGraphicFramePr>
               <a:graphicFrameLocks noChangeAspect="1"/>
@@ -1168,7 +1168,7 @@
                   <pic:spPr>
                     <a:xfrm>
                       <a:off x="0" y="0"/>
-                      <a:ext cx="8138160" cy="4882896"/>
+                      <a:ext cx="6400800" cy="3840480"/>
                     </a:xfrm>
                     <a:prstGeom prst="rect"/>
                   </pic:spPr>
@@ -1250,12 +1250,12 @@
         <w:tblLook w:firstColumn="1" w:firstRow="1" w:lastColumn="0" w:lastRow="0" w:noHBand="0" w:noVBand="1" w:val="04A0"/>
       </w:tblPr>
       <w:tblGrid>
-        <w:gridCol w:w="15106"/>
+        <w:gridCol w:w="10181"/>
       </w:tblGrid>
       <w:tr>
         <w:tc>
           <w:tcPr>
-            <w:tcW w:type="dxa" w:w="15106"/>
+            <w:tcW w:type="dxa" w:w="10181"/>
             <w:shd w:fill="F8FAFC"/>
             <w:tcBorders>
               <w:top w:val="single" w:sz="4" w:space="0" w:color="BFDBFE"/>
@@ -1308,7 +1308,7 @@
       <w:r>
         <w:drawing>
           <wp:inline xmlns:a="http://schemas.openxmlformats.org/drawingml/2006/main" xmlns:pic="http://schemas.openxmlformats.org/drawingml/2006/picture">
-            <wp:extent cx="8138160" cy="4882896"/>
+            <wp:extent cx="6400800" cy="3840480"/>
             <wp:docPr id="5" name="Picture 5"/>
             <wp:cNvGraphicFramePr>
               <a:graphicFrameLocks noChangeAspect="1"/>
@@ -1329,7 +1329,7 @@
                   <pic:spPr>
                     <a:xfrm>
                       <a:off x="0" y="0"/>
-                      <a:ext cx="8138160" cy="4882896"/>
+                      <a:ext cx="6400800" cy="3840480"/>
                     </a:xfrm>
                     <a:prstGeom prst="rect"/>
                   </pic:spPr>
@@ -1401,7 +1401,7 @@
       <w:r>
         <w:drawing>
           <wp:inline xmlns:a="http://schemas.openxmlformats.org/drawingml/2006/main" xmlns:pic="http://schemas.openxmlformats.org/drawingml/2006/picture">
-            <wp:extent cx="8138160" cy="6144311"/>
+            <wp:extent cx="6400800" cy="4832604"/>
             <wp:docPr id="6" name="Picture 6"/>
             <wp:cNvGraphicFramePr>
               <a:graphicFrameLocks noChangeAspect="1"/>
@@ -1422,7 +1422,7 @@
                   <pic:spPr>
                     <a:xfrm>
                       <a:off x="0" y="0"/>
-                      <a:ext cx="8138160" cy="6144311"/>
+                      <a:ext cx="6400800" cy="4832604"/>
                     </a:xfrm>
                     <a:prstGeom prst="rect"/>
                   </pic:spPr>
@@ -1462,7 +1462,7 @@
       <w:r>
         <w:drawing>
           <wp:inline xmlns:a="http://schemas.openxmlformats.org/drawingml/2006/main" xmlns:pic="http://schemas.openxmlformats.org/drawingml/2006/picture">
-            <wp:extent cx="8138160" cy="10152355"/>
+            <wp:extent cx="6400800" cy="7984998"/>
             <wp:docPr id="7" name="Picture 7"/>
             <wp:cNvGraphicFramePr>
               <a:graphicFrameLocks noChangeAspect="1"/>
@@ -1483,7 +1483,7 @@
                   <pic:spPr>
                     <a:xfrm>
                       <a:off x="0" y="0"/>
-                      <a:ext cx="8138160" cy="10152355"/>
+                      <a:ext cx="6400800" cy="7984998"/>
                     </a:xfrm>
                     <a:prstGeom prst="rect"/>
                   </pic:spPr>
@@ -1523,7 +1523,7 @@
       <w:r>
         <w:drawing>
           <wp:inline xmlns:a="http://schemas.openxmlformats.org/drawingml/2006/main" xmlns:pic="http://schemas.openxmlformats.org/drawingml/2006/picture">
-            <wp:extent cx="8138160" cy="10152355"/>
+            <wp:extent cx="6400800" cy="7984998"/>
             <wp:docPr id="8" name="Picture 8"/>
             <wp:cNvGraphicFramePr>
               <a:graphicFrameLocks noChangeAspect="1"/>
@@ -1544,7 +1544,7 @@
                   <pic:spPr>
                     <a:xfrm>
                       <a:off x="0" y="0"/>
-                      <a:ext cx="8138160" cy="10152355"/>
+                      <a:ext cx="6400800" cy="7984998"/>
                     </a:xfrm>
                     <a:prstGeom prst="rect"/>
                   </pic:spPr>
@@ -1584,7 +1584,7 @@
       <w:r>
         <w:drawing>
           <wp:inline xmlns:a="http://schemas.openxmlformats.org/drawingml/2006/main" xmlns:pic="http://schemas.openxmlformats.org/drawingml/2006/picture">
-            <wp:extent cx="8138160" cy="10152355"/>
+            <wp:extent cx="6400800" cy="7984998"/>
             <wp:docPr id="9" name="Picture 9"/>
             <wp:cNvGraphicFramePr>
               <a:graphicFrameLocks noChangeAspect="1"/>
@@ -1605,7 +1605,7 @@
                   <pic:spPr>
                     <a:xfrm>
                       <a:off x="0" y="0"/>
-                      <a:ext cx="8138160" cy="10152355"/>
+                      <a:ext cx="6400800" cy="7984998"/>
                     </a:xfrm>
                     <a:prstGeom prst="rect"/>
                   </pic:spPr>
@@ -1638,14 +1638,14 @@
         <w:tblLook w:firstColumn="1" w:firstRow="1" w:lastColumn="0" w:lastRow="0" w:noHBand="0" w:noVBand="1" w:val="04A0"/>
       </w:tblPr>
       <w:tblGrid>
-        <w:gridCol w:w="5035"/>
-        <w:gridCol w:w="5035"/>
-        <w:gridCol w:w="5035"/>
+        <w:gridCol w:w="3394"/>
+        <w:gridCol w:w="3394"/>
+        <w:gridCol w:w="3394"/>
       </w:tblGrid>
       <w:tr>
         <w:tc>
           <w:tcPr>
-            <w:tcW w:type="dxa" w:w="5035"/>
+            <w:tcW w:type="dxa" w:w="3394"/>
             <w:vAlign w:val="center"/>
             <w:tcBorders>
               <w:top w:val="single" w:sz="4" w:space="0" w:color="CBD5E1"/>
@@ -1672,7 +1672,7 @@
         </w:tc>
         <w:tc>
           <w:tcPr>
-            <w:tcW w:type="dxa" w:w="5035"/>
+            <w:tcW w:type="dxa" w:w="3394"/>
             <w:vAlign w:val="center"/>
             <w:tcBorders>
               <w:top w:val="single" w:sz="4" w:space="0" w:color="CBD5E1"/>
@@ -1699,7 +1699,7 @@
         </w:tc>
         <w:tc>
           <w:tcPr>
-            <w:tcW w:type="dxa" w:w="5035"/>
+            <w:tcW w:type="dxa" w:w="3394"/>
             <w:vAlign w:val="center"/>
             <w:tcBorders>
               <w:top w:val="single" w:sz="4" w:space="0" w:color="CBD5E1"/>
@@ -1728,7 +1728,7 @@
       <w:tr>
         <w:tc>
           <w:tcPr>
-            <w:tcW w:type="dxa" w:w="5035"/>
+            <w:tcW w:type="dxa" w:w="3394"/>
             <w:vAlign w:val="center"/>
             <w:tcBorders>
               <w:top w:val="single" w:sz="4" w:space="0" w:color="CBD5E1"/>
@@ -1752,7 +1752,7 @@
         </w:tc>
         <w:tc>
           <w:tcPr>
-            <w:tcW w:type="dxa" w:w="5035"/>
+            <w:tcW w:type="dxa" w:w="3394"/>
             <w:vAlign w:val="center"/>
             <w:tcBorders>
               <w:top w:val="single" w:sz="4" w:space="0" w:color="CBD5E1"/>
@@ -1776,7 +1776,7 @@
         </w:tc>
         <w:tc>
           <w:tcPr>
-            <w:tcW w:type="dxa" w:w="5035"/>
+            <w:tcW w:type="dxa" w:w="3394"/>
             <w:vAlign w:val="center"/>
             <w:tcBorders>
               <w:top w:val="single" w:sz="4" w:space="0" w:color="CBD5E1"/>
@@ -1802,7 +1802,7 @@
       <w:tr>
         <w:tc>
           <w:tcPr>
-            <w:tcW w:type="dxa" w:w="5035"/>
+            <w:tcW w:type="dxa" w:w="3394"/>
             <w:vAlign w:val="center"/>
             <w:tcBorders>
               <w:top w:val="single" w:sz="4" w:space="0" w:color="CBD5E1"/>
@@ -1826,7 +1826,7 @@
         </w:tc>
         <w:tc>
           <w:tcPr>
-            <w:tcW w:type="dxa" w:w="5035"/>
+            <w:tcW w:type="dxa" w:w="3394"/>
             <w:vAlign w:val="center"/>
             <w:tcBorders>
               <w:top w:val="single" w:sz="4" w:space="0" w:color="CBD5E1"/>
@@ -1850,7 +1850,7 @@
         </w:tc>
         <w:tc>
           <w:tcPr>
-            <w:tcW w:type="dxa" w:w="5035"/>
+            <w:tcW w:type="dxa" w:w="3394"/>
             <w:vAlign w:val="center"/>
             <w:tcBorders>
               <w:top w:val="single" w:sz="4" w:space="0" w:color="CBD5E1"/>
@@ -1876,7 +1876,7 @@
       <w:tr>
         <w:tc>
           <w:tcPr>
-            <w:tcW w:type="dxa" w:w="5035"/>
+            <w:tcW w:type="dxa" w:w="3394"/>
             <w:vAlign w:val="center"/>
             <w:tcBorders>
               <w:top w:val="single" w:sz="4" w:space="0" w:color="CBD5E1"/>
@@ -1900,7 +1900,7 @@
         </w:tc>
         <w:tc>
           <w:tcPr>
-            <w:tcW w:type="dxa" w:w="5035"/>
+            <w:tcW w:type="dxa" w:w="3394"/>
             <w:vAlign w:val="center"/>
             <w:tcBorders>
               <w:top w:val="single" w:sz="4" w:space="0" w:color="CBD5E1"/>
@@ -1924,7 +1924,7 @@
         </w:tc>
         <w:tc>
           <w:tcPr>
-            <w:tcW w:type="dxa" w:w="5035"/>
+            <w:tcW w:type="dxa" w:w="3394"/>
             <w:vAlign w:val="center"/>
             <w:tcBorders>
               <w:top w:val="single" w:sz="4" w:space="0" w:color="CBD5E1"/>
@@ -1950,7 +1950,7 @@
       <w:tr>
         <w:tc>
           <w:tcPr>
-            <w:tcW w:type="dxa" w:w="5035"/>
+            <w:tcW w:type="dxa" w:w="3394"/>
             <w:vAlign w:val="center"/>
             <w:tcBorders>
               <w:top w:val="single" w:sz="4" w:space="0" w:color="CBD5E1"/>
@@ -1974,7 +1974,7 @@
         </w:tc>
         <w:tc>
           <w:tcPr>
-            <w:tcW w:type="dxa" w:w="5035"/>
+            <w:tcW w:type="dxa" w:w="3394"/>
             <w:vAlign w:val="center"/>
             <w:tcBorders>
               <w:top w:val="single" w:sz="4" w:space="0" w:color="CBD5E1"/>
@@ -1998,7 +1998,7 @@
         </w:tc>
         <w:tc>
           <w:tcPr>
-            <w:tcW w:type="dxa" w:w="5035"/>
+            <w:tcW w:type="dxa" w:w="3394"/>
             <w:vAlign w:val="center"/>
             <w:tcBorders>
               <w:top w:val="single" w:sz="4" w:space="0" w:color="CBD5E1"/>
@@ -2024,7 +2024,7 @@
       <w:tr>
         <w:tc>
           <w:tcPr>
-            <w:tcW w:type="dxa" w:w="5035"/>
+            <w:tcW w:type="dxa" w:w="3394"/>
             <w:vAlign w:val="center"/>
             <w:tcBorders>
               <w:top w:val="single" w:sz="4" w:space="0" w:color="CBD5E1"/>
@@ -2048,7 +2048,7 @@
         </w:tc>
         <w:tc>
           <w:tcPr>
-            <w:tcW w:type="dxa" w:w="5035"/>
+            <w:tcW w:type="dxa" w:w="3394"/>
             <w:vAlign w:val="center"/>
             <w:tcBorders>
               <w:top w:val="single" w:sz="4" w:space="0" w:color="CBD5E1"/>
@@ -2072,7 +2072,7 @@
         </w:tc>
         <w:tc>
           <w:tcPr>
-            <w:tcW w:type="dxa" w:w="5035"/>
+            <w:tcW w:type="dxa" w:w="3394"/>
             <w:vAlign w:val="center"/>
             <w:tcBorders>
               <w:top w:val="single" w:sz="4" w:space="0" w:color="CBD5E1"/>
@@ -2098,7 +2098,7 @@
       <w:tr>
         <w:tc>
           <w:tcPr>
-            <w:tcW w:type="dxa" w:w="5035"/>
+            <w:tcW w:type="dxa" w:w="3394"/>
             <w:vAlign w:val="center"/>
             <w:tcBorders>
               <w:top w:val="single" w:sz="4" w:space="0" w:color="CBD5E1"/>
@@ -2122,7 +2122,7 @@
         </w:tc>
         <w:tc>
           <w:tcPr>
-            <w:tcW w:type="dxa" w:w="5035"/>
+            <w:tcW w:type="dxa" w:w="3394"/>
             <w:vAlign w:val="center"/>
             <w:tcBorders>
               <w:top w:val="single" w:sz="4" w:space="0" w:color="CBD5E1"/>
@@ -2146,7 +2146,7 @@
         </w:tc>
         <w:tc>
           <w:tcPr>
-            <w:tcW w:type="dxa" w:w="5035"/>
+            <w:tcW w:type="dxa" w:w="3394"/>
             <w:vAlign w:val="center"/>
             <w:tcBorders>
               <w:top w:val="single" w:sz="4" w:space="0" w:color="CBD5E1"/>
@@ -2172,7 +2172,7 @@
       <w:tr>
         <w:tc>
           <w:tcPr>
-            <w:tcW w:type="dxa" w:w="5035"/>
+            <w:tcW w:type="dxa" w:w="3394"/>
             <w:vAlign w:val="center"/>
             <w:tcBorders>
               <w:top w:val="single" w:sz="4" w:space="0" w:color="CBD5E1"/>
@@ -2196,7 +2196,7 @@
         </w:tc>
         <w:tc>
           <w:tcPr>
-            <w:tcW w:type="dxa" w:w="5035"/>
+            <w:tcW w:type="dxa" w:w="3394"/>
             <w:vAlign w:val="center"/>
             <w:tcBorders>
               <w:top w:val="single" w:sz="4" w:space="0" w:color="CBD5E1"/>
@@ -2220,7 +2220,7 @@
         </w:tc>
         <w:tc>
           <w:tcPr>
-            <w:tcW w:type="dxa" w:w="5035"/>
+            <w:tcW w:type="dxa" w:w="3394"/>
             <w:vAlign w:val="center"/>
             <w:tcBorders>
               <w:top w:val="single" w:sz="4" w:space="0" w:color="CBD5E1"/>
@@ -2246,7 +2246,7 @@
       <w:tr>
         <w:tc>
           <w:tcPr>
-            <w:tcW w:type="dxa" w:w="5035"/>
+            <w:tcW w:type="dxa" w:w="3394"/>
             <w:vAlign w:val="center"/>
             <w:tcBorders>
               <w:top w:val="single" w:sz="4" w:space="0" w:color="CBD5E1"/>
@@ -2270,7 +2270,7 @@
         </w:tc>
         <w:tc>
           <w:tcPr>
-            <w:tcW w:type="dxa" w:w="5035"/>
+            <w:tcW w:type="dxa" w:w="3394"/>
             <w:vAlign w:val="center"/>
             <w:tcBorders>
               <w:top w:val="single" w:sz="4" w:space="0" w:color="CBD5E1"/>
@@ -2294,7 +2294,7 @@
         </w:tc>
         <w:tc>
           <w:tcPr>
-            <w:tcW w:type="dxa" w:w="5035"/>
+            <w:tcW w:type="dxa" w:w="3394"/>
             <w:vAlign w:val="center"/>
             <w:tcBorders>
               <w:top w:val="single" w:sz="4" w:space="0" w:color="CBD5E1"/>
@@ -2320,7 +2320,7 @@
       <w:tr>
         <w:tc>
           <w:tcPr>
-            <w:tcW w:type="dxa" w:w="5035"/>
+            <w:tcW w:type="dxa" w:w="3394"/>
             <w:vAlign w:val="center"/>
             <w:tcBorders>
               <w:top w:val="single" w:sz="4" w:space="0" w:color="CBD5E1"/>
@@ -2344,7 +2344,7 @@
         </w:tc>
         <w:tc>
           <w:tcPr>
-            <w:tcW w:type="dxa" w:w="5035"/>
+            <w:tcW w:type="dxa" w:w="3394"/>
             <w:vAlign w:val="center"/>
             <w:tcBorders>
               <w:top w:val="single" w:sz="4" w:space="0" w:color="CBD5E1"/>
@@ -2368,7 +2368,7 @@
         </w:tc>
         <w:tc>
           <w:tcPr>
-            <w:tcW w:type="dxa" w:w="5035"/>
+            <w:tcW w:type="dxa" w:w="3394"/>
             <w:vAlign w:val="center"/>
             <w:tcBorders>
               <w:top w:val="single" w:sz="4" w:space="0" w:color="CBD5E1"/>
@@ -2394,7 +2394,7 @@
       <w:tr>
         <w:tc>
           <w:tcPr>
-            <w:tcW w:type="dxa" w:w="5035"/>
+            <w:tcW w:type="dxa" w:w="3394"/>
             <w:vAlign w:val="center"/>
             <w:tcBorders>
               <w:top w:val="single" w:sz="4" w:space="0" w:color="CBD5E1"/>
@@ -2418,7 +2418,7 @@
         </w:tc>
         <w:tc>
           <w:tcPr>
-            <w:tcW w:type="dxa" w:w="5035"/>
+            <w:tcW w:type="dxa" w:w="3394"/>
             <w:vAlign w:val="center"/>
             <w:tcBorders>
               <w:top w:val="single" w:sz="4" w:space="0" w:color="CBD5E1"/>
@@ -2442,7 +2442,7 @@
         </w:tc>
         <w:tc>
           <w:tcPr>
-            <w:tcW w:type="dxa" w:w="5035"/>
+            <w:tcW w:type="dxa" w:w="3394"/>
             <w:vAlign w:val="center"/>
             <w:tcBorders>
               <w:top w:val="single" w:sz="4" w:space="0" w:color="CBD5E1"/>
@@ -2468,7 +2468,7 @@
       <w:tr>
         <w:tc>
           <w:tcPr>
-            <w:tcW w:type="dxa" w:w="5035"/>
+            <w:tcW w:type="dxa" w:w="3394"/>
             <w:vAlign w:val="center"/>
             <w:tcBorders>
               <w:top w:val="single" w:sz="4" w:space="0" w:color="CBD5E1"/>
@@ -2492,7 +2492,7 @@
         </w:tc>
         <w:tc>
           <w:tcPr>
-            <w:tcW w:type="dxa" w:w="5035"/>
+            <w:tcW w:type="dxa" w:w="3394"/>
             <w:vAlign w:val="center"/>
             <w:tcBorders>
               <w:top w:val="single" w:sz="4" w:space="0" w:color="CBD5E1"/>
@@ -2516,7 +2516,7 @@
         </w:tc>
         <w:tc>
           <w:tcPr>
-            <w:tcW w:type="dxa" w:w="5035"/>
+            <w:tcW w:type="dxa" w:w="3394"/>
             <w:vAlign w:val="center"/>
             <w:tcBorders>
               <w:top w:val="single" w:sz="4" w:space="0" w:color="CBD5E1"/>
@@ -2542,7 +2542,7 @@
       <w:tr>
         <w:tc>
           <w:tcPr>
-            <w:tcW w:type="dxa" w:w="5035"/>
+            <w:tcW w:type="dxa" w:w="3394"/>
             <w:vAlign w:val="center"/>
             <w:tcBorders>
               <w:top w:val="single" w:sz="4" w:space="0" w:color="CBD5E1"/>
@@ -2566,7 +2566,7 @@
         </w:tc>
         <w:tc>
           <w:tcPr>
-            <w:tcW w:type="dxa" w:w="5035"/>
+            <w:tcW w:type="dxa" w:w="3394"/>
             <w:vAlign w:val="center"/>
             <w:tcBorders>
               <w:top w:val="single" w:sz="4" w:space="0" w:color="CBD5E1"/>
@@ -2590,7 +2590,7 @@
         </w:tc>
         <w:tc>
           <w:tcPr>
-            <w:tcW w:type="dxa" w:w="5035"/>
+            <w:tcW w:type="dxa" w:w="3394"/>
             <w:vAlign w:val="center"/>
             <w:tcBorders>
               <w:top w:val="single" w:sz="4" w:space="0" w:color="CBD5E1"/>
@@ -2616,7 +2616,7 @@
       <w:tr>
         <w:tc>
           <w:tcPr>
-            <w:tcW w:type="dxa" w:w="5035"/>
+            <w:tcW w:type="dxa" w:w="3394"/>
             <w:vAlign w:val="center"/>
             <w:tcBorders>
               <w:top w:val="single" w:sz="4" w:space="0" w:color="CBD5E1"/>
@@ -2640,7 +2640,7 @@
         </w:tc>
         <w:tc>
           <w:tcPr>
-            <w:tcW w:type="dxa" w:w="5035"/>
+            <w:tcW w:type="dxa" w:w="3394"/>
             <w:vAlign w:val="center"/>
             <w:tcBorders>
               <w:top w:val="single" w:sz="4" w:space="0" w:color="CBD5E1"/>
@@ -2664,7 +2664,7 @@
         </w:tc>
         <w:tc>
           <w:tcPr>
-            <w:tcW w:type="dxa" w:w="5035"/>
+            <w:tcW w:type="dxa" w:w="3394"/>
             <w:vAlign w:val="center"/>
             <w:tcBorders>
               <w:top w:val="single" w:sz="4" w:space="0" w:color="CBD5E1"/>
@@ -2690,7 +2690,7 @@
       <w:tr>
         <w:tc>
           <w:tcPr>
-            <w:tcW w:type="dxa" w:w="5035"/>
+            <w:tcW w:type="dxa" w:w="3394"/>
             <w:vAlign w:val="center"/>
             <w:tcBorders>
               <w:top w:val="single" w:sz="4" w:space="0" w:color="CBD5E1"/>
@@ -2714,7 +2714,7 @@
         </w:tc>
         <w:tc>
           <w:tcPr>
-            <w:tcW w:type="dxa" w:w="5035"/>
+            <w:tcW w:type="dxa" w:w="3394"/>
             <w:vAlign w:val="center"/>
             <w:tcBorders>
               <w:top w:val="single" w:sz="4" w:space="0" w:color="CBD5E1"/>
@@ -2738,7 +2738,7 @@
         </w:tc>
         <w:tc>
           <w:tcPr>
-            <w:tcW w:type="dxa" w:w="5035"/>
+            <w:tcW w:type="dxa" w:w="3394"/>
             <w:vAlign w:val="center"/>
             <w:tcBorders>
               <w:top w:val="single" w:sz="4" w:space="0" w:color="CBD5E1"/>
@@ -2791,7 +2791,7 @@
       <w:r>
         <w:drawing>
           <wp:inline xmlns:a="http://schemas.openxmlformats.org/drawingml/2006/main" xmlns:pic="http://schemas.openxmlformats.org/drawingml/2006/picture">
-            <wp:extent cx="8138160" cy="4882896"/>
+            <wp:extent cx="6400800" cy="3840480"/>
             <wp:docPr id="10" name="Picture 10"/>
             <wp:cNvGraphicFramePr>
               <a:graphicFrameLocks noChangeAspect="1"/>
@@ -2812,7 +2812,7 @@
                   <pic:spPr>
                     <a:xfrm>
                       <a:off x="0" y="0"/>
-                      <a:ext cx="8138160" cy="4882896"/>
+                      <a:ext cx="6400800" cy="3840480"/>
                     </a:xfrm>
                     <a:prstGeom prst="rect"/>
                   </pic:spPr>
@@ -2844,7 +2844,7 @@
       <w:r>
         <w:drawing>
           <wp:inline xmlns:a="http://schemas.openxmlformats.org/drawingml/2006/main" xmlns:pic="http://schemas.openxmlformats.org/drawingml/2006/picture">
-            <wp:extent cx="8138160" cy="4882896"/>
+            <wp:extent cx="6400800" cy="3840480"/>
             <wp:docPr id="11" name="Picture 11"/>
             <wp:cNvGraphicFramePr>
               <a:graphicFrameLocks noChangeAspect="1"/>
@@ -2865,7 +2865,7 @@
                   <pic:spPr>
                     <a:xfrm>
                       <a:off x="0" y="0"/>
-                      <a:ext cx="8138160" cy="4882896"/>
+                      <a:ext cx="6400800" cy="3840480"/>
                     </a:xfrm>
                     <a:prstGeom prst="rect"/>
                   </pic:spPr>
@@ -2897,7 +2897,7 @@
       <w:r>
         <w:drawing>
           <wp:inline xmlns:a="http://schemas.openxmlformats.org/drawingml/2006/main" xmlns:pic="http://schemas.openxmlformats.org/drawingml/2006/picture">
-            <wp:extent cx="8138160" cy="6144311"/>
+            <wp:extent cx="6400800" cy="4832604"/>
             <wp:docPr id="12" name="Picture 12"/>
             <wp:cNvGraphicFramePr>
               <a:graphicFrameLocks noChangeAspect="1"/>
@@ -2918,7 +2918,7 @@
                   <pic:spPr>
                     <a:xfrm>
                       <a:off x="0" y="0"/>
-                      <a:ext cx="8138160" cy="6144311"/>
+                      <a:ext cx="6400800" cy="4832604"/>
                     </a:xfrm>
                     <a:prstGeom prst="rect"/>
                   </pic:spPr>
@@ -2950,7 +2950,7 @@
       <w:r>
         <w:drawing>
           <wp:inline xmlns:a="http://schemas.openxmlformats.org/drawingml/2006/main" xmlns:pic="http://schemas.openxmlformats.org/drawingml/2006/picture">
-            <wp:extent cx="8138160" cy="10152355"/>
+            <wp:extent cx="6400800" cy="7984998"/>
             <wp:docPr id="13" name="Picture 13"/>
             <wp:cNvGraphicFramePr>
               <a:graphicFrameLocks noChangeAspect="1"/>
@@ -2971,7 +2971,7 @@
                   <pic:spPr>
                     <a:xfrm>
                       <a:off x="0" y="0"/>
-                      <a:ext cx="8138160" cy="10152355"/>
+                      <a:ext cx="6400800" cy="7984998"/>
                     </a:xfrm>
                     <a:prstGeom prst="rect"/>
                   </pic:spPr>
@@ -3003,7 +3003,7 @@
       <w:r>
         <w:drawing>
           <wp:inline xmlns:a="http://schemas.openxmlformats.org/drawingml/2006/main" xmlns:pic="http://schemas.openxmlformats.org/drawingml/2006/picture">
-            <wp:extent cx="8138160" cy="10152355"/>
+            <wp:extent cx="6400800" cy="7984998"/>
             <wp:docPr id="14" name="Picture 14"/>
             <wp:cNvGraphicFramePr>
               <a:graphicFrameLocks noChangeAspect="1"/>
@@ -3024,7 +3024,7 @@
                   <pic:spPr>
                     <a:xfrm>
                       <a:off x="0" y="0"/>
-                      <a:ext cx="8138160" cy="10152355"/>
+                      <a:ext cx="6400800" cy="7984998"/>
                     </a:xfrm>
                     <a:prstGeom prst="rect"/>
                   </pic:spPr>
@@ -3056,7 +3056,7 @@
       <w:r>
         <w:drawing>
           <wp:inline xmlns:a="http://schemas.openxmlformats.org/drawingml/2006/main" xmlns:pic="http://schemas.openxmlformats.org/drawingml/2006/picture">
-            <wp:extent cx="8138160" cy="10152355"/>
+            <wp:extent cx="6400800" cy="7984998"/>
             <wp:docPr id="15" name="Picture 15"/>
             <wp:cNvGraphicFramePr>
               <a:graphicFrameLocks noChangeAspect="1"/>
@@ -3077,7 +3077,7 @@
                   <pic:spPr>
                     <a:xfrm>
                       <a:off x="0" y="0"/>
-                      <a:ext cx="8138160" cy="10152355"/>
+                      <a:ext cx="6400800" cy="7984998"/>
                     </a:xfrm>
                     <a:prstGeom prst="rect"/>
                   </pic:spPr>
@@ -3122,7 +3122,7 @@
       <w:r>
         <w:drawing>
           <wp:inline xmlns:a="http://schemas.openxmlformats.org/drawingml/2006/main" xmlns:pic="http://schemas.openxmlformats.org/drawingml/2006/picture">
-            <wp:extent cx="8138160" cy="4882896"/>
+            <wp:extent cx="6400800" cy="3840480"/>
             <wp:docPr id="16" name="Picture 16"/>
             <wp:cNvGraphicFramePr>
               <a:graphicFrameLocks noChangeAspect="1"/>
@@ -3143,7 +3143,7 @@
                   <pic:spPr>
                     <a:xfrm>
                       <a:off x="0" y="0"/>
-                      <a:ext cx="8138160" cy="4882896"/>
+                      <a:ext cx="6400800" cy="3840480"/>
                     </a:xfrm>
                     <a:prstGeom prst="rect"/>
                   </pic:spPr>
@@ -3236,7 +3236,7 @@
       <w:r>
         <w:drawing>
           <wp:inline xmlns:a="http://schemas.openxmlformats.org/drawingml/2006/main" xmlns:pic="http://schemas.openxmlformats.org/drawingml/2006/picture">
-            <wp:extent cx="8138160" cy="4882896"/>
+            <wp:extent cx="6400800" cy="3840480"/>
             <wp:docPr id="17" name="Picture 17"/>
             <wp:cNvGraphicFramePr>
               <a:graphicFrameLocks noChangeAspect="1"/>
@@ -3257,7 +3257,7 @@
                   <pic:spPr>
                     <a:xfrm>
                       <a:off x="0" y="0"/>
-                      <a:ext cx="8138160" cy="4882896"/>
+                      <a:ext cx="6400800" cy="3840480"/>
                     </a:xfrm>
                     <a:prstGeom prst="rect"/>
                   </pic:spPr>
@@ -3298,14 +3298,14 @@
         <w:tblLook w:firstColumn="1" w:firstRow="1" w:lastColumn="0" w:lastRow="0" w:noHBand="0" w:noVBand="1" w:val="04A0"/>
       </w:tblPr>
       <w:tblGrid>
-        <w:gridCol w:w="5035"/>
-        <w:gridCol w:w="5035"/>
-        <w:gridCol w:w="5035"/>
+        <w:gridCol w:w="3394"/>
+        <w:gridCol w:w="3394"/>
+        <w:gridCol w:w="3394"/>
       </w:tblGrid>
       <w:tr>
         <w:tc>
           <w:tcPr>
-            <w:tcW w:type="dxa" w:w="5035"/>
+            <w:tcW w:type="dxa" w:w="3394"/>
             <w:vAlign w:val="center"/>
             <w:tcBorders>
               <w:top w:val="single" w:sz="4" w:space="0" w:color="CBD5E1"/>
@@ -3332,7 +3332,7 @@
         </w:tc>
         <w:tc>
           <w:tcPr>
-            <w:tcW w:type="dxa" w:w="5035"/>
+            <w:tcW w:type="dxa" w:w="3394"/>
             <w:vAlign w:val="center"/>
             <w:tcBorders>
               <w:top w:val="single" w:sz="4" w:space="0" w:color="CBD5E1"/>
@@ -3359,7 +3359,7 @@
         </w:tc>
         <w:tc>
           <w:tcPr>
-            <w:tcW w:type="dxa" w:w="5035"/>
+            <w:tcW w:type="dxa" w:w="3394"/>
             <w:vAlign w:val="center"/>
             <w:tcBorders>
               <w:top w:val="single" w:sz="4" w:space="0" w:color="CBD5E1"/>
@@ -3388,7 +3388,7 @@
       <w:tr>
         <w:tc>
           <w:tcPr>
-            <w:tcW w:type="dxa" w:w="5035"/>
+            <w:tcW w:type="dxa" w:w="3394"/>
             <w:vAlign w:val="center"/>
             <w:tcBorders>
               <w:top w:val="single" w:sz="4" w:space="0" w:color="CBD5E1"/>
@@ -3412,7 +3412,7 @@
         </w:tc>
         <w:tc>
           <w:tcPr>
-            <w:tcW w:type="dxa" w:w="5035"/>
+            <w:tcW w:type="dxa" w:w="3394"/>
             <w:vAlign w:val="center"/>
             <w:tcBorders>
               <w:top w:val="single" w:sz="4" w:space="0" w:color="CBD5E1"/>
@@ -3436,7 +3436,7 @@
         </w:tc>
         <w:tc>
           <w:tcPr>
-            <w:tcW w:type="dxa" w:w="5035"/>
+            <w:tcW w:type="dxa" w:w="3394"/>
             <w:vAlign w:val="center"/>
             <w:tcBorders>
               <w:top w:val="single" w:sz="4" w:space="0" w:color="CBD5E1"/>
@@ -3462,7 +3462,7 @@
       <w:tr>
         <w:tc>
           <w:tcPr>
-            <w:tcW w:type="dxa" w:w="5035"/>
+            <w:tcW w:type="dxa" w:w="3394"/>
             <w:vAlign w:val="center"/>
             <w:tcBorders>
               <w:top w:val="single" w:sz="4" w:space="0" w:color="CBD5E1"/>
@@ -3486,7 +3486,7 @@
         </w:tc>
         <w:tc>
           <w:tcPr>
-            <w:tcW w:type="dxa" w:w="5035"/>
+            <w:tcW w:type="dxa" w:w="3394"/>
             <w:vAlign w:val="center"/>
             <w:tcBorders>
               <w:top w:val="single" w:sz="4" w:space="0" w:color="CBD5E1"/>
@@ -3510,7 +3510,7 @@
         </w:tc>
         <w:tc>
           <w:tcPr>
-            <w:tcW w:type="dxa" w:w="5035"/>
+            <w:tcW w:type="dxa" w:w="3394"/>
             <w:vAlign w:val="center"/>
             <w:tcBorders>
               <w:top w:val="single" w:sz="4" w:space="0" w:color="CBD5E1"/>
@@ -3536,7 +3536,7 @@
       <w:tr>
         <w:tc>
           <w:tcPr>
-            <w:tcW w:type="dxa" w:w="5035"/>
+            <w:tcW w:type="dxa" w:w="3394"/>
             <w:vAlign w:val="center"/>
             <w:tcBorders>
               <w:top w:val="single" w:sz="4" w:space="0" w:color="CBD5E1"/>
@@ -3560,7 +3560,7 @@
         </w:tc>
         <w:tc>
           <w:tcPr>
-            <w:tcW w:type="dxa" w:w="5035"/>
+            <w:tcW w:type="dxa" w:w="3394"/>
             <w:vAlign w:val="center"/>
             <w:tcBorders>
               <w:top w:val="single" w:sz="4" w:space="0" w:color="CBD5E1"/>
@@ -3584,7 +3584,7 @@
         </w:tc>
         <w:tc>
           <w:tcPr>
-            <w:tcW w:type="dxa" w:w="5035"/>
+            <w:tcW w:type="dxa" w:w="3394"/>
             <w:vAlign w:val="center"/>
             <w:tcBorders>
               <w:top w:val="single" w:sz="4" w:space="0" w:color="CBD5E1"/>
@@ -3610,7 +3610,7 @@
       <w:tr>
         <w:tc>
           <w:tcPr>
-            <w:tcW w:type="dxa" w:w="5035"/>
+            <w:tcW w:type="dxa" w:w="3394"/>
             <w:vAlign w:val="center"/>
             <w:tcBorders>
               <w:top w:val="single" w:sz="4" w:space="0" w:color="CBD5E1"/>
@@ -3634,7 +3634,7 @@
         </w:tc>
         <w:tc>
           <w:tcPr>
-            <w:tcW w:type="dxa" w:w="5035"/>
+            <w:tcW w:type="dxa" w:w="3394"/>
             <w:vAlign w:val="center"/>
             <w:tcBorders>
               <w:top w:val="single" w:sz="4" w:space="0" w:color="CBD5E1"/>
@@ -3658,7 +3658,7 @@
         </w:tc>
         <w:tc>
           <w:tcPr>
-            <w:tcW w:type="dxa" w:w="5035"/>
+            <w:tcW w:type="dxa" w:w="3394"/>
             <w:vAlign w:val="center"/>
             <w:tcBorders>
               <w:top w:val="single" w:sz="4" w:space="0" w:color="CBD5E1"/>
@@ -3684,7 +3684,7 @@
       <w:tr>
         <w:tc>
           <w:tcPr>
-            <w:tcW w:type="dxa" w:w="5035"/>
+            <w:tcW w:type="dxa" w:w="3394"/>
             <w:vAlign w:val="center"/>
             <w:tcBorders>
               <w:top w:val="single" w:sz="4" w:space="0" w:color="CBD5E1"/>
@@ -3708,7 +3708,7 @@
         </w:tc>
         <w:tc>
           <w:tcPr>
-            <w:tcW w:type="dxa" w:w="5035"/>
+            <w:tcW w:type="dxa" w:w="3394"/>
             <w:vAlign w:val="center"/>
             <w:tcBorders>
               <w:top w:val="single" w:sz="4" w:space="0" w:color="CBD5E1"/>
@@ -3732,7 +3732,7 @@
         </w:tc>
         <w:tc>
           <w:tcPr>
-            <w:tcW w:type="dxa" w:w="5035"/>
+            <w:tcW w:type="dxa" w:w="3394"/>
             <w:vAlign w:val="center"/>
             <w:tcBorders>
               <w:top w:val="single" w:sz="4" w:space="0" w:color="CBD5E1"/>
@@ -3785,7 +3785,7 @@
       <w:r>
         <w:drawing>
           <wp:inline xmlns:a="http://schemas.openxmlformats.org/drawingml/2006/main" xmlns:pic="http://schemas.openxmlformats.org/drawingml/2006/picture">
-            <wp:extent cx="8138160" cy="4882896"/>
+            <wp:extent cx="6400800" cy="3840480"/>
             <wp:docPr id="18" name="Picture 18"/>
             <wp:cNvGraphicFramePr>
               <a:graphicFrameLocks noChangeAspect="1"/>
@@ -3806,7 +3806,7 @@
                   <pic:spPr>
                     <a:xfrm>
                       <a:off x="0" y="0"/>
-                      <a:ext cx="8138160" cy="4882896"/>
+                      <a:ext cx="6400800" cy="3840480"/>
                     </a:xfrm>
                     <a:prstGeom prst="rect"/>
                   </pic:spPr>
@@ -3891,7 +3891,7 @@
       <w:r>
         <w:drawing>
           <wp:inline xmlns:a="http://schemas.openxmlformats.org/drawingml/2006/main" xmlns:pic="http://schemas.openxmlformats.org/drawingml/2006/picture">
-            <wp:extent cx="8138160" cy="4882896"/>
+            <wp:extent cx="6400800" cy="3840480"/>
             <wp:docPr id="19" name="Picture 19"/>
             <wp:cNvGraphicFramePr>
               <a:graphicFrameLocks noChangeAspect="1"/>
@@ -3912,7 +3912,7 @@
                   <pic:spPr>
                     <a:xfrm>
                       <a:off x="0" y="0"/>
-                      <a:ext cx="8138160" cy="4882896"/>
+                      <a:ext cx="6400800" cy="3840480"/>
                     </a:xfrm>
                     <a:prstGeom prst="rect"/>
                   </pic:spPr>
@@ -3944,7 +3944,7 @@
       <w:r>
         <w:drawing>
           <wp:inline xmlns:a="http://schemas.openxmlformats.org/drawingml/2006/main" xmlns:pic="http://schemas.openxmlformats.org/drawingml/2006/picture">
-            <wp:extent cx="8138160" cy="4882896"/>
+            <wp:extent cx="6400800" cy="3840480"/>
             <wp:docPr id="20" name="Picture 20"/>
             <wp:cNvGraphicFramePr>
               <a:graphicFrameLocks noChangeAspect="1"/>
@@ -3965,7 +3965,7 @@
                   <pic:spPr>
                     <a:xfrm>
                       <a:off x="0" y="0"/>
-                      <a:ext cx="8138160" cy="4882896"/>
+                      <a:ext cx="6400800" cy="3840480"/>
                     </a:xfrm>
                     <a:prstGeom prst="rect"/>
                   </pic:spPr>
@@ -4060,7 +4060,7 @@
       <w:r>
         <w:drawing>
           <wp:inline xmlns:a="http://schemas.openxmlformats.org/drawingml/2006/main" xmlns:pic="http://schemas.openxmlformats.org/drawingml/2006/picture">
-            <wp:extent cx="8138160" cy="4882896"/>
+            <wp:extent cx="6400800" cy="3840480"/>
             <wp:docPr id="21" name="Picture 21"/>
             <wp:cNvGraphicFramePr>
               <a:graphicFrameLocks noChangeAspect="1"/>
@@ -4081,7 +4081,7 @@
                   <pic:spPr>
                     <a:xfrm>
                       <a:off x="0" y="0"/>
-                      <a:ext cx="8138160" cy="4882896"/>
+                      <a:ext cx="6400800" cy="3840480"/>
                     </a:xfrm>
                     <a:prstGeom prst="rect"/>
                   </pic:spPr>
@@ -4113,7 +4113,7 @@
       <w:r>
         <w:drawing>
           <wp:inline xmlns:a="http://schemas.openxmlformats.org/drawingml/2006/main" xmlns:pic="http://schemas.openxmlformats.org/drawingml/2006/picture">
-            <wp:extent cx="8138160" cy="4882896"/>
+            <wp:extent cx="6400800" cy="3840480"/>
             <wp:docPr id="22" name="Picture 22"/>
             <wp:cNvGraphicFramePr>
               <a:graphicFrameLocks noChangeAspect="1"/>
@@ -4134,7 +4134,7 @@
                   <pic:spPr>
                     <a:xfrm>
                       <a:off x="0" y="0"/>
-                      <a:ext cx="8138160" cy="4882896"/>
+                      <a:ext cx="6400800" cy="3840480"/>
                     </a:xfrm>
                     <a:prstGeom prst="rect"/>
                   </pic:spPr>
@@ -4175,14 +4175,14 @@
         <w:tblLook w:firstColumn="1" w:firstRow="1" w:lastColumn="0" w:lastRow="0" w:noHBand="0" w:noVBand="1" w:val="04A0"/>
       </w:tblPr>
       <w:tblGrid>
-        <w:gridCol w:w="5035"/>
-        <w:gridCol w:w="5035"/>
-        <w:gridCol w:w="5035"/>
+        <w:gridCol w:w="3394"/>
+        <w:gridCol w:w="3394"/>
+        <w:gridCol w:w="3394"/>
       </w:tblGrid>
       <w:tr>
         <w:tc>
           <w:tcPr>
-            <w:tcW w:type="dxa" w:w="5035"/>
+            <w:tcW w:type="dxa" w:w="3394"/>
             <w:vAlign w:val="center"/>
             <w:tcBorders>
               <w:top w:val="single" w:sz="4" w:space="0" w:color="CBD5E1"/>
@@ -4209,7 +4209,7 @@
         </w:tc>
         <w:tc>
           <w:tcPr>
-            <w:tcW w:type="dxa" w:w="5035"/>
+            <w:tcW w:type="dxa" w:w="3394"/>
             <w:vAlign w:val="center"/>
             <w:tcBorders>
               <w:top w:val="single" w:sz="4" w:space="0" w:color="CBD5E1"/>
@@ -4236,7 +4236,7 @@
         </w:tc>
         <w:tc>
           <w:tcPr>
-            <w:tcW w:type="dxa" w:w="5035"/>
+            <w:tcW w:type="dxa" w:w="3394"/>
             <w:vAlign w:val="center"/>
             <w:tcBorders>
               <w:top w:val="single" w:sz="4" w:space="0" w:color="CBD5E1"/>
@@ -4265,7 +4265,7 @@
       <w:tr>
         <w:tc>
           <w:tcPr>
-            <w:tcW w:type="dxa" w:w="5035"/>
+            <w:tcW w:type="dxa" w:w="3394"/>
             <w:vAlign w:val="center"/>
             <w:tcBorders>
               <w:top w:val="single" w:sz="4" w:space="0" w:color="CBD5E1"/>
@@ -4289,7 +4289,7 @@
         </w:tc>
         <w:tc>
           <w:tcPr>
-            <w:tcW w:type="dxa" w:w="5035"/>
+            <w:tcW w:type="dxa" w:w="3394"/>
             <w:vAlign w:val="center"/>
             <w:tcBorders>
               <w:top w:val="single" w:sz="4" w:space="0" w:color="CBD5E1"/>
@@ -4313,7 +4313,7 @@
         </w:tc>
         <w:tc>
           <w:tcPr>
-            <w:tcW w:type="dxa" w:w="5035"/>
+            <w:tcW w:type="dxa" w:w="3394"/>
             <w:vAlign w:val="center"/>
             <w:tcBorders>
               <w:top w:val="single" w:sz="4" w:space="0" w:color="CBD5E1"/>
@@ -4339,7 +4339,7 @@
       <w:tr>
         <w:tc>
           <w:tcPr>
-            <w:tcW w:type="dxa" w:w="5035"/>
+            <w:tcW w:type="dxa" w:w="3394"/>
             <w:vAlign w:val="center"/>
             <w:tcBorders>
               <w:top w:val="single" w:sz="4" w:space="0" w:color="CBD5E1"/>
@@ -4363,7 +4363,7 @@
         </w:tc>
         <w:tc>
           <w:tcPr>
-            <w:tcW w:type="dxa" w:w="5035"/>
+            <w:tcW w:type="dxa" w:w="3394"/>
             <w:vAlign w:val="center"/>
             <w:tcBorders>
               <w:top w:val="single" w:sz="4" w:space="0" w:color="CBD5E1"/>
@@ -4387,7 +4387,7 @@
         </w:tc>
         <w:tc>
           <w:tcPr>
-            <w:tcW w:type="dxa" w:w="5035"/>
+            <w:tcW w:type="dxa" w:w="3394"/>
             <w:vAlign w:val="center"/>
             <w:tcBorders>
               <w:top w:val="single" w:sz="4" w:space="0" w:color="CBD5E1"/>
@@ -4413,7 +4413,7 @@
       <w:tr>
         <w:tc>
           <w:tcPr>
-            <w:tcW w:type="dxa" w:w="5035"/>
+            <w:tcW w:type="dxa" w:w="3394"/>
             <w:vAlign w:val="center"/>
             <w:tcBorders>
               <w:top w:val="single" w:sz="4" w:space="0" w:color="CBD5E1"/>
@@ -4437,7 +4437,7 @@
         </w:tc>
         <w:tc>
           <w:tcPr>
-            <w:tcW w:type="dxa" w:w="5035"/>
+            <w:tcW w:type="dxa" w:w="3394"/>
             <w:vAlign w:val="center"/>
             <w:tcBorders>
               <w:top w:val="single" w:sz="4" w:space="0" w:color="CBD5E1"/>
@@ -4461,7 +4461,7 @@
         </w:tc>
         <w:tc>
           <w:tcPr>
-            <w:tcW w:type="dxa" w:w="5035"/>
+            <w:tcW w:type="dxa" w:w="3394"/>
             <w:vAlign w:val="center"/>
             <w:tcBorders>
               <w:top w:val="single" w:sz="4" w:space="0" w:color="CBD5E1"/>
@@ -4487,7 +4487,7 @@
       <w:tr>
         <w:tc>
           <w:tcPr>
-            <w:tcW w:type="dxa" w:w="5035"/>
+            <w:tcW w:type="dxa" w:w="3394"/>
             <w:vAlign w:val="center"/>
             <w:tcBorders>
               <w:top w:val="single" w:sz="4" w:space="0" w:color="CBD5E1"/>
@@ -4511,7 +4511,7 @@
         </w:tc>
         <w:tc>
           <w:tcPr>
-            <w:tcW w:type="dxa" w:w="5035"/>
+            <w:tcW w:type="dxa" w:w="3394"/>
             <w:vAlign w:val="center"/>
             <w:tcBorders>
               <w:top w:val="single" w:sz="4" w:space="0" w:color="CBD5E1"/>
@@ -4535,7 +4535,7 @@
         </w:tc>
         <w:tc>
           <w:tcPr>
-            <w:tcW w:type="dxa" w:w="5035"/>
+            <w:tcW w:type="dxa" w:w="3394"/>
             <w:vAlign w:val="center"/>
             <w:tcBorders>
               <w:top w:val="single" w:sz="4" w:space="0" w:color="CBD5E1"/>
@@ -4580,7 +4580,7 @@
       <w:r>
         <w:drawing>
           <wp:inline xmlns:a="http://schemas.openxmlformats.org/drawingml/2006/main" xmlns:pic="http://schemas.openxmlformats.org/drawingml/2006/picture">
-            <wp:extent cx="8138160" cy="4882896"/>
+            <wp:extent cx="6400800" cy="3840480"/>
             <wp:docPr id="23" name="Picture 23"/>
             <wp:cNvGraphicFramePr>
               <a:graphicFrameLocks noChangeAspect="1"/>
@@ -4601,7 +4601,7 @@
                   <pic:spPr>
                     <a:xfrm>
                       <a:off x="0" y="0"/>
-                      <a:ext cx="8138160" cy="4882896"/>
+                      <a:ext cx="6400800" cy="3840480"/>
                     </a:xfrm>
                     <a:prstGeom prst="rect"/>
                   </pic:spPr>
@@ -4654,7 +4654,7 @@
       <w:r>
         <w:drawing>
           <wp:inline xmlns:a="http://schemas.openxmlformats.org/drawingml/2006/main" xmlns:pic="http://schemas.openxmlformats.org/drawingml/2006/picture">
-            <wp:extent cx="8138160" cy="4882896"/>
+            <wp:extent cx="6400800" cy="3840480"/>
             <wp:docPr id="24" name="Picture 24"/>
             <wp:cNvGraphicFramePr>
               <a:graphicFrameLocks noChangeAspect="1"/>
@@ -4675,7 +4675,7 @@
                   <pic:spPr>
                     <a:xfrm>
                       <a:off x="0" y="0"/>
-                      <a:ext cx="8138160" cy="4882896"/>
+                      <a:ext cx="6400800" cy="3840480"/>
                     </a:xfrm>
                     <a:prstGeom prst="rect"/>
                   </pic:spPr>
@@ -4728,7 +4728,7 @@
       <w:r>
         <w:drawing>
           <wp:inline xmlns:a="http://schemas.openxmlformats.org/drawingml/2006/main" xmlns:pic="http://schemas.openxmlformats.org/drawingml/2006/picture">
-            <wp:extent cx="8138160" cy="4882896"/>
+            <wp:extent cx="6400800" cy="3840480"/>
             <wp:docPr id="25" name="Picture 25"/>
             <wp:cNvGraphicFramePr>
               <a:graphicFrameLocks noChangeAspect="1"/>
@@ -4749,7 +4749,7 @@
                   <pic:spPr>
                     <a:xfrm>
                       <a:off x="0" y="0"/>
-                      <a:ext cx="8138160" cy="4882896"/>
+                      <a:ext cx="6400800" cy="3840480"/>
                     </a:xfrm>
                     <a:prstGeom prst="rect"/>
                   </pic:spPr>
@@ -4832,7 +4832,7 @@
       <w:r>
         <w:drawing>
           <wp:inline xmlns:a="http://schemas.openxmlformats.org/drawingml/2006/main" xmlns:pic="http://schemas.openxmlformats.org/drawingml/2006/picture">
-            <wp:extent cx="8138160" cy="4882896"/>
+            <wp:extent cx="6400800" cy="3840480"/>
             <wp:docPr id="26" name="Picture 26"/>
             <wp:cNvGraphicFramePr>
               <a:graphicFrameLocks noChangeAspect="1"/>
@@ -4853,7 +4853,7 @@
                   <pic:spPr>
                     <a:xfrm>
                       <a:off x="0" y="0"/>
-                      <a:ext cx="8138160" cy="4882896"/>
+                      <a:ext cx="6400800" cy="3840480"/>
                     </a:xfrm>
                     <a:prstGeom prst="rect"/>
                   </pic:spPr>
@@ -4906,7 +4906,7 @@
       <w:r>
         <w:drawing>
           <wp:inline xmlns:a="http://schemas.openxmlformats.org/drawingml/2006/main" xmlns:pic="http://schemas.openxmlformats.org/drawingml/2006/picture">
-            <wp:extent cx="8138160" cy="4882896"/>
+            <wp:extent cx="6400800" cy="3840480"/>
             <wp:docPr id="27" name="Picture 27"/>
             <wp:cNvGraphicFramePr>
               <a:graphicFrameLocks noChangeAspect="1"/>
@@ -4927,7 +4927,7 @@
                   <pic:spPr>
                     <a:xfrm>
                       <a:off x="0" y="0"/>
-                      <a:ext cx="8138160" cy="4882896"/>
+                      <a:ext cx="6400800" cy="3840480"/>
                     </a:xfrm>
                     <a:prstGeom prst="rect"/>
                   </pic:spPr>
@@ -5053,13 +5053,13 @@
         <w:tblLook w:firstColumn="1" w:firstRow="1" w:lastColumn="0" w:lastRow="0" w:noHBand="0" w:noVBand="1" w:val="04A0"/>
       </w:tblPr>
       <w:tblGrid>
-        <w:gridCol w:w="7553"/>
-        <w:gridCol w:w="7553"/>
+        <w:gridCol w:w="5090"/>
+        <w:gridCol w:w="5090"/>
       </w:tblGrid>
       <w:tr>
         <w:tc>
           <w:tcPr>
-            <w:tcW w:type="dxa" w:w="7553"/>
+            <w:tcW w:type="dxa" w:w="5090"/>
             <w:vAlign w:val="center"/>
             <w:tcBorders>
               <w:top w:val="single" w:sz="4" w:space="0" w:color="CBD5E1"/>
@@ -5086,7 +5086,7 @@
         </w:tc>
         <w:tc>
           <w:tcPr>
-            <w:tcW w:type="dxa" w:w="7553"/>
+            <w:tcW w:type="dxa" w:w="5090"/>
             <w:vAlign w:val="center"/>
             <w:tcBorders>
               <w:top w:val="single" w:sz="4" w:space="0" w:color="CBD5E1"/>
@@ -5115,7 +5115,7 @@
       <w:tr>
         <w:tc>
           <w:tcPr>
-            <w:tcW w:type="dxa" w:w="7553"/>
+            <w:tcW w:type="dxa" w:w="5090"/>
             <w:vAlign w:val="center"/>
             <w:tcBorders>
               <w:top w:val="single" w:sz="4" w:space="0" w:color="CBD5E1"/>
@@ -5139,7 +5139,7 @@
         </w:tc>
         <w:tc>
           <w:tcPr>
-            <w:tcW w:type="dxa" w:w="7553"/>
+            <w:tcW w:type="dxa" w:w="5090"/>
             <w:vAlign w:val="center"/>
             <w:tcBorders>
               <w:top w:val="single" w:sz="4" w:space="0" w:color="CBD5E1"/>
@@ -5165,7 +5165,7 @@
       <w:tr>
         <w:tc>
           <w:tcPr>
-            <w:tcW w:type="dxa" w:w="7553"/>
+            <w:tcW w:type="dxa" w:w="5090"/>
             <w:vAlign w:val="center"/>
             <w:tcBorders>
               <w:top w:val="single" w:sz="4" w:space="0" w:color="CBD5E1"/>
@@ -5189,7 +5189,7 @@
         </w:tc>
         <w:tc>
           <w:tcPr>
-            <w:tcW w:type="dxa" w:w="7553"/>
+            <w:tcW w:type="dxa" w:w="5090"/>
             <w:vAlign w:val="center"/>
             <w:tcBorders>
               <w:top w:val="single" w:sz="4" w:space="0" w:color="CBD5E1"/>
@@ -5215,7 +5215,7 @@
       <w:tr>
         <w:tc>
           <w:tcPr>
-            <w:tcW w:type="dxa" w:w="7553"/>
+            <w:tcW w:type="dxa" w:w="5090"/>
             <w:vAlign w:val="center"/>
             <w:tcBorders>
               <w:top w:val="single" w:sz="4" w:space="0" w:color="CBD5E1"/>
@@ -5239,7 +5239,7 @@
         </w:tc>
         <w:tc>
           <w:tcPr>
-            <w:tcW w:type="dxa" w:w="7553"/>
+            <w:tcW w:type="dxa" w:w="5090"/>
             <w:vAlign w:val="center"/>
             <w:tcBorders>
               <w:top w:val="single" w:sz="4" w:space="0" w:color="CBD5E1"/>
@@ -5265,7 +5265,7 @@
       <w:tr>
         <w:tc>
           <w:tcPr>
-            <w:tcW w:type="dxa" w:w="7553"/>
+            <w:tcW w:type="dxa" w:w="5090"/>
             <w:vAlign w:val="center"/>
             <w:tcBorders>
               <w:top w:val="single" w:sz="4" w:space="0" w:color="CBD5E1"/>
@@ -5289,7 +5289,7 @@
         </w:tc>
         <w:tc>
           <w:tcPr>
-            <w:tcW w:type="dxa" w:w="7553"/>
+            <w:tcW w:type="dxa" w:w="5090"/>
             <w:vAlign w:val="center"/>
             <w:tcBorders>
               <w:top w:val="single" w:sz="4" w:space="0" w:color="CBD5E1"/>
@@ -5315,7 +5315,7 @@
       <w:tr>
         <w:tc>
           <w:tcPr>
-            <w:tcW w:type="dxa" w:w="7553"/>
+            <w:tcW w:type="dxa" w:w="5090"/>
             <w:vAlign w:val="center"/>
             <w:tcBorders>
               <w:top w:val="single" w:sz="4" w:space="0" w:color="CBD5E1"/>
@@ -5339,7 +5339,7 @@
         </w:tc>
         <w:tc>
           <w:tcPr>
-            <w:tcW w:type="dxa" w:w="7553"/>
+            <w:tcW w:type="dxa" w:w="5090"/>
             <w:vAlign w:val="center"/>
             <w:tcBorders>
               <w:top w:val="single" w:sz="4" w:space="0" w:color="CBD5E1"/>
@@ -5365,7 +5365,7 @@
       <w:tr>
         <w:tc>
           <w:tcPr>
-            <w:tcW w:type="dxa" w:w="7553"/>
+            <w:tcW w:type="dxa" w:w="5090"/>
             <w:vAlign w:val="center"/>
             <w:tcBorders>
               <w:top w:val="single" w:sz="4" w:space="0" w:color="CBD5E1"/>
@@ -5389,7 +5389,7 @@
         </w:tc>
         <w:tc>
           <w:tcPr>
-            <w:tcW w:type="dxa" w:w="7553"/>
+            <w:tcW w:type="dxa" w:w="5090"/>
             <w:vAlign w:val="center"/>
             <w:tcBorders>
               <w:top w:val="single" w:sz="4" w:space="0" w:color="CBD5E1"/>
@@ -5415,7 +5415,7 @@
       <w:tr>
         <w:tc>
           <w:tcPr>
-            <w:tcW w:type="dxa" w:w="7553"/>
+            <w:tcW w:type="dxa" w:w="5090"/>
             <w:vAlign w:val="center"/>
             <w:tcBorders>
               <w:top w:val="single" w:sz="4" w:space="0" w:color="CBD5E1"/>
@@ -5439,7 +5439,7 @@
         </w:tc>
         <w:tc>
           <w:tcPr>
-            <w:tcW w:type="dxa" w:w="7553"/>
+            <w:tcW w:type="dxa" w:w="5090"/>
             <w:vAlign w:val="center"/>
             <w:tcBorders>
               <w:top w:val="single" w:sz="4" w:space="0" w:color="CBD5E1"/>
@@ -5465,7 +5465,7 @@
       <w:tr>
         <w:tc>
           <w:tcPr>
-            <w:tcW w:type="dxa" w:w="7553"/>
+            <w:tcW w:type="dxa" w:w="5090"/>
             <w:vAlign w:val="center"/>
             <w:tcBorders>
               <w:top w:val="single" w:sz="4" w:space="0" w:color="CBD5E1"/>
@@ -5489,7 +5489,7 @@
         </w:tc>
         <w:tc>
           <w:tcPr>
-            <w:tcW w:type="dxa" w:w="7553"/>
+            <w:tcW w:type="dxa" w:w="5090"/>
             <w:vAlign w:val="center"/>
             <w:tcBorders>
               <w:top w:val="single" w:sz="4" w:space="0" w:color="CBD5E1"/>
@@ -5516,7 +5516,7 @@
     <w:sectPr>
       <w:headerReference w:type="default" r:id="rId9"/>
       <w:footerReference w:type="default" r:id="rId10"/>
-      <w:pgSz w:w="16834" w:h="11909" w:orient="landscape"/>
+      <w:pgSz w:w="11909" w:h="16834"/>
       <w:pgMar w:top="792" w:right="864" w:bottom="792" w:left="864" w:header="432" w:footer="432" w:gutter="0"/>
       <w:cols w:space="720"/>
       <w:docGrid w:linePitch="360"/>

</xml_diff>